<commit_message>
final(G3): make Build now answer normal text
</commit_message>
<xml_diff>
--- a/final-exam/final-exam-group-answer.docx
+++ b/final-exam/final-exam-group-answer.docx
@@ -12018,247 +12018,15 @@
       </w:pPr>
       <w:r>
         <w:rPr>
-          <w:i/>
+          <w:i w:val="0"/>
           <w:iCs/>
-          <w:color w:val="7F8C99"/>
           <w:sz w:val="28"/>
           <w:szCs w:val="28"/>
         </w:rPr>
-        <w:t>(</w:t>
+        <w:t>ทำไมไม่ใช่ทุกข้อเป็น Build now: "ทุกอย่างต้องเป็น Build now" เป็นความเห็นของผู้เสนอ — ช่องทางภายนอกยังไม่รู้ว่าคืออะไร (OQ-10) ขัดกับ Out of Scope §1.3 และถ้าสร้างตอนนี้ต้องเดาผู้ให้บริการ ซึ่งขัด CON-04 · ส่วนที่ทำได้ทันทีโดยไม่ต้องเดา (แจ้งในระบบ · เตือนงานค้าง · ข้อความไม่เกินจำเป็น) จึงจัดเป็น Build now</w:t>
       </w:r>
       <w:proofErr w:type="spellStart"/>
-      <w:r>
-        <w:rPr>
-          <w:i/>
-          <w:iCs/>
-          <w:color w:val="7F8C99"/>
-          <w:sz w:val="28"/>
-          <w:szCs w:val="28"/>
-        </w:rPr>
-        <w:t>คำแนะนำ</w:t>
-      </w:r>
       <w:proofErr w:type="spellEnd"/>
-      <w:r>
-        <w:rPr>
-          <w:i/>
-          <w:iCs/>
-          <w:color w:val="7F8C99"/>
-          <w:sz w:val="28"/>
-          <w:szCs w:val="28"/>
-        </w:rPr>
-        <w:t>:</w:t>
-      </w:r>
-      <w:r>
-        <w:rPr>
-          <w:rFonts w:hint="cs"/>
-          <w:i/>
-          <w:iCs/>
-          <w:color w:val="7F8C99"/>
-          <w:sz w:val="28"/>
-          <w:szCs w:val="28"/>
-          <w:cs/>
-        </w:rPr>
-        <w:t xml:space="preserve"> </w:t>
-      </w:r>
-      <w:r>
-        <w:rPr>
-          <w:i/>
-          <w:iCs/>
-          <w:color w:val="7F8C99"/>
-          <w:sz w:val="28"/>
-          <w:szCs w:val="28"/>
-          <w:cs/>
-        </w:rPr>
-        <w:t xml:space="preserve">ทำไมไม่ใช่ทุกข้อเป็น </w:t>
-      </w:r>
-      <w:r>
-        <w:rPr>
-          <w:i/>
-          <w:iCs/>
-          <w:color w:val="7F8C99"/>
-          <w:sz w:val="28"/>
-          <w:szCs w:val="28"/>
-        </w:rPr>
-        <w:t>Build now: "</w:t>
-      </w:r>
-      <w:r>
-        <w:rPr>
-          <w:i/>
-          <w:iCs/>
-          <w:color w:val="7F8C99"/>
-          <w:sz w:val="28"/>
-          <w:szCs w:val="28"/>
-          <w:cs/>
-        </w:rPr>
-        <w:t xml:space="preserve">ทุกอย่างต้องเป็น </w:t>
-      </w:r>
-      <w:r>
-        <w:rPr>
-          <w:i/>
-          <w:iCs/>
-          <w:color w:val="7F8C99"/>
-          <w:sz w:val="28"/>
-          <w:szCs w:val="28"/>
-        </w:rPr>
-        <w:t xml:space="preserve">Build now" </w:t>
-      </w:r>
-      <w:r>
-        <w:rPr>
-          <w:i/>
-          <w:iCs/>
-          <w:color w:val="7F8C99"/>
-          <w:sz w:val="28"/>
-          <w:szCs w:val="28"/>
-          <w:cs/>
-        </w:rPr>
-        <w:t>เป็นความเห็นของผู้เสนอ — ช่องทางภายนอกยังไม่รู้ว่าคืออะไร (</w:t>
-      </w:r>
-      <w:r>
-        <w:rPr>
-          <w:i/>
-          <w:iCs/>
-          <w:color w:val="7F8C99"/>
-          <w:sz w:val="28"/>
-          <w:szCs w:val="28"/>
-        </w:rPr>
-        <w:t>OQ-</w:t>
-      </w:r>
-      <w:r>
-        <w:rPr>
-          <w:i/>
-          <w:iCs/>
-          <w:color w:val="7F8C99"/>
-          <w:sz w:val="28"/>
-          <w:szCs w:val="28"/>
-          <w:cs/>
-        </w:rPr>
-        <w:t xml:space="preserve">10) ขัดกับ </w:t>
-      </w:r>
-      <w:r>
-        <w:rPr>
-          <w:i/>
-          <w:iCs/>
-          <w:color w:val="7F8C99"/>
-          <w:sz w:val="28"/>
-          <w:szCs w:val="28"/>
-        </w:rPr>
-        <w:t>Out of Scope §</w:t>
-      </w:r>
-      <w:r>
-        <w:rPr>
-          <w:i/>
-          <w:iCs/>
-          <w:color w:val="7F8C99"/>
-          <w:sz w:val="28"/>
-          <w:szCs w:val="28"/>
-          <w:cs/>
-        </w:rPr>
-        <w:t xml:space="preserve">1.3 และถ้าสร้างตอนนี้ต้องเดาผู้ให้บริการ ซึ่งขัด </w:t>
-      </w:r>
-      <w:r>
-        <w:rPr>
-          <w:i/>
-          <w:iCs/>
-          <w:color w:val="7F8C99"/>
-          <w:sz w:val="28"/>
-          <w:szCs w:val="28"/>
-        </w:rPr>
-        <w:t>CON-</w:t>
-      </w:r>
-      <w:r>
-        <w:rPr>
-          <w:i/>
-          <w:iCs/>
-          <w:color w:val="7F8C99"/>
-          <w:sz w:val="28"/>
-          <w:szCs w:val="28"/>
-          <w:cs/>
-        </w:rPr>
-        <w:t xml:space="preserve">04 </w:t>
-      </w:r>
-      <w:r>
-        <w:rPr>
-          <w:i/>
-          <w:iCs/>
-          <w:color w:val="7F8C99"/>
-          <w:sz w:val="28"/>
-          <w:szCs w:val="28"/>
-        </w:rPr>
-        <w:t xml:space="preserve">· </w:t>
-      </w:r>
-      <w:r>
-        <w:rPr>
-          <w:i/>
-          <w:iCs/>
-          <w:color w:val="7F8C99"/>
-          <w:sz w:val="28"/>
-          <w:szCs w:val="28"/>
-          <w:cs/>
-        </w:rPr>
-        <w:t xml:space="preserve">ส่วนที่ทำได้ทันทีโดยไม่ต้องเดา (แจ้งในระบบ </w:t>
-      </w:r>
-      <w:r>
-        <w:rPr>
-          <w:i/>
-          <w:iCs/>
-          <w:color w:val="7F8C99"/>
-          <w:sz w:val="28"/>
-          <w:szCs w:val="28"/>
-        </w:rPr>
-        <w:t xml:space="preserve">· </w:t>
-      </w:r>
-      <w:r>
-        <w:rPr>
-          <w:i/>
-          <w:iCs/>
-          <w:color w:val="7F8C99"/>
-          <w:sz w:val="28"/>
-          <w:szCs w:val="28"/>
-          <w:cs/>
-        </w:rPr>
-        <w:t xml:space="preserve">เตือนงานค้าง </w:t>
-      </w:r>
-      <w:r>
-        <w:rPr>
-          <w:i/>
-          <w:iCs/>
-          <w:color w:val="7F8C99"/>
-          <w:sz w:val="28"/>
-          <w:szCs w:val="28"/>
-        </w:rPr>
-        <w:t xml:space="preserve">· </w:t>
-      </w:r>
-      <w:r>
-        <w:rPr>
-          <w:i/>
-          <w:iCs/>
-          <w:color w:val="7F8C99"/>
-          <w:sz w:val="28"/>
-          <w:szCs w:val="28"/>
-          <w:cs/>
-        </w:rPr>
-        <w:t xml:space="preserve">ข้อความไม่เกินจำเป็น) จึงจัดเป็น </w:t>
-      </w:r>
-      <w:r>
-        <w:rPr>
-          <w:i/>
-          <w:iCs/>
-          <w:color w:val="7F8C99"/>
-          <w:sz w:val="28"/>
-          <w:szCs w:val="28"/>
-        </w:rPr>
-        <w:t>Build now</w:t>
-      </w:r>
-      <w:r>
-        <w:rPr>
-          <w:i/>
-          <w:iCs/>
-          <w:color w:val="7F8C99"/>
-          <w:sz w:val="28"/>
-          <w:szCs w:val="28"/>
-        </w:rPr>
-        <w:t>)</w:t>
-      </w:r>
     </w:p>
     <w:tbl>
       <w:tblPr>

</xml_diff>

<commit_message>
final(G4): add context and container diagrams with architecture answers
</commit_message>
<xml_diff>
--- a/final-exam/final-exam-group-answer.docx
+++ b/final-exam/final-exam-group-answer.docx
@@ -179,7 +179,7 @@
           </w:p>
           <w:p>
             <w:pPr>
-              <w:pStyle w:val="ListParagraph"/>
+              <w:pStyle w:val="a4"/>
               <w:numPr>
                 <w:ilvl w:val="0"/>
                 <w:numId w:val="2"/>
@@ -221,7 +221,7 @@
           </w:p>
           <w:p>
             <w:pPr>
-              <w:pStyle w:val="ListParagraph"/>
+              <w:pStyle w:val="a4"/>
               <w:numPr>
                 <w:ilvl w:val="0"/>
                 <w:numId w:val="2"/>
@@ -272,7 +272,7 @@
           </w:p>
           <w:p>
             <w:pPr>
-              <w:pStyle w:val="ListParagraph"/>
+              <w:pStyle w:val="a4"/>
               <w:numPr>
                 <w:ilvl w:val="0"/>
                 <w:numId w:val="2"/>
@@ -1039,7 +1039,7 @@
     </w:tbl>
     <w:p>
       <w:pPr>
-        <w:pStyle w:val="Heading1"/>
+        <w:pStyle w:val="1"/>
         <w:keepNext/>
         <w:pBdr>
           <w:bottom w:val="single" w:sz="8" w:space="2" w:color="008699"/>
@@ -3218,7 +3218,6 @@
                 <w:sz w:val="28"/>
                 <w:szCs w:val="28"/>
               </w:rPr>
-              <w:lastRenderedPageBreak/>
               <w:t xml:space="preserve">Decision </w:t>
             </w:r>
             <w:proofErr w:type="spellStart"/>
@@ -3460,6 +3459,7 @@
                 <w:sz w:val="28"/>
                 <w:szCs w:val="28"/>
               </w:rPr>
+              <w:lastRenderedPageBreak/>
               <w:t>Next action</w:t>
             </w:r>
           </w:p>
@@ -3930,7 +3930,6 @@
                 <w:sz w:val="28"/>
                 <w:szCs w:val="28"/>
               </w:rPr>
-              <w:lastRenderedPageBreak/>
               <w:t>#</w:t>
             </w:r>
           </w:p>
@@ -6000,6 +5999,7 @@
                 <w:szCs w:val="28"/>
                 <w:cs/>
               </w:rPr>
+              <w:lastRenderedPageBreak/>
               <w:t>7</w:t>
             </w:r>
           </w:p>
@@ -6594,7 +6594,7 @@
     </w:p>
     <w:p>
       <w:pPr>
-        <w:pStyle w:val="Heading1"/>
+        <w:pStyle w:val="1"/>
         <w:keepNext/>
         <w:pageBreakBefore/>
         <w:pBdr>
@@ -8178,6 +8178,7 @@
           <w:sz w:val="30"/>
           <w:szCs w:val="30"/>
         </w:rPr>
+        <w:lastRenderedPageBreak/>
         <w:t>2.3 Acceptance Criteria (≥ 3)</w:t>
       </w:r>
     </w:p>
@@ -9345,54 +9346,34 @@
             </w:tcMar>
           </w:tcPr>
           <w:p>
-            <w:pPr>
-              <w:rPr>
-                <w:lang/>
-              </w:rPr>
-            </w:pPr>
-            <w:r>
-              <w:rPr>
-                <w:lang/>
-              </w:rPr>
+            <w:r>
               <w:t>BR-</w:t>
             </w:r>
             <w:r>
               <w:rPr>
                 <w:cs/>
-                <w:lang/>
               </w:rPr>
               <w:t xml:space="preserve">10 </w:t>
             </w:r>
             <w:r>
-              <w:rPr>
-                <w:lang/>
-              </w:rPr>
               <w:t>· NFR-CLMRS-</w:t>
             </w:r>
             <w:r>
               <w:rPr>
                 <w:cs/>
-                <w:lang/>
               </w:rPr>
               <w:t xml:space="preserve">05 </w:t>
             </w:r>
             <w:r>
-              <w:rPr>
-                <w:lang/>
-              </w:rPr>
               <w:t>· DR-</w:t>
             </w:r>
             <w:r>
               <w:rPr>
                 <w:cs/>
-                <w:lang/>
               </w:rPr>
               <w:t xml:space="preserve">01 — </w:t>
             </w:r>
             <w:r>
-              <w:rPr>
-                <w:lang/>
-              </w:rPr>
               <w:t>Inspection</w:t>
             </w:r>
           </w:p>
@@ -11955,7 +11936,7 @@
     </w:p>
     <w:p>
       <w:pPr>
-        <w:pStyle w:val="Heading1"/>
+        <w:pStyle w:val="1"/>
         <w:keepNext/>
         <w:pageBreakBefore/>
         <w:pBdr>
@@ -12018,15 +11999,30 @@
       </w:pPr>
       <w:r>
         <w:rPr>
-          <w:i w:val="0"/>
           <w:iCs/>
           <w:sz w:val="28"/>
           <w:szCs w:val="28"/>
         </w:rPr>
-        <w:t>ทำไมไม่ใช่ทุกข้อเป็น Build now: "ทุกอย่างต้องเป็น Build now" เป็นความเห็นของผู้เสนอ — ช่องทางภายนอกยังไม่รู้ว่าคืออะไร (OQ-10) ขัดกับ Out of Scope §1.3 และถ้าสร้างตอนนี้ต้องเดาผู้ให้บริการ ซึ่งขัด CON-04 · ส่วนที่ทำได้ทันทีโดยไม่ต้องเดา (แจ้งในระบบ · เตือนงานค้าง · ข้อความไม่เกินจำเป็น) จึงจัดเป็น Build now</w:t>
+        <w:t xml:space="preserve">ทำไมไม่ใช่ทุกข้อเป็น Build now: "ทุกอย่างต้องเป็น Build now" เป็นความเห็นของผู้เสนอ — ช่องทางภายนอกยังไม่รู้ว่าคืออะไร (OQ-10) ขัดกับ Out of Scope §1.3 และถ้าสร้างตอนนี้ต้องเดาผู้ให้บริการ ซึ่งขัด CON-04 · ส่วนที่ทำได้ทันทีโดยไม่ต้องเดา (แจ้งในระบบ · เตือนงานค้าง · ข้อความไม่เกินจำเป็น) </w:t>
       </w:r>
       <w:proofErr w:type="spellStart"/>
+      <w:r>
+        <w:rPr>
+          <w:iCs/>
+          <w:sz w:val="28"/>
+          <w:szCs w:val="28"/>
+        </w:rPr>
+        <w:t>จึงจัดเป็น</w:t>
+      </w:r>
       <w:proofErr w:type="spellEnd"/>
+      <w:r>
+        <w:rPr>
+          <w:iCs/>
+          <w:sz w:val="28"/>
+          <w:szCs w:val="28"/>
+        </w:rPr>
+        <w:t xml:space="preserve"> Build now</w:t>
+      </w:r>
     </w:p>
     <w:tbl>
       <w:tblPr>
@@ -12764,7 +12760,6 @@
           <w:sz w:val="30"/>
           <w:szCs w:val="30"/>
         </w:rPr>
-        <w:lastRenderedPageBreak/>
         <w:t>3.2 Driver check</w:t>
       </w:r>
     </w:p>
@@ -14574,6 +14569,7 @@
           <w:sz w:val="30"/>
           <w:szCs w:val="30"/>
         </w:rPr>
+        <w:lastRenderedPageBreak/>
         <w:t>3.4 Open decisions</w:t>
       </w:r>
     </w:p>
@@ -15478,7 +15474,7 @@
     </w:p>
     <w:p>
       <w:pPr>
-        <w:pStyle w:val="Heading1"/>
+        <w:pStyle w:val="1"/>
         <w:keepNext/>
         <w:pBdr>
           <w:bottom w:val="single" w:sz="8" w:space="2" w:color="008699"/>
@@ -15633,6 +15629,9 @@
     <w:p>
       <w:pPr>
         <w:spacing w:after="100"/>
+        <w:rPr>
+          <w:rFonts w:hint="cs"/>
+        </w:rPr>
       </w:pPr>
       <w:r>
         <w:rPr>
@@ -15661,7 +15660,88 @@
         <w:t>:</w:t>
       </w:r>
       <w:r>
-        <w:t xml:space="preserve"> ........................................................................</w:t>
+        <w:t xml:space="preserve"> </w:t>
+      </w:r>
+      <w:r>
+        <w:rPr>
+          <w:cs/>
+        </w:rPr>
+        <w:t xml:space="preserve">วาดภาพใหม่โดยอ้างอิง </w:t>
+      </w:r>
+      <w:r>
+        <w:t xml:space="preserve">SRS v2.1 </w:t>
+      </w:r>
+      <w:r>
+        <w:rPr>
+          <w:cs/>
+        </w:rPr>
+        <w:t xml:space="preserve">เนื่องจากยังไม่มี </w:t>
+      </w:r>
+      <w:r>
+        <w:t xml:space="preserve">Context diagram </w:t>
+      </w:r>
+      <w:r>
+        <w:rPr>
+          <w:cs/>
+        </w:rPr>
+        <w:t xml:space="preserve">เดิมที่สมบูรณ์ แสดงระบบ </w:t>
+      </w:r>
+      <w:r>
+        <w:t xml:space="preserve">CLMRS </w:t>
+      </w:r>
+      <w:r>
+        <w:rPr>
+          <w:cs/>
+        </w:rPr>
+        <w:t xml:space="preserve">ผู้ใช้งาน </w:t>
+      </w:r>
+      <w:r>
+        <w:t xml:space="preserve">4 </w:t>
+      </w:r>
+      <w:r>
+        <w:rPr>
+          <w:cs/>
+        </w:rPr>
+        <w:t xml:space="preserve">บทบาท และระบบภายนอก </w:t>
+      </w:r>
+      <w:r>
+        <w:t xml:space="preserve">Authentication Service </w:t>
+      </w:r>
+      <w:r>
+        <w:rPr>
+          <w:cs/>
+        </w:rPr>
+        <w:t xml:space="preserve">กับ </w:t>
+      </w:r>
+      <w:r>
+        <w:t xml:space="preserve">Notification Gateway </w:t>
+      </w:r>
+      <w:r>
+        <w:rPr>
+          <w:cs/>
+        </w:rPr>
+        <w:t xml:space="preserve">โดยเพิ่มความสัมพันธ์ด้านการแจ้งเตือนเมื่อสถานะเปลี่ยน การเตือนงานค้างตามเวลา และการตั้งค่าความยินยอมรับแจ้งเตือนภายนอก ทั้งนี้ </w:t>
+      </w:r>
+      <w:r>
+        <w:t xml:space="preserve">Notification Gateway </w:t>
+      </w:r>
+      <w:r>
+        <w:rPr>
+          <w:cs/>
+        </w:rPr>
+        <w:t xml:space="preserve">เป็น </w:t>
+      </w:r>
+      <w:r>
+        <w:t xml:space="preserve">Extension </w:t>
+      </w:r>
+      <w:r>
+        <w:rPr>
+          <w:cs/>
+        </w:rPr>
+        <w:t>ที่ยังรอคำตอบเรื่องช่องทางและวิธีเชื่อมต่อ (</w:t>
+      </w:r>
+      <w:r>
+        <w:t>OQ-10)</w:t>
       </w:r>
     </w:p>
     <w:p>
@@ -15695,8 +15775,153 @@
         <w:t>:</w:t>
       </w:r>
       <w:r>
-        <w:t xml:space="preserve"> ........................................................................</w:t>
-      </w:r>
+        <w:t xml:space="preserve"> </w:t>
+      </w:r>
+      <w:r>
+        <w:rPr>
+          <w:cs/>
+        </w:rPr>
+        <w:t xml:space="preserve">วาดภาพใหม่ตาม </w:t>
+      </w:r>
+      <w:r>
+        <w:t xml:space="preserve">stack </w:t>
+      </w:r>
+      <w:r>
+        <w:rPr>
+          <w:cs/>
+        </w:rPr>
+        <w:t xml:space="preserve">อ้างอิง แบ่งเป็น </w:t>
+      </w:r>
+      <w:r>
+        <w:t xml:space="preserve">CLMRS Web App, CLMRS API </w:t>
+      </w:r>
+      <w:r>
+        <w:rPr>
+          <w:cs/>
+        </w:rPr>
+        <w:t xml:space="preserve">และ </w:t>
+      </w:r>
+      <w:r>
+        <w:t xml:space="preserve">CLMRS Database </w:t>
+      </w:r>
+      <w:r>
+        <w:rPr>
+          <w:cs/>
+        </w:rPr>
+        <w:t xml:space="preserve">พร้อมเสนอเพิ่ม </w:t>
+      </w:r>
+      <w:r>
+        <w:t xml:space="preserve">Reminder Job </w:t>
+      </w:r>
+      <w:r>
+        <w:rPr>
+          <w:cs/>
+        </w:rPr>
+        <w:t xml:space="preserve">เพื่อเริ่มตรวจงานค้างตามเวลาโดยไม่มีผู้ใช้กด ตาม </w:t>
+      </w:r>
+      <w:r>
+        <w:t xml:space="preserve">FR-CLMRS-10 </w:t>
+      </w:r>
+      <w:r>
+        <w:rPr>
+          <w:cs/>
+        </w:rPr>
+        <w:t xml:space="preserve">โดยให้ </w:t>
+      </w:r>
+      <w:r>
+        <w:t xml:space="preserve">API </w:t>
+      </w:r>
+      <w:r>
+        <w:rPr>
+          <w:cs/>
+        </w:rPr>
+        <w:t xml:space="preserve">ตรวจสิทธิ์ กติกา ความยินยอม และข้อมูลส่วนบุคคลก่อนสร้างการแจ้งเตือน เพิ่มการเก็บ </w:t>
+      </w:r>
+      <w:proofErr w:type="spellStart"/>
+      <w:r>
+        <w:t>NotificationPreference</w:t>
+      </w:r>
+      <w:proofErr w:type="spellEnd"/>
+      <w:r>
+        <w:t xml:space="preserve"> (DR-09) </w:t>
+      </w:r>
+      <w:r>
+        <w:rPr>
+          <w:cs/>
+        </w:rPr>
+        <w:t xml:space="preserve">และ </w:t>
+      </w:r>
+      <w:proofErr w:type="spellStart"/>
+      <w:r>
+        <w:t>NotificationLog</w:t>
+      </w:r>
+      <w:proofErr w:type="spellEnd"/>
+      <w:r>
+        <w:t xml:space="preserve"> (DR-10) </w:t>
+      </w:r>
+      <w:r>
+        <w:rPr>
+          <w:cs/>
+        </w:rPr>
+        <w:t xml:space="preserve">ส่วนการเชื่อมต่อ </w:t>
+      </w:r>
+      <w:r>
+        <w:t xml:space="preserve">Notification Gateway </w:t>
+      </w:r>
+      <w:r>
+        <w:rPr>
+          <w:cs/>
+        </w:rPr>
+        <w:t>แสดงเป็นส่วนขยายที่ยังไม่ทำในวิชานี้และรอคำตอบ</w:t>
+      </w:r>
+      <w:r>
+        <w:rPr>
+          <w:cs/>
+        </w:rPr>
+        <w:t xml:space="preserve"> </w:t>
+      </w:r>
+      <w:r>
+        <w:rPr>
+          <w:cs/>
+        </w:rPr>
+        <w:t xml:space="preserve">ส่วนการตั้งค่า </w:t>
+      </w:r>
+      <w:r>
+        <w:t xml:space="preserve">opt-in </w:t>
+      </w:r>
+      <w:r>
+        <w:rPr>
+          <w:cs/>
+        </w:rPr>
+        <w:t xml:space="preserve">และข้อมูล </w:t>
+      </w:r>
+      <w:r>
+        <w:t xml:space="preserve">DR-09 </w:t>
+      </w:r>
+      <w:r>
+        <w:rPr>
+          <w:cs/>
+        </w:rPr>
+        <w:t xml:space="preserve">ที่แสดงในภาพเป็นแนวทางระดับ </w:t>
+      </w:r>
+      <w:r>
+        <w:t xml:space="preserve">Overview </w:t>
+      </w:r>
+      <w:r>
+        <w:rPr>
+          <w:cs/>
+        </w:rPr>
+        <w:t>ยังไม่รวมการทำในรุ่นแรก</w:t>
+      </w:r>
+    </w:p>
+    <w:p>
+      <w:pPr>
+        <w:spacing w:after="100"/>
+        <w:jc w:val="center"/>
+        <w:rPr>
+          <w:rFonts w:hint="cs"/>
+        </w:rPr>
+      </w:pPr>
     </w:p>
     <w:p>
       <w:pPr>
@@ -15757,6 +15982,1237 @@
           <w:szCs w:val="30"/>
         </w:rPr>
         <w:t>)</w:t>
+      </w:r>
+    </w:p>
+    <w:tbl>
+      <w:tblPr>
+        <w:tblW w:w="9638" w:type="dxa"/>
+        <w:tblBorders>
+          <w:top w:val="single" w:sz="4" w:space="0" w:color="auto"/>
+          <w:left w:val="single" w:sz="4" w:space="0" w:color="auto"/>
+          <w:bottom w:val="single" w:sz="4" w:space="0" w:color="auto"/>
+          <w:right w:val="single" w:sz="4" w:space="0" w:color="auto"/>
+          <w:insideH w:val="single" w:sz="4" w:space="0" w:color="auto"/>
+          <w:insideV w:val="single" w:sz="4" w:space="0" w:color="auto"/>
+        </w:tblBorders>
+        <w:tblLayout w:type="fixed"/>
+        <w:tblCellMar>
+          <w:left w:w="10" w:type="dxa"/>
+          <w:right w:w="10" w:type="dxa"/>
+        </w:tblCellMar>
+        <w:tblLook w:val="0000" w:firstRow="0" w:lastRow="0" w:firstColumn="0" w:lastColumn="0" w:noHBand="0" w:noVBand="0"/>
+      </w:tblPr>
+      <w:tblGrid>
+        <w:gridCol w:w="1235"/>
+        <w:gridCol w:w="1736"/>
+        <w:gridCol w:w="1361"/>
+        <w:gridCol w:w="1480"/>
+        <w:gridCol w:w="1833"/>
+        <w:gridCol w:w="1993"/>
+      </w:tblGrid>
+      <w:tr>
+        <w:trPr>
+          <w:cantSplit/>
+          <w:tblHeader/>
+        </w:trPr>
+        <w:tc>
+          <w:tcPr>
+            <w:tcW w:w="1235" w:type="dxa"/>
+            <w:tcBorders>
+              <w:top w:val="single" w:sz="4" w:space="0" w:color="173B65"/>
+              <w:left w:val="single" w:sz="4" w:space="0" w:color="173B65"/>
+              <w:bottom w:val="single" w:sz="4" w:space="0" w:color="173B65"/>
+              <w:right w:val="single" w:sz="4" w:space="0" w:color="173B65"/>
+            </w:tcBorders>
+            <w:shd w:val="clear" w:color="auto" w:fill="173B65"/>
+            <w:tcMar>
+              <w:top w:w="50" w:type="dxa"/>
+              <w:left w:w="90" w:type="dxa"/>
+              <w:bottom w:w="50" w:type="dxa"/>
+              <w:right w:w="90" w:type="dxa"/>
+            </w:tcMar>
+            <w:vAlign w:val="center"/>
+          </w:tcPr>
+          <w:p>
+            <w:pPr>
+              <w:keepNext/>
+            </w:pPr>
+            <w:r>
+              <w:rPr>
+                <w:b/>
+                <w:bCs/>
+                <w:color w:val="FFFFFF"/>
+                <w:sz w:val="28"/>
+                <w:szCs w:val="28"/>
+              </w:rPr>
+              <w:t>Container</w:t>
+            </w:r>
+          </w:p>
+        </w:tc>
+        <w:tc>
+          <w:tcPr>
+            <w:tcW w:w="1736" w:type="dxa"/>
+            <w:tcBorders>
+              <w:top w:val="single" w:sz="4" w:space="0" w:color="173B65"/>
+              <w:left w:val="single" w:sz="4" w:space="0" w:color="173B65"/>
+              <w:bottom w:val="single" w:sz="4" w:space="0" w:color="173B65"/>
+              <w:right w:val="single" w:sz="4" w:space="0" w:color="173B65"/>
+            </w:tcBorders>
+            <w:shd w:val="clear" w:color="auto" w:fill="173B65"/>
+            <w:tcMar>
+              <w:top w:w="50" w:type="dxa"/>
+              <w:left w:w="90" w:type="dxa"/>
+              <w:bottom w:w="50" w:type="dxa"/>
+              <w:right w:w="90" w:type="dxa"/>
+            </w:tcMar>
+            <w:vAlign w:val="center"/>
+          </w:tcPr>
+          <w:p>
+            <w:pPr>
+              <w:keepNext/>
+            </w:pPr>
+            <w:proofErr w:type="spellStart"/>
+            <w:r>
+              <w:rPr>
+                <w:b/>
+                <w:bCs/>
+                <w:color w:val="FFFFFF"/>
+                <w:sz w:val="28"/>
+                <w:szCs w:val="28"/>
+              </w:rPr>
+              <w:t>หน้าที่</w:t>
+            </w:r>
+            <w:proofErr w:type="spellEnd"/>
+          </w:p>
+        </w:tc>
+        <w:tc>
+          <w:tcPr>
+            <w:tcW w:w="1361" w:type="dxa"/>
+            <w:tcBorders>
+              <w:top w:val="single" w:sz="4" w:space="0" w:color="173B65"/>
+              <w:left w:val="single" w:sz="4" w:space="0" w:color="173B65"/>
+              <w:bottom w:val="single" w:sz="4" w:space="0" w:color="173B65"/>
+              <w:right w:val="single" w:sz="4" w:space="0" w:color="173B65"/>
+            </w:tcBorders>
+            <w:shd w:val="clear" w:color="auto" w:fill="173B65"/>
+            <w:tcMar>
+              <w:top w:w="50" w:type="dxa"/>
+              <w:left w:w="90" w:type="dxa"/>
+              <w:bottom w:w="50" w:type="dxa"/>
+              <w:right w:w="90" w:type="dxa"/>
+            </w:tcMar>
+            <w:vAlign w:val="center"/>
+          </w:tcPr>
+          <w:p>
+            <w:pPr>
+              <w:keepNext/>
+            </w:pPr>
+            <w:proofErr w:type="spellStart"/>
+            <w:r>
+              <w:rPr>
+                <w:b/>
+                <w:bCs/>
+                <w:color w:val="FFFFFF"/>
+                <w:sz w:val="28"/>
+                <w:szCs w:val="28"/>
+              </w:rPr>
+              <w:t>ชนิด</w:t>
+            </w:r>
+            <w:proofErr w:type="spellEnd"/>
+            <w:r>
+              <w:rPr>
+                <w:b/>
+                <w:bCs/>
+                <w:color w:val="FFFFFF"/>
+                <w:sz w:val="28"/>
+                <w:szCs w:val="28"/>
+              </w:rPr>
+              <w:t xml:space="preserve"> · stack</w:t>
+            </w:r>
+          </w:p>
+        </w:tc>
+        <w:tc>
+          <w:tcPr>
+            <w:tcW w:w="1480" w:type="dxa"/>
+            <w:tcBorders>
+              <w:top w:val="single" w:sz="4" w:space="0" w:color="173B65"/>
+              <w:left w:val="single" w:sz="4" w:space="0" w:color="173B65"/>
+              <w:bottom w:val="single" w:sz="4" w:space="0" w:color="173B65"/>
+              <w:right w:val="single" w:sz="4" w:space="0" w:color="173B65"/>
+            </w:tcBorders>
+            <w:shd w:val="clear" w:color="auto" w:fill="173B65"/>
+            <w:tcMar>
+              <w:top w:w="50" w:type="dxa"/>
+              <w:left w:w="90" w:type="dxa"/>
+              <w:bottom w:w="50" w:type="dxa"/>
+              <w:right w:w="90" w:type="dxa"/>
+            </w:tcMar>
+            <w:vAlign w:val="center"/>
+          </w:tcPr>
+          <w:p>
+            <w:pPr>
+              <w:keepNext/>
+            </w:pPr>
+            <w:proofErr w:type="spellStart"/>
+            <w:r>
+              <w:rPr>
+                <w:b/>
+                <w:bCs/>
+                <w:color w:val="FFFFFF"/>
+                <w:sz w:val="28"/>
+                <w:szCs w:val="28"/>
+              </w:rPr>
+              <w:t>รันที่ไหน</w:t>
+            </w:r>
+            <w:proofErr w:type="spellEnd"/>
+            <w:r>
+              <w:rPr>
+                <w:b/>
+                <w:bCs/>
+                <w:color w:val="FFFFFF"/>
+                <w:sz w:val="28"/>
+                <w:szCs w:val="28"/>
+              </w:rPr>
+              <w:t xml:space="preserve"> · </w:t>
+            </w:r>
+            <w:proofErr w:type="spellStart"/>
+            <w:r>
+              <w:rPr>
+                <w:b/>
+                <w:bCs/>
+                <w:color w:val="FFFFFF"/>
+                <w:sz w:val="28"/>
+                <w:szCs w:val="28"/>
+              </w:rPr>
+              <w:t>ใครควบคุม</w:t>
+            </w:r>
+            <w:proofErr w:type="spellEnd"/>
+          </w:p>
+        </w:tc>
+        <w:tc>
+          <w:tcPr>
+            <w:tcW w:w="1833" w:type="dxa"/>
+            <w:tcBorders>
+              <w:top w:val="single" w:sz="4" w:space="0" w:color="173B65"/>
+              <w:left w:val="single" w:sz="4" w:space="0" w:color="173B65"/>
+              <w:bottom w:val="single" w:sz="4" w:space="0" w:color="173B65"/>
+              <w:right w:val="single" w:sz="4" w:space="0" w:color="173B65"/>
+            </w:tcBorders>
+            <w:shd w:val="clear" w:color="auto" w:fill="173B65"/>
+            <w:tcMar>
+              <w:top w:w="50" w:type="dxa"/>
+              <w:left w:w="90" w:type="dxa"/>
+              <w:bottom w:w="50" w:type="dxa"/>
+              <w:right w:w="90" w:type="dxa"/>
+            </w:tcMar>
+            <w:vAlign w:val="center"/>
+          </w:tcPr>
+          <w:p>
+            <w:pPr>
+              <w:keepNext/>
+            </w:pPr>
+            <w:proofErr w:type="spellStart"/>
+            <w:r>
+              <w:rPr>
+                <w:b/>
+                <w:bCs/>
+                <w:color w:val="FFFFFF"/>
+                <w:sz w:val="28"/>
+                <w:szCs w:val="28"/>
+              </w:rPr>
+              <w:t>ข้อมูลที่เก็บ</w:t>
+            </w:r>
+            <w:proofErr w:type="spellEnd"/>
+          </w:p>
+        </w:tc>
+        <w:tc>
+          <w:tcPr>
+            <w:tcW w:w="1993" w:type="dxa"/>
+            <w:tcBorders>
+              <w:top w:val="single" w:sz="4" w:space="0" w:color="173B65"/>
+              <w:left w:val="single" w:sz="4" w:space="0" w:color="173B65"/>
+              <w:bottom w:val="single" w:sz="4" w:space="0" w:color="173B65"/>
+              <w:right w:val="single" w:sz="4" w:space="0" w:color="173B65"/>
+            </w:tcBorders>
+            <w:shd w:val="clear" w:color="auto" w:fill="173B65"/>
+            <w:tcMar>
+              <w:top w:w="50" w:type="dxa"/>
+              <w:left w:w="90" w:type="dxa"/>
+              <w:bottom w:w="50" w:type="dxa"/>
+              <w:right w:w="90" w:type="dxa"/>
+            </w:tcMar>
+            <w:vAlign w:val="center"/>
+          </w:tcPr>
+          <w:p>
+            <w:pPr>
+              <w:keepNext/>
+            </w:pPr>
+            <w:proofErr w:type="spellStart"/>
+            <w:r>
+              <w:rPr>
+                <w:b/>
+                <w:bCs/>
+                <w:color w:val="FFFFFF"/>
+                <w:sz w:val="28"/>
+                <w:szCs w:val="28"/>
+              </w:rPr>
+              <w:t>คุยกับ</w:t>
+            </w:r>
+            <w:proofErr w:type="spellEnd"/>
+            <w:r>
+              <w:rPr>
+                <w:b/>
+                <w:bCs/>
+                <w:color w:val="FFFFFF"/>
+                <w:sz w:val="28"/>
+                <w:szCs w:val="28"/>
+              </w:rPr>
+              <w:t xml:space="preserve"> (</w:t>
+            </w:r>
+            <w:proofErr w:type="spellStart"/>
+            <w:r>
+              <w:rPr>
+                <w:b/>
+                <w:bCs/>
+                <w:color w:val="FFFFFF"/>
+                <w:sz w:val="28"/>
+                <w:szCs w:val="28"/>
+              </w:rPr>
+              <w:t>ส่งอะไร</w:t>
+            </w:r>
+            <w:proofErr w:type="spellEnd"/>
+            <w:r>
+              <w:rPr>
+                <w:b/>
+                <w:bCs/>
+                <w:color w:val="FFFFFF"/>
+                <w:sz w:val="28"/>
+                <w:szCs w:val="28"/>
+              </w:rPr>
+              <w:t>)</w:t>
+            </w:r>
+          </w:p>
+        </w:tc>
+      </w:tr>
+      <w:tr>
+        <w:trPr>
+          <w:cantSplit/>
+          <w:trHeight w:val="737"/>
+        </w:trPr>
+        <w:tc>
+          <w:tcPr>
+            <w:tcW w:w="1235" w:type="dxa"/>
+            <w:tcBorders>
+              <w:top w:val="single" w:sz="4" w:space="0" w:color="C9D3DC"/>
+              <w:left w:val="single" w:sz="4" w:space="0" w:color="C9D3DC"/>
+              <w:bottom w:val="single" w:sz="4" w:space="0" w:color="C9D3DC"/>
+              <w:right w:val="single" w:sz="4" w:space="0" w:color="C9D3DC"/>
+            </w:tcBorders>
+            <w:shd w:val="clear" w:color="auto" w:fill="FFFFFF"/>
+            <w:tcMar>
+              <w:top w:w="40" w:type="dxa"/>
+              <w:left w:w="90" w:type="dxa"/>
+              <w:bottom w:w="40" w:type="dxa"/>
+              <w:right w:w="90" w:type="dxa"/>
+            </w:tcMar>
+          </w:tcPr>
+          <w:p>
+            <w:pPr>
+              <w:keepNext/>
+            </w:pPr>
+            <w:r>
+              <w:t>CLMRS Web App</w:t>
+            </w:r>
+          </w:p>
+        </w:tc>
+        <w:tc>
+          <w:tcPr>
+            <w:tcW w:w="1736" w:type="dxa"/>
+            <w:tcBorders>
+              <w:top w:val="single" w:sz="4" w:space="0" w:color="C9D3DC"/>
+              <w:left w:val="single" w:sz="4" w:space="0" w:color="C9D3DC"/>
+              <w:bottom w:val="single" w:sz="4" w:space="0" w:color="C9D3DC"/>
+              <w:right w:val="single" w:sz="4" w:space="0" w:color="C9D3DC"/>
+            </w:tcBorders>
+            <w:shd w:val="clear" w:color="auto" w:fill="FFFFFF"/>
+            <w:tcMar>
+              <w:top w:w="40" w:type="dxa"/>
+              <w:left w:w="90" w:type="dxa"/>
+              <w:bottom w:w="40" w:type="dxa"/>
+              <w:right w:w="90" w:type="dxa"/>
+            </w:tcMar>
+          </w:tcPr>
+          <w:p>
+            <w:pPr>
+              <w:keepNext/>
+            </w:pPr>
+            <w:r>
+              <w:rPr>
+                <w:cs/>
+              </w:rPr>
+              <w:t xml:space="preserve">แสดงสถานะและแจ้งเตือนในระบบ ส่วนหน้าตั้งค่า </w:t>
+            </w:r>
+            <w:r>
+              <w:t xml:space="preserve">opt-in </w:t>
+            </w:r>
+            <w:r>
+              <w:rPr>
+                <w:cs/>
+              </w:rPr>
+              <w:t xml:space="preserve">อยู่ระดับ </w:t>
+            </w:r>
+            <w:r>
+              <w:t>Overview</w:t>
+            </w:r>
+          </w:p>
+        </w:tc>
+        <w:tc>
+          <w:tcPr>
+            <w:tcW w:w="1361" w:type="dxa"/>
+            <w:tcBorders>
+              <w:top w:val="single" w:sz="4" w:space="0" w:color="C9D3DC"/>
+              <w:left w:val="single" w:sz="4" w:space="0" w:color="C9D3DC"/>
+              <w:bottom w:val="single" w:sz="4" w:space="0" w:color="C9D3DC"/>
+              <w:right w:val="single" w:sz="4" w:space="0" w:color="C9D3DC"/>
+            </w:tcBorders>
+            <w:shd w:val="clear" w:color="auto" w:fill="FFFFFF"/>
+            <w:tcMar>
+              <w:top w:w="40" w:type="dxa"/>
+              <w:left w:w="90" w:type="dxa"/>
+              <w:bottom w:w="40" w:type="dxa"/>
+              <w:right w:w="90" w:type="dxa"/>
+            </w:tcMar>
+          </w:tcPr>
+          <w:p>
+            <w:pPr>
+              <w:keepNext/>
+            </w:pPr>
+            <w:r>
+              <w:t>Web Application · React</w:t>
+            </w:r>
+          </w:p>
+        </w:tc>
+        <w:tc>
+          <w:tcPr>
+            <w:tcW w:w="1480" w:type="dxa"/>
+            <w:tcBorders>
+              <w:top w:val="single" w:sz="4" w:space="0" w:color="C9D3DC"/>
+              <w:left w:val="single" w:sz="4" w:space="0" w:color="C9D3DC"/>
+              <w:bottom w:val="single" w:sz="4" w:space="0" w:color="C9D3DC"/>
+              <w:right w:val="single" w:sz="4" w:space="0" w:color="C9D3DC"/>
+            </w:tcBorders>
+            <w:shd w:val="clear" w:color="auto" w:fill="FFFFFF"/>
+            <w:tcMar>
+              <w:top w:w="40" w:type="dxa"/>
+              <w:left w:w="90" w:type="dxa"/>
+              <w:bottom w:w="40" w:type="dxa"/>
+              <w:right w:w="90" w:type="dxa"/>
+            </w:tcMar>
+          </w:tcPr>
+          <w:p>
+            <w:pPr>
+              <w:keepNext/>
+            </w:pPr>
+            <w:proofErr w:type="spellStart"/>
+            <w:r>
+              <w:rPr>
+                <w:cs/>
+              </w:rPr>
+              <w:t>เบ</w:t>
+            </w:r>
+            <w:proofErr w:type="spellEnd"/>
+            <w:r>
+              <w:rPr>
+                <w:cs/>
+              </w:rPr>
+              <w:t xml:space="preserve">ราว์เซอร์ผู้ใช้ </w:t>
+            </w:r>
+            <w:r>
+              <w:t xml:space="preserve">· </w:t>
+            </w:r>
+            <w:r>
+              <w:rPr>
+                <w:cs/>
+              </w:rPr>
+              <w:t>ทีมพัฒนาดูแลแอป</w:t>
+            </w:r>
+          </w:p>
+        </w:tc>
+        <w:tc>
+          <w:tcPr>
+            <w:tcW w:w="1833" w:type="dxa"/>
+            <w:tcBorders>
+              <w:top w:val="single" w:sz="4" w:space="0" w:color="C9D3DC"/>
+              <w:left w:val="single" w:sz="4" w:space="0" w:color="C9D3DC"/>
+              <w:bottom w:val="single" w:sz="4" w:space="0" w:color="C9D3DC"/>
+              <w:right w:val="single" w:sz="4" w:space="0" w:color="C9D3DC"/>
+            </w:tcBorders>
+            <w:shd w:val="clear" w:color="auto" w:fill="FFFFFF"/>
+            <w:tcMar>
+              <w:top w:w="40" w:type="dxa"/>
+              <w:left w:w="90" w:type="dxa"/>
+              <w:bottom w:w="40" w:type="dxa"/>
+              <w:right w:w="90" w:type="dxa"/>
+            </w:tcMar>
+          </w:tcPr>
+          <w:p>
+            <w:pPr>
+              <w:keepNext/>
+            </w:pPr>
+            <w:r>
+              <w:rPr>
+                <w:cs/>
+              </w:rPr>
+              <w:t>ไม่เก็บข้อมูลหลักถาวร</w:t>
+            </w:r>
+          </w:p>
+        </w:tc>
+        <w:tc>
+          <w:tcPr>
+            <w:tcW w:w="1993" w:type="dxa"/>
+            <w:tcBorders>
+              <w:top w:val="single" w:sz="4" w:space="0" w:color="C9D3DC"/>
+              <w:left w:val="single" w:sz="4" w:space="0" w:color="C9D3DC"/>
+              <w:bottom w:val="single" w:sz="4" w:space="0" w:color="C9D3DC"/>
+              <w:right w:val="single" w:sz="4" w:space="0" w:color="C9D3DC"/>
+            </w:tcBorders>
+            <w:shd w:val="clear" w:color="auto" w:fill="FFFFFF"/>
+            <w:tcMar>
+              <w:top w:w="40" w:type="dxa"/>
+              <w:left w:w="90" w:type="dxa"/>
+              <w:bottom w:w="40" w:type="dxa"/>
+              <w:right w:w="90" w:type="dxa"/>
+            </w:tcMar>
+          </w:tcPr>
+          <w:p>
+            <w:pPr>
+              <w:keepNext/>
+            </w:pPr>
+            <w:r>
+              <w:t xml:space="preserve">API: </w:t>
+            </w:r>
+            <w:r>
+              <w:rPr>
+                <w:cs/>
+              </w:rPr>
+              <w:t xml:space="preserve">ส่งคำขอและรับสถานะ/แจ้งเตือน วิธีเชื่อมต่อ </w:t>
+            </w:r>
+            <w:r>
+              <w:t>TBD</w:t>
+            </w:r>
+          </w:p>
+        </w:tc>
+      </w:tr>
+      <w:tr>
+        <w:trPr>
+          <w:cantSplit/>
+          <w:trHeight w:val="737"/>
+        </w:trPr>
+        <w:tc>
+          <w:tcPr>
+            <w:tcW w:w="1235" w:type="dxa"/>
+            <w:tcBorders>
+              <w:top w:val="single" w:sz="4" w:space="0" w:color="C9D3DC"/>
+              <w:left w:val="single" w:sz="4" w:space="0" w:color="C9D3DC"/>
+              <w:bottom w:val="single" w:sz="4" w:space="0" w:color="C9D3DC"/>
+              <w:right w:val="single" w:sz="4" w:space="0" w:color="C9D3DC"/>
+            </w:tcBorders>
+            <w:shd w:val="clear" w:color="auto" w:fill="F1F7FA"/>
+            <w:tcMar>
+              <w:top w:w="40" w:type="dxa"/>
+              <w:left w:w="90" w:type="dxa"/>
+              <w:bottom w:w="40" w:type="dxa"/>
+              <w:right w:w="90" w:type="dxa"/>
+            </w:tcMar>
+          </w:tcPr>
+          <w:p>
+            <w:pPr>
+              <w:keepNext/>
+            </w:pPr>
+            <w:r>
+              <w:t>CLMRS API</w:t>
+            </w:r>
+          </w:p>
+        </w:tc>
+        <w:tc>
+          <w:tcPr>
+            <w:tcW w:w="1736" w:type="dxa"/>
+            <w:tcBorders>
+              <w:top w:val="single" w:sz="4" w:space="0" w:color="C9D3DC"/>
+              <w:left w:val="single" w:sz="4" w:space="0" w:color="C9D3DC"/>
+              <w:bottom w:val="single" w:sz="4" w:space="0" w:color="C9D3DC"/>
+              <w:right w:val="single" w:sz="4" w:space="0" w:color="C9D3DC"/>
+            </w:tcBorders>
+            <w:shd w:val="clear" w:color="auto" w:fill="F1F7FA"/>
+            <w:tcMar>
+              <w:top w:w="40" w:type="dxa"/>
+              <w:left w:w="90" w:type="dxa"/>
+              <w:bottom w:w="40" w:type="dxa"/>
+              <w:right w:w="90" w:type="dxa"/>
+            </w:tcMar>
+          </w:tcPr>
+          <w:p>
+            <w:pPr>
+              <w:keepNext/>
+            </w:pPr>
+            <w:r>
+              <w:rPr>
+                <w:cs/>
+              </w:rPr>
+              <w:t>ตรวจสิทธิ์และกติกา บันทึกสถานะก่อนสร้างแจ้งเตือน ตรวจผู้รับและจำกัดข้อมูล</w:t>
+            </w:r>
+          </w:p>
+        </w:tc>
+        <w:tc>
+          <w:tcPr>
+            <w:tcW w:w="1361" w:type="dxa"/>
+            <w:tcBorders>
+              <w:top w:val="single" w:sz="4" w:space="0" w:color="C9D3DC"/>
+              <w:left w:val="single" w:sz="4" w:space="0" w:color="C9D3DC"/>
+              <w:bottom w:val="single" w:sz="4" w:space="0" w:color="C9D3DC"/>
+              <w:right w:val="single" w:sz="4" w:space="0" w:color="C9D3DC"/>
+            </w:tcBorders>
+            <w:shd w:val="clear" w:color="auto" w:fill="F1F7FA"/>
+            <w:tcMar>
+              <w:top w:w="40" w:type="dxa"/>
+              <w:left w:w="90" w:type="dxa"/>
+              <w:bottom w:w="40" w:type="dxa"/>
+              <w:right w:w="90" w:type="dxa"/>
+            </w:tcMar>
+          </w:tcPr>
+          <w:p>
+            <w:pPr>
+              <w:keepNext/>
+            </w:pPr>
+            <w:r>
+              <w:t>API Application · Node.js + Express</w:t>
+            </w:r>
+          </w:p>
+        </w:tc>
+        <w:tc>
+          <w:tcPr>
+            <w:tcW w:w="1480" w:type="dxa"/>
+            <w:tcBorders>
+              <w:top w:val="single" w:sz="4" w:space="0" w:color="C9D3DC"/>
+              <w:left w:val="single" w:sz="4" w:space="0" w:color="C9D3DC"/>
+              <w:bottom w:val="single" w:sz="4" w:space="0" w:color="C9D3DC"/>
+              <w:right w:val="single" w:sz="4" w:space="0" w:color="C9D3DC"/>
+            </w:tcBorders>
+            <w:shd w:val="clear" w:color="auto" w:fill="F1F7FA"/>
+            <w:tcMar>
+              <w:top w:w="40" w:type="dxa"/>
+              <w:left w:w="90" w:type="dxa"/>
+              <w:bottom w:w="40" w:type="dxa"/>
+              <w:right w:w="90" w:type="dxa"/>
+            </w:tcMar>
+          </w:tcPr>
+          <w:p>
+            <w:pPr>
+              <w:keepNext/>
+            </w:pPr>
+            <w:proofErr w:type="spellStart"/>
+            <w:r>
+              <w:rPr>
+                <w:cs/>
+              </w:rPr>
+              <w:t>เซิร์ฟเวอร์</w:t>
+            </w:r>
+            <w:proofErr w:type="spellEnd"/>
+            <w:r>
+              <w:rPr>
+                <w:cs/>
+              </w:rPr>
+              <w:t xml:space="preserve">ที่ทีมดูแล </w:t>
+            </w:r>
+            <w:r>
+              <w:t xml:space="preserve">· </w:t>
+            </w:r>
+            <w:r>
+              <w:rPr>
+                <w:cs/>
+              </w:rPr>
+              <w:t>รายละเอียด</w:t>
+            </w:r>
+            <w:proofErr w:type="spellStart"/>
+            <w:r>
+              <w:rPr>
+                <w:cs/>
+              </w:rPr>
+              <w:t>โฮส</w:t>
+            </w:r>
+            <w:proofErr w:type="spellEnd"/>
+            <w:r>
+              <w:rPr>
+                <w:cs/>
+              </w:rPr>
+              <w:t>ติ</w:t>
+            </w:r>
+            <w:proofErr w:type="spellStart"/>
+            <w:r>
+              <w:rPr>
+                <w:cs/>
+              </w:rPr>
+              <w:t>้ง</w:t>
+            </w:r>
+            <w:proofErr w:type="spellEnd"/>
+            <w:r>
+              <w:rPr>
+                <w:cs/>
+              </w:rPr>
+              <w:t xml:space="preserve"> </w:t>
+            </w:r>
+            <w:r>
+              <w:t>TBD</w:t>
+            </w:r>
+          </w:p>
+        </w:tc>
+        <w:tc>
+          <w:tcPr>
+            <w:tcW w:w="1833" w:type="dxa"/>
+            <w:tcBorders>
+              <w:top w:val="single" w:sz="4" w:space="0" w:color="C9D3DC"/>
+              <w:left w:val="single" w:sz="4" w:space="0" w:color="C9D3DC"/>
+              <w:bottom w:val="single" w:sz="4" w:space="0" w:color="C9D3DC"/>
+              <w:right w:val="single" w:sz="4" w:space="0" w:color="C9D3DC"/>
+            </w:tcBorders>
+            <w:shd w:val="clear" w:color="auto" w:fill="F1F7FA"/>
+            <w:tcMar>
+              <w:top w:w="40" w:type="dxa"/>
+              <w:left w:w="90" w:type="dxa"/>
+              <w:bottom w:w="40" w:type="dxa"/>
+              <w:right w:w="90" w:type="dxa"/>
+            </w:tcMar>
+          </w:tcPr>
+          <w:p>
+            <w:pPr>
+              <w:keepNext/>
+            </w:pPr>
+            <w:r>
+              <w:rPr>
+                <w:cs/>
+              </w:rPr>
+              <w:t>ไม่เป็นแหล่งเก็บข้อมูลหลักถาวร</w:t>
+            </w:r>
+          </w:p>
+        </w:tc>
+        <w:tc>
+          <w:tcPr>
+            <w:tcW w:w="1993" w:type="dxa"/>
+            <w:tcBorders>
+              <w:top w:val="single" w:sz="4" w:space="0" w:color="C9D3DC"/>
+              <w:left w:val="single" w:sz="4" w:space="0" w:color="C9D3DC"/>
+              <w:bottom w:val="single" w:sz="4" w:space="0" w:color="C9D3DC"/>
+              <w:right w:val="single" w:sz="4" w:space="0" w:color="C9D3DC"/>
+            </w:tcBorders>
+            <w:shd w:val="clear" w:color="auto" w:fill="F1F7FA"/>
+            <w:tcMar>
+              <w:top w:w="40" w:type="dxa"/>
+              <w:left w:w="90" w:type="dxa"/>
+              <w:bottom w:w="40" w:type="dxa"/>
+              <w:right w:w="90" w:type="dxa"/>
+            </w:tcMar>
+          </w:tcPr>
+          <w:p>
+            <w:pPr>
+              <w:keepNext/>
+            </w:pPr>
+            <w:r>
+              <w:t xml:space="preserve">Database: </w:t>
+            </w:r>
+            <w:r>
+              <w:rPr>
+                <w:cs/>
+              </w:rPr>
+              <w:t>อ่าน/เขียนข้อมูล</w:t>
+            </w:r>
+            <w:r>
+              <w:t xml:space="preserve">; Web App: </w:t>
+            </w:r>
+            <w:r>
+              <w:rPr>
+                <w:cs/>
+              </w:rPr>
+              <w:t>รับคำขอและส่งผล</w:t>
+            </w:r>
+            <w:r>
+              <w:t xml:space="preserve">; Reminder Job: </w:t>
+            </w:r>
+            <w:r>
+              <w:rPr>
+                <w:cs/>
+              </w:rPr>
+              <w:t>รับคำขอตรวจงานค้าง</w:t>
+            </w:r>
+            <w:r>
+              <w:t xml:space="preserve">; </w:t>
+            </w:r>
+            <w:r>
+              <w:rPr>
+                <w:cs/>
+              </w:rPr>
+              <w:t xml:space="preserve">ระบบภายนอกตามภาพและสถานะ </w:t>
+            </w:r>
+            <w:r>
+              <w:t>TBD</w:t>
+            </w:r>
+          </w:p>
+        </w:tc>
+      </w:tr>
+      <w:tr>
+        <w:trPr>
+          <w:cantSplit/>
+          <w:trHeight w:val="737"/>
+        </w:trPr>
+        <w:tc>
+          <w:tcPr>
+            <w:tcW w:w="1235" w:type="dxa"/>
+            <w:tcBorders>
+              <w:top w:val="single" w:sz="4" w:space="0" w:color="C9D3DC"/>
+              <w:left w:val="single" w:sz="4" w:space="0" w:color="C9D3DC"/>
+              <w:bottom w:val="single" w:sz="4" w:space="0" w:color="C9D3DC"/>
+              <w:right w:val="single" w:sz="4" w:space="0" w:color="C9D3DC"/>
+            </w:tcBorders>
+            <w:shd w:val="clear" w:color="auto" w:fill="FFFFFF"/>
+            <w:tcMar>
+              <w:top w:w="40" w:type="dxa"/>
+              <w:left w:w="90" w:type="dxa"/>
+              <w:bottom w:w="40" w:type="dxa"/>
+              <w:right w:w="90" w:type="dxa"/>
+            </w:tcMar>
+          </w:tcPr>
+          <w:p>
+            <w:r>
+              <w:t>CLMRS Database</w:t>
+            </w:r>
+          </w:p>
+        </w:tc>
+        <w:tc>
+          <w:tcPr>
+            <w:tcW w:w="1736" w:type="dxa"/>
+            <w:tcBorders>
+              <w:top w:val="single" w:sz="4" w:space="0" w:color="C9D3DC"/>
+              <w:left w:val="single" w:sz="4" w:space="0" w:color="C9D3DC"/>
+              <w:bottom w:val="single" w:sz="4" w:space="0" w:color="C9D3DC"/>
+              <w:right w:val="single" w:sz="4" w:space="0" w:color="C9D3DC"/>
+            </w:tcBorders>
+            <w:shd w:val="clear" w:color="auto" w:fill="FFFFFF"/>
+            <w:tcMar>
+              <w:top w:w="40" w:type="dxa"/>
+              <w:left w:w="90" w:type="dxa"/>
+              <w:bottom w:w="40" w:type="dxa"/>
+              <w:right w:w="90" w:type="dxa"/>
+            </w:tcMar>
+          </w:tcPr>
+          <w:p>
+            <w:r>
+              <w:rPr>
+                <w:cs/>
+              </w:rPr>
+              <w:t xml:space="preserve">เก็บงานซ่อม ประวัติสถานะ และข้อมูลแจ้งเตือน โดย </w:t>
+            </w:r>
+            <w:r>
+              <w:t xml:space="preserve">DR-09 </w:t>
+            </w:r>
+            <w:r>
+              <w:rPr>
+                <w:cs/>
+              </w:rPr>
+              <w:t xml:space="preserve">รองรับแนวคิด </w:t>
+            </w:r>
+            <w:r>
+              <w:t xml:space="preserve">opt-in </w:t>
+            </w:r>
+            <w:r>
+              <w:rPr>
+                <w:cs/>
+              </w:rPr>
+              <w:t xml:space="preserve">ระดับ </w:t>
+            </w:r>
+            <w:r>
+              <w:t>Overview</w:t>
+            </w:r>
+          </w:p>
+        </w:tc>
+        <w:tc>
+          <w:tcPr>
+            <w:tcW w:w="1361" w:type="dxa"/>
+            <w:tcBorders>
+              <w:top w:val="single" w:sz="4" w:space="0" w:color="C9D3DC"/>
+              <w:left w:val="single" w:sz="4" w:space="0" w:color="C9D3DC"/>
+              <w:bottom w:val="single" w:sz="4" w:space="0" w:color="C9D3DC"/>
+              <w:right w:val="single" w:sz="4" w:space="0" w:color="C9D3DC"/>
+            </w:tcBorders>
+            <w:shd w:val="clear" w:color="auto" w:fill="FFFFFF"/>
+            <w:tcMar>
+              <w:top w:w="40" w:type="dxa"/>
+              <w:left w:w="90" w:type="dxa"/>
+              <w:bottom w:w="40" w:type="dxa"/>
+              <w:right w:w="90" w:type="dxa"/>
+            </w:tcMar>
+          </w:tcPr>
+          <w:p>
+            <w:r>
+              <w:t>Database · PostgreSQL</w:t>
+            </w:r>
+          </w:p>
+        </w:tc>
+        <w:tc>
+          <w:tcPr>
+            <w:tcW w:w="1480" w:type="dxa"/>
+            <w:tcBorders>
+              <w:top w:val="single" w:sz="4" w:space="0" w:color="C9D3DC"/>
+              <w:left w:val="single" w:sz="4" w:space="0" w:color="C9D3DC"/>
+              <w:bottom w:val="single" w:sz="4" w:space="0" w:color="C9D3DC"/>
+              <w:right w:val="single" w:sz="4" w:space="0" w:color="C9D3DC"/>
+            </w:tcBorders>
+            <w:shd w:val="clear" w:color="auto" w:fill="FFFFFF"/>
+            <w:tcMar>
+              <w:top w:w="40" w:type="dxa"/>
+              <w:left w:w="90" w:type="dxa"/>
+              <w:bottom w:w="40" w:type="dxa"/>
+              <w:right w:w="90" w:type="dxa"/>
+            </w:tcMar>
+          </w:tcPr>
+          <w:p>
+            <w:r>
+              <w:rPr>
+                <w:cs/>
+              </w:rPr>
+              <w:t xml:space="preserve">สภาพแวดล้อมฐานข้อมูลที่ทีมดูแล </w:t>
+            </w:r>
+            <w:r>
+              <w:t xml:space="preserve">· </w:t>
+            </w:r>
+            <w:r>
+              <w:rPr>
+                <w:cs/>
+              </w:rPr>
+              <w:t xml:space="preserve">รายละเอียด </w:t>
+            </w:r>
+            <w:r>
+              <w:t>TBD</w:t>
+            </w:r>
+          </w:p>
+        </w:tc>
+        <w:tc>
+          <w:tcPr>
+            <w:tcW w:w="1833" w:type="dxa"/>
+            <w:tcBorders>
+              <w:top w:val="single" w:sz="4" w:space="0" w:color="C9D3DC"/>
+              <w:left w:val="single" w:sz="4" w:space="0" w:color="C9D3DC"/>
+              <w:bottom w:val="single" w:sz="4" w:space="0" w:color="C9D3DC"/>
+              <w:right w:val="single" w:sz="4" w:space="0" w:color="C9D3DC"/>
+            </w:tcBorders>
+            <w:shd w:val="clear" w:color="auto" w:fill="FFFFFF"/>
+            <w:tcMar>
+              <w:top w:w="40" w:type="dxa"/>
+              <w:left w:w="90" w:type="dxa"/>
+              <w:bottom w:w="40" w:type="dxa"/>
+              <w:right w:w="90" w:type="dxa"/>
+            </w:tcMar>
+          </w:tcPr>
+          <w:p>
+            <w:r>
+              <w:t xml:space="preserve">Ticket, </w:t>
+            </w:r>
+            <w:proofErr w:type="spellStart"/>
+            <w:r>
+              <w:t>TicketStatusLog</w:t>
+            </w:r>
+            <w:proofErr w:type="spellEnd"/>
+            <w:r>
+              <w:t xml:space="preserve">, </w:t>
+            </w:r>
+            <w:proofErr w:type="spellStart"/>
+            <w:r>
+              <w:t>NotificationPreference</w:t>
+            </w:r>
+            <w:proofErr w:type="spellEnd"/>
+            <w:r>
+              <w:t xml:space="preserve"> (DR-09), </w:t>
+            </w:r>
+            <w:proofErr w:type="spellStart"/>
+            <w:r>
+              <w:t>NotificationLog</w:t>
+            </w:r>
+            <w:proofErr w:type="spellEnd"/>
+            <w:r>
+              <w:t xml:space="preserve"> (DR-10)</w:t>
+            </w:r>
+          </w:p>
+        </w:tc>
+        <w:tc>
+          <w:tcPr>
+            <w:tcW w:w="1993" w:type="dxa"/>
+            <w:tcBorders>
+              <w:top w:val="single" w:sz="4" w:space="0" w:color="C9D3DC"/>
+              <w:left w:val="single" w:sz="4" w:space="0" w:color="C9D3DC"/>
+              <w:bottom w:val="single" w:sz="4" w:space="0" w:color="C9D3DC"/>
+              <w:right w:val="single" w:sz="4" w:space="0" w:color="C9D3DC"/>
+            </w:tcBorders>
+            <w:shd w:val="clear" w:color="auto" w:fill="FFFFFF"/>
+            <w:tcMar>
+              <w:top w:w="40" w:type="dxa"/>
+              <w:left w:w="90" w:type="dxa"/>
+              <w:bottom w:w="40" w:type="dxa"/>
+              <w:right w:w="90" w:type="dxa"/>
+            </w:tcMar>
+          </w:tcPr>
+          <w:p>
+            <w:r>
+              <w:t xml:space="preserve">API: </w:t>
+            </w:r>
+            <w:r>
+              <w:rPr>
+                <w:cs/>
+              </w:rPr>
+              <w:t xml:space="preserve">อ่าน/เขียนผ่านการเชื่อมต่อ </w:t>
+            </w:r>
+            <w:r>
+              <w:t>PostgreSQL</w:t>
+            </w:r>
+          </w:p>
+        </w:tc>
+      </w:tr>
+      <w:tr>
+        <w:trPr>
+          <w:cantSplit/>
+          <w:trHeight w:val="737"/>
+        </w:trPr>
+        <w:tc>
+          <w:tcPr>
+            <w:tcW w:w="1235" w:type="dxa"/>
+            <w:tcBorders>
+              <w:top w:val="single" w:sz="4" w:space="0" w:color="C9D3DC"/>
+              <w:left w:val="single" w:sz="4" w:space="0" w:color="C9D3DC"/>
+              <w:bottom w:val="single" w:sz="4" w:space="0" w:color="C9D3DC"/>
+              <w:right w:val="single" w:sz="4" w:space="0" w:color="C9D3DC"/>
+            </w:tcBorders>
+            <w:shd w:val="clear" w:color="auto" w:fill="FFFFFF"/>
+            <w:tcMar>
+              <w:top w:w="40" w:type="dxa"/>
+              <w:left w:w="90" w:type="dxa"/>
+              <w:bottom w:w="40" w:type="dxa"/>
+              <w:right w:w="90" w:type="dxa"/>
+            </w:tcMar>
+          </w:tcPr>
+          <w:p>
+            <w:r>
+              <w:t>Reminder Job</w:t>
+            </w:r>
+          </w:p>
+        </w:tc>
+        <w:tc>
+          <w:tcPr>
+            <w:tcW w:w="1736" w:type="dxa"/>
+            <w:tcBorders>
+              <w:top w:val="single" w:sz="4" w:space="0" w:color="C9D3DC"/>
+              <w:left w:val="single" w:sz="4" w:space="0" w:color="C9D3DC"/>
+              <w:bottom w:val="single" w:sz="4" w:space="0" w:color="C9D3DC"/>
+              <w:right w:val="single" w:sz="4" w:space="0" w:color="C9D3DC"/>
+            </w:tcBorders>
+            <w:shd w:val="clear" w:color="auto" w:fill="FFFFFF"/>
+            <w:tcMar>
+              <w:top w:w="40" w:type="dxa"/>
+              <w:left w:w="90" w:type="dxa"/>
+              <w:bottom w:w="40" w:type="dxa"/>
+              <w:right w:w="90" w:type="dxa"/>
+            </w:tcMar>
+          </w:tcPr>
+          <w:p>
+            <w:pPr>
+              <w:rPr>
+                <w:cs/>
+              </w:rPr>
+            </w:pPr>
+            <w:r>
+              <w:rPr>
+                <w:cs/>
+              </w:rPr>
+              <w:t xml:space="preserve">เริ่มตรวจงานค้างตามเวลาโดยไม่มีผู้ใช้กด ตาม </w:t>
+            </w:r>
+            <w:r>
+              <w:t>FR-CLMRS-10</w:t>
+            </w:r>
+          </w:p>
+        </w:tc>
+        <w:tc>
+          <w:tcPr>
+            <w:tcW w:w="1361" w:type="dxa"/>
+            <w:tcBorders>
+              <w:top w:val="single" w:sz="4" w:space="0" w:color="C9D3DC"/>
+              <w:left w:val="single" w:sz="4" w:space="0" w:color="C9D3DC"/>
+              <w:bottom w:val="single" w:sz="4" w:space="0" w:color="C9D3DC"/>
+              <w:right w:val="single" w:sz="4" w:space="0" w:color="C9D3DC"/>
+            </w:tcBorders>
+            <w:shd w:val="clear" w:color="auto" w:fill="FFFFFF"/>
+            <w:tcMar>
+              <w:top w:w="40" w:type="dxa"/>
+              <w:left w:w="90" w:type="dxa"/>
+              <w:bottom w:w="40" w:type="dxa"/>
+              <w:right w:w="90" w:type="dxa"/>
+            </w:tcMar>
+          </w:tcPr>
+          <w:p>
+            <w:r>
+              <w:t>Scheduled Job · Node.js</w:t>
+            </w:r>
+          </w:p>
+        </w:tc>
+        <w:tc>
+          <w:tcPr>
+            <w:tcW w:w="1480" w:type="dxa"/>
+            <w:tcBorders>
+              <w:top w:val="single" w:sz="4" w:space="0" w:color="C9D3DC"/>
+              <w:left w:val="single" w:sz="4" w:space="0" w:color="C9D3DC"/>
+              <w:bottom w:val="single" w:sz="4" w:space="0" w:color="C9D3DC"/>
+              <w:right w:val="single" w:sz="4" w:space="0" w:color="C9D3DC"/>
+            </w:tcBorders>
+            <w:shd w:val="clear" w:color="auto" w:fill="FFFFFF"/>
+            <w:tcMar>
+              <w:top w:w="40" w:type="dxa"/>
+              <w:left w:w="90" w:type="dxa"/>
+              <w:bottom w:w="40" w:type="dxa"/>
+              <w:right w:w="90" w:type="dxa"/>
+            </w:tcMar>
+          </w:tcPr>
+          <w:p>
+            <w:proofErr w:type="spellStart"/>
+            <w:r>
+              <w:rPr>
+                <w:cs/>
+              </w:rPr>
+              <w:t>เซิร์ฟเวอร์</w:t>
+            </w:r>
+            <w:proofErr w:type="spellEnd"/>
+            <w:r>
+              <w:rPr>
+                <w:cs/>
+              </w:rPr>
+              <w:t xml:space="preserve">ที่ทีมดูแล </w:t>
+            </w:r>
+            <w:r>
+              <w:t xml:space="preserve">· </w:t>
+            </w:r>
+            <w:r>
+              <w:rPr>
+                <w:cs/>
+              </w:rPr>
+              <w:t>รายละเอียด</w:t>
+            </w:r>
+            <w:proofErr w:type="spellStart"/>
+            <w:r>
+              <w:rPr>
+                <w:cs/>
+              </w:rPr>
+              <w:t>โฮส</w:t>
+            </w:r>
+            <w:proofErr w:type="spellEnd"/>
+            <w:r>
+              <w:rPr>
+                <w:cs/>
+              </w:rPr>
+              <w:t>ติ</w:t>
+            </w:r>
+            <w:proofErr w:type="spellStart"/>
+            <w:r>
+              <w:rPr>
+                <w:cs/>
+              </w:rPr>
+              <w:t>้ง</w:t>
+            </w:r>
+            <w:proofErr w:type="spellEnd"/>
+            <w:r>
+              <w:rPr>
+                <w:cs/>
+              </w:rPr>
+              <w:t xml:space="preserve"> </w:t>
+            </w:r>
+            <w:r>
+              <w:t>TBD</w:t>
+            </w:r>
+          </w:p>
+        </w:tc>
+        <w:tc>
+          <w:tcPr>
+            <w:tcW w:w="1833" w:type="dxa"/>
+            <w:tcBorders>
+              <w:top w:val="single" w:sz="4" w:space="0" w:color="C9D3DC"/>
+              <w:left w:val="single" w:sz="4" w:space="0" w:color="C9D3DC"/>
+              <w:bottom w:val="single" w:sz="4" w:space="0" w:color="C9D3DC"/>
+              <w:right w:val="single" w:sz="4" w:space="0" w:color="C9D3DC"/>
+            </w:tcBorders>
+            <w:shd w:val="clear" w:color="auto" w:fill="FFFFFF"/>
+            <w:tcMar>
+              <w:top w:w="40" w:type="dxa"/>
+              <w:left w:w="90" w:type="dxa"/>
+              <w:bottom w:w="40" w:type="dxa"/>
+              <w:right w:w="90" w:type="dxa"/>
+            </w:tcMar>
+          </w:tcPr>
+          <w:p>
+            <w:r>
+              <w:rPr>
+                <w:cs/>
+              </w:rPr>
+              <w:t>ไม่มีข้อมูลหลักถาวร</w:t>
+            </w:r>
+          </w:p>
+        </w:tc>
+        <w:tc>
+          <w:tcPr>
+            <w:tcW w:w="1993" w:type="dxa"/>
+            <w:tcBorders>
+              <w:top w:val="single" w:sz="4" w:space="0" w:color="C9D3DC"/>
+              <w:left w:val="single" w:sz="4" w:space="0" w:color="C9D3DC"/>
+              <w:bottom w:val="single" w:sz="4" w:space="0" w:color="C9D3DC"/>
+              <w:right w:val="single" w:sz="4" w:space="0" w:color="C9D3DC"/>
+            </w:tcBorders>
+            <w:shd w:val="clear" w:color="auto" w:fill="FFFFFF"/>
+            <w:tcMar>
+              <w:top w:w="40" w:type="dxa"/>
+              <w:left w:w="90" w:type="dxa"/>
+              <w:bottom w:w="40" w:type="dxa"/>
+              <w:right w:w="90" w:type="dxa"/>
+            </w:tcMar>
+          </w:tcPr>
+          <w:p>
+            <w:r>
+              <w:t xml:space="preserve">API: </w:t>
+            </w:r>
+            <w:r>
+              <w:rPr>
+                <w:cs/>
+              </w:rPr>
+              <w:t xml:space="preserve">ขอประเมินงานค้างและสร้างการเตือน วิธีเชื่อมต่อภายใน </w:t>
+            </w:r>
+            <w:r>
+              <w:t>TBD</w:t>
+            </w:r>
+          </w:p>
+        </w:tc>
+      </w:tr>
+    </w:tbl>
+    <w:p>
+      <w:pPr>
+        <w:spacing w:after="120"/>
+      </w:pPr>
+    </w:p>
+    <w:p>
+      <w:pPr>
+        <w:keepNext/>
+        <w:spacing w:before="160" w:after="60"/>
+      </w:pPr>
+      <w:r>
+        <w:rPr>
+          <w:b/>
+          <w:bCs/>
+          <w:color w:val="087E8B"/>
+          <w:sz w:val="30"/>
+          <w:szCs w:val="30"/>
+        </w:rPr>
+        <w:lastRenderedPageBreak/>
+        <w:t>4.4 NFR → container</w:t>
       </w:r>
     </w:p>
     <w:tbl>
@@ -15777,12 +17233,10 @@
         <w:tblLook w:val="0000" w:firstRow="0" w:lastRow="0" w:firstColumn="0" w:lastColumn="0" w:noHBand="0" w:noVBand="0"/>
       </w:tblPr>
       <w:tblGrid>
-        <w:gridCol w:w="1349"/>
-        <w:gridCol w:w="2313"/>
-        <w:gridCol w:w="1445"/>
-        <w:gridCol w:w="1542"/>
-        <w:gridCol w:w="1252"/>
-        <w:gridCol w:w="1737"/>
+        <w:gridCol w:w="1148"/>
+        <w:gridCol w:w="2838"/>
+        <w:gridCol w:w="3396"/>
+        <w:gridCol w:w="2256"/>
       </w:tblGrid>
       <w:tr>
         <w:trPr>
@@ -15791,7 +17245,7 @@
         </w:trPr>
         <w:tc>
           <w:tcPr>
-            <w:tcW w:w="1349" w:type="dxa"/>
+            <w:tcW w:w="1148" w:type="dxa"/>
             <w:tcBorders>
               <w:top w:val="single" w:sz="4" w:space="0" w:color="173B65"/>
               <w:left w:val="single" w:sz="4" w:space="0" w:color="173B65"/>
@@ -15819,13 +17273,13 @@
                 <w:sz w:val="28"/>
                 <w:szCs w:val="28"/>
               </w:rPr>
-              <w:t>Container</w:t>
-            </w:r>
-          </w:p>
-        </w:tc>
-        <w:tc>
-          <w:tcPr>
-            <w:tcW w:w="2313" w:type="dxa"/>
+              <w:t>NFR</w:t>
+            </w:r>
+          </w:p>
+        </w:tc>
+        <w:tc>
+          <w:tcPr>
+            <w:tcW w:w="2838" w:type="dxa"/>
             <w:tcBorders>
               <w:top w:val="single" w:sz="4" w:space="0" w:color="173B65"/>
               <w:left w:val="single" w:sz="4" w:space="0" w:color="173B65"/>
@@ -15854,14 +17308,14 @@
                 <w:sz w:val="28"/>
                 <w:szCs w:val="28"/>
               </w:rPr>
-              <w:t>หน้าที่</w:t>
+              <w:t>ต้องการอะไร</w:t>
             </w:r>
             <w:proofErr w:type="spellEnd"/>
           </w:p>
         </w:tc>
         <w:tc>
           <w:tcPr>
-            <w:tcW w:w="1445" w:type="dxa"/>
+            <w:tcW w:w="3396" w:type="dxa"/>
             <w:tcBorders>
               <w:top w:val="single" w:sz="4" w:space="0" w:color="173B65"/>
               <w:left w:val="single" w:sz="4" w:space="0" w:color="173B65"/>
@@ -15890,7 +17344,7 @@
                 <w:sz w:val="28"/>
                 <w:szCs w:val="28"/>
               </w:rPr>
-              <w:t>ชนิด</w:t>
+              <w:t>ผลต่อ</w:t>
             </w:r>
             <w:proofErr w:type="spellEnd"/>
             <w:r>
@@ -15901,750 +17355,13 @@
                 <w:sz w:val="28"/>
                 <w:szCs w:val="28"/>
               </w:rPr>
-              <w:t xml:space="preserve"> · stack</w:t>
-            </w:r>
-          </w:p>
-        </w:tc>
-        <w:tc>
-          <w:tcPr>
-            <w:tcW w:w="1542" w:type="dxa"/>
-            <w:tcBorders>
-              <w:top w:val="single" w:sz="4" w:space="0" w:color="173B65"/>
-              <w:left w:val="single" w:sz="4" w:space="0" w:color="173B65"/>
-              <w:bottom w:val="single" w:sz="4" w:space="0" w:color="173B65"/>
-              <w:right w:val="single" w:sz="4" w:space="0" w:color="173B65"/>
-            </w:tcBorders>
-            <w:shd w:val="clear" w:color="auto" w:fill="173B65"/>
-            <w:tcMar>
-              <w:top w:w="50" w:type="dxa"/>
-              <w:left w:w="90" w:type="dxa"/>
-              <w:bottom w:w="50" w:type="dxa"/>
-              <w:right w:w="90" w:type="dxa"/>
-            </w:tcMar>
-            <w:vAlign w:val="center"/>
-          </w:tcPr>
-          <w:p>
-            <w:pPr>
-              <w:keepNext/>
-            </w:pPr>
-            <w:proofErr w:type="spellStart"/>
-            <w:r>
-              <w:rPr>
-                <w:b/>
-                <w:bCs/>
-                <w:color w:val="FFFFFF"/>
-                <w:sz w:val="28"/>
-                <w:szCs w:val="28"/>
-              </w:rPr>
-              <w:t>รันที่ไหน</w:t>
-            </w:r>
-            <w:proofErr w:type="spellEnd"/>
-            <w:r>
-              <w:rPr>
-                <w:b/>
-                <w:bCs/>
-                <w:color w:val="FFFFFF"/>
-                <w:sz w:val="28"/>
-                <w:szCs w:val="28"/>
-              </w:rPr>
-              <w:t xml:space="preserve"> · </w:t>
-            </w:r>
-            <w:proofErr w:type="spellStart"/>
-            <w:r>
-              <w:rPr>
-                <w:b/>
-                <w:bCs/>
-                <w:color w:val="FFFFFF"/>
-                <w:sz w:val="28"/>
-                <w:szCs w:val="28"/>
-              </w:rPr>
-              <w:t>ใครควบคุม</w:t>
-            </w:r>
-            <w:proofErr w:type="spellEnd"/>
-          </w:p>
-        </w:tc>
-        <w:tc>
-          <w:tcPr>
-            <w:tcW w:w="1252" w:type="dxa"/>
-            <w:tcBorders>
-              <w:top w:val="single" w:sz="4" w:space="0" w:color="173B65"/>
-              <w:left w:val="single" w:sz="4" w:space="0" w:color="173B65"/>
-              <w:bottom w:val="single" w:sz="4" w:space="0" w:color="173B65"/>
-              <w:right w:val="single" w:sz="4" w:space="0" w:color="173B65"/>
-            </w:tcBorders>
-            <w:shd w:val="clear" w:color="auto" w:fill="173B65"/>
-            <w:tcMar>
-              <w:top w:w="50" w:type="dxa"/>
-              <w:left w:w="90" w:type="dxa"/>
-              <w:bottom w:w="50" w:type="dxa"/>
-              <w:right w:w="90" w:type="dxa"/>
-            </w:tcMar>
-            <w:vAlign w:val="center"/>
-          </w:tcPr>
-          <w:p>
-            <w:pPr>
-              <w:keepNext/>
-            </w:pPr>
-            <w:proofErr w:type="spellStart"/>
-            <w:r>
-              <w:rPr>
-                <w:b/>
-                <w:bCs/>
-                <w:color w:val="FFFFFF"/>
-                <w:sz w:val="28"/>
-                <w:szCs w:val="28"/>
-              </w:rPr>
-              <w:t>ข้อมูลที่เก็บ</w:t>
-            </w:r>
-            <w:proofErr w:type="spellEnd"/>
-          </w:p>
-        </w:tc>
-        <w:tc>
-          <w:tcPr>
-            <w:tcW w:w="1737" w:type="dxa"/>
-            <w:tcBorders>
-              <w:top w:val="single" w:sz="4" w:space="0" w:color="173B65"/>
-              <w:left w:val="single" w:sz="4" w:space="0" w:color="173B65"/>
-              <w:bottom w:val="single" w:sz="4" w:space="0" w:color="173B65"/>
-              <w:right w:val="single" w:sz="4" w:space="0" w:color="173B65"/>
-            </w:tcBorders>
-            <w:shd w:val="clear" w:color="auto" w:fill="173B65"/>
-            <w:tcMar>
-              <w:top w:w="50" w:type="dxa"/>
-              <w:left w:w="90" w:type="dxa"/>
-              <w:bottom w:w="50" w:type="dxa"/>
-              <w:right w:w="90" w:type="dxa"/>
-            </w:tcMar>
-            <w:vAlign w:val="center"/>
-          </w:tcPr>
-          <w:p>
-            <w:pPr>
-              <w:keepNext/>
-            </w:pPr>
-            <w:proofErr w:type="spellStart"/>
-            <w:r>
-              <w:rPr>
-                <w:b/>
-                <w:bCs/>
-                <w:color w:val="FFFFFF"/>
-                <w:sz w:val="28"/>
-                <w:szCs w:val="28"/>
-              </w:rPr>
-              <w:t>คุยกับ</w:t>
-            </w:r>
-            <w:proofErr w:type="spellEnd"/>
-            <w:r>
-              <w:rPr>
-                <w:b/>
-                <w:bCs/>
-                <w:color w:val="FFFFFF"/>
-                <w:sz w:val="28"/>
-                <w:szCs w:val="28"/>
-              </w:rPr>
-              <w:t xml:space="preserve"> (</w:t>
-            </w:r>
-            <w:proofErr w:type="spellStart"/>
-            <w:r>
-              <w:rPr>
-                <w:b/>
-                <w:bCs/>
-                <w:color w:val="FFFFFF"/>
-                <w:sz w:val="28"/>
-                <w:szCs w:val="28"/>
-              </w:rPr>
-              <w:t>ส่งอะไร</w:t>
-            </w:r>
-            <w:proofErr w:type="spellEnd"/>
-            <w:r>
-              <w:rPr>
-                <w:b/>
-                <w:bCs/>
-                <w:color w:val="FFFFFF"/>
-                <w:sz w:val="28"/>
-                <w:szCs w:val="28"/>
-              </w:rPr>
-              <w:t>)</w:t>
-            </w:r>
-          </w:p>
-        </w:tc>
-      </w:tr>
-      <w:tr>
-        <w:trPr>
-          <w:cantSplit/>
-          <w:trHeight w:val="737"/>
-        </w:trPr>
-        <w:tc>
-          <w:tcPr>
-            <w:tcW w:w="1349" w:type="dxa"/>
-            <w:tcBorders>
-              <w:top w:val="single" w:sz="4" w:space="0" w:color="C9D3DC"/>
-              <w:left w:val="single" w:sz="4" w:space="0" w:color="C9D3DC"/>
-              <w:bottom w:val="single" w:sz="4" w:space="0" w:color="C9D3DC"/>
-              <w:right w:val="single" w:sz="4" w:space="0" w:color="C9D3DC"/>
-            </w:tcBorders>
-            <w:shd w:val="clear" w:color="auto" w:fill="FFFFFF"/>
-            <w:tcMar>
-              <w:top w:w="40" w:type="dxa"/>
-              <w:left w:w="90" w:type="dxa"/>
-              <w:bottom w:w="40" w:type="dxa"/>
-              <w:right w:w="90" w:type="dxa"/>
-            </w:tcMar>
-          </w:tcPr>
-          <w:p>
-            <w:pPr>
-              <w:keepNext/>
-            </w:pPr>
-          </w:p>
-        </w:tc>
-        <w:tc>
-          <w:tcPr>
-            <w:tcW w:w="2313" w:type="dxa"/>
-            <w:tcBorders>
-              <w:top w:val="single" w:sz="4" w:space="0" w:color="C9D3DC"/>
-              <w:left w:val="single" w:sz="4" w:space="0" w:color="C9D3DC"/>
-              <w:bottom w:val="single" w:sz="4" w:space="0" w:color="C9D3DC"/>
-              <w:right w:val="single" w:sz="4" w:space="0" w:color="C9D3DC"/>
-            </w:tcBorders>
-            <w:shd w:val="clear" w:color="auto" w:fill="FFFFFF"/>
-            <w:tcMar>
-              <w:top w:w="40" w:type="dxa"/>
-              <w:left w:w="90" w:type="dxa"/>
-              <w:bottom w:w="40" w:type="dxa"/>
-              <w:right w:w="90" w:type="dxa"/>
-            </w:tcMar>
-          </w:tcPr>
-          <w:p>
-            <w:pPr>
-              <w:keepNext/>
-            </w:pPr>
-          </w:p>
-        </w:tc>
-        <w:tc>
-          <w:tcPr>
-            <w:tcW w:w="1445" w:type="dxa"/>
-            <w:tcBorders>
-              <w:top w:val="single" w:sz="4" w:space="0" w:color="C9D3DC"/>
-              <w:left w:val="single" w:sz="4" w:space="0" w:color="C9D3DC"/>
-              <w:bottom w:val="single" w:sz="4" w:space="0" w:color="C9D3DC"/>
-              <w:right w:val="single" w:sz="4" w:space="0" w:color="C9D3DC"/>
-            </w:tcBorders>
-            <w:shd w:val="clear" w:color="auto" w:fill="FFFFFF"/>
-            <w:tcMar>
-              <w:top w:w="40" w:type="dxa"/>
-              <w:left w:w="90" w:type="dxa"/>
-              <w:bottom w:w="40" w:type="dxa"/>
-              <w:right w:w="90" w:type="dxa"/>
-            </w:tcMar>
-          </w:tcPr>
-          <w:p>
-            <w:pPr>
-              <w:keepNext/>
-            </w:pPr>
-          </w:p>
-        </w:tc>
-        <w:tc>
-          <w:tcPr>
-            <w:tcW w:w="1542" w:type="dxa"/>
-            <w:tcBorders>
-              <w:top w:val="single" w:sz="4" w:space="0" w:color="C9D3DC"/>
-              <w:left w:val="single" w:sz="4" w:space="0" w:color="C9D3DC"/>
-              <w:bottom w:val="single" w:sz="4" w:space="0" w:color="C9D3DC"/>
-              <w:right w:val="single" w:sz="4" w:space="0" w:color="C9D3DC"/>
-            </w:tcBorders>
-            <w:shd w:val="clear" w:color="auto" w:fill="FFFFFF"/>
-            <w:tcMar>
-              <w:top w:w="40" w:type="dxa"/>
-              <w:left w:w="90" w:type="dxa"/>
-              <w:bottom w:w="40" w:type="dxa"/>
-              <w:right w:w="90" w:type="dxa"/>
-            </w:tcMar>
-          </w:tcPr>
-          <w:p>
-            <w:pPr>
-              <w:keepNext/>
-            </w:pPr>
-          </w:p>
-        </w:tc>
-        <w:tc>
-          <w:tcPr>
-            <w:tcW w:w="1252" w:type="dxa"/>
-            <w:tcBorders>
-              <w:top w:val="single" w:sz="4" w:space="0" w:color="C9D3DC"/>
-              <w:left w:val="single" w:sz="4" w:space="0" w:color="C9D3DC"/>
-              <w:bottom w:val="single" w:sz="4" w:space="0" w:color="C9D3DC"/>
-              <w:right w:val="single" w:sz="4" w:space="0" w:color="C9D3DC"/>
-            </w:tcBorders>
-            <w:shd w:val="clear" w:color="auto" w:fill="FFFFFF"/>
-            <w:tcMar>
-              <w:top w:w="40" w:type="dxa"/>
-              <w:left w:w="90" w:type="dxa"/>
-              <w:bottom w:w="40" w:type="dxa"/>
-              <w:right w:w="90" w:type="dxa"/>
-            </w:tcMar>
-          </w:tcPr>
-          <w:p>
-            <w:pPr>
-              <w:keepNext/>
-            </w:pPr>
-          </w:p>
-        </w:tc>
-        <w:tc>
-          <w:tcPr>
-            <w:tcW w:w="1737" w:type="dxa"/>
-            <w:tcBorders>
-              <w:top w:val="single" w:sz="4" w:space="0" w:color="C9D3DC"/>
-              <w:left w:val="single" w:sz="4" w:space="0" w:color="C9D3DC"/>
-              <w:bottom w:val="single" w:sz="4" w:space="0" w:color="C9D3DC"/>
-              <w:right w:val="single" w:sz="4" w:space="0" w:color="C9D3DC"/>
-            </w:tcBorders>
-            <w:shd w:val="clear" w:color="auto" w:fill="FFFFFF"/>
-            <w:tcMar>
-              <w:top w:w="40" w:type="dxa"/>
-              <w:left w:w="90" w:type="dxa"/>
-              <w:bottom w:w="40" w:type="dxa"/>
-              <w:right w:w="90" w:type="dxa"/>
-            </w:tcMar>
-          </w:tcPr>
-          <w:p>
-            <w:pPr>
-              <w:keepNext/>
-            </w:pPr>
-          </w:p>
-        </w:tc>
-      </w:tr>
-      <w:tr>
-        <w:trPr>
-          <w:cantSplit/>
-          <w:trHeight w:val="737"/>
-        </w:trPr>
-        <w:tc>
-          <w:tcPr>
-            <w:tcW w:w="1349" w:type="dxa"/>
-            <w:tcBorders>
-              <w:top w:val="single" w:sz="4" w:space="0" w:color="C9D3DC"/>
-              <w:left w:val="single" w:sz="4" w:space="0" w:color="C9D3DC"/>
-              <w:bottom w:val="single" w:sz="4" w:space="0" w:color="C9D3DC"/>
-              <w:right w:val="single" w:sz="4" w:space="0" w:color="C9D3DC"/>
-            </w:tcBorders>
-            <w:shd w:val="clear" w:color="auto" w:fill="F1F7FA"/>
-            <w:tcMar>
-              <w:top w:w="40" w:type="dxa"/>
-              <w:left w:w="90" w:type="dxa"/>
-              <w:bottom w:w="40" w:type="dxa"/>
-              <w:right w:w="90" w:type="dxa"/>
-            </w:tcMar>
-          </w:tcPr>
-          <w:p>
-            <w:pPr>
-              <w:keepNext/>
-            </w:pPr>
-          </w:p>
-        </w:tc>
-        <w:tc>
-          <w:tcPr>
-            <w:tcW w:w="2313" w:type="dxa"/>
-            <w:tcBorders>
-              <w:top w:val="single" w:sz="4" w:space="0" w:color="C9D3DC"/>
-              <w:left w:val="single" w:sz="4" w:space="0" w:color="C9D3DC"/>
-              <w:bottom w:val="single" w:sz="4" w:space="0" w:color="C9D3DC"/>
-              <w:right w:val="single" w:sz="4" w:space="0" w:color="C9D3DC"/>
-            </w:tcBorders>
-            <w:shd w:val="clear" w:color="auto" w:fill="F1F7FA"/>
-            <w:tcMar>
-              <w:top w:w="40" w:type="dxa"/>
-              <w:left w:w="90" w:type="dxa"/>
-              <w:bottom w:w="40" w:type="dxa"/>
-              <w:right w:w="90" w:type="dxa"/>
-            </w:tcMar>
-          </w:tcPr>
-          <w:p>
-            <w:pPr>
-              <w:keepNext/>
-            </w:pPr>
-          </w:p>
-        </w:tc>
-        <w:tc>
-          <w:tcPr>
-            <w:tcW w:w="1445" w:type="dxa"/>
-            <w:tcBorders>
-              <w:top w:val="single" w:sz="4" w:space="0" w:color="C9D3DC"/>
-              <w:left w:val="single" w:sz="4" w:space="0" w:color="C9D3DC"/>
-              <w:bottom w:val="single" w:sz="4" w:space="0" w:color="C9D3DC"/>
-              <w:right w:val="single" w:sz="4" w:space="0" w:color="C9D3DC"/>
-            </w:tcBorders>
-            <w:shd w:val="clear" w:color="auto" w:fill="F1F7FA"/>
-            <w:tcMar>
-              <w:top w:w="40" w:type="dxa"/>
-              <w:left w:w="90" w:type="dxa"/>
-              <w:bottom w:w="40" w:type="dxa"/>
-              <w:right w:w="90" w:type="dxa"/>
-            </w:tcMar>
-          </w:tcPr>
-          <w:p>
-            <w:pPr>
-              <w:keepNext/>
-            </w:pPr>
-          </w:p>
-        </w:tc>
-        <w:tc>
-          <w:tcPr>
-            <w:tcW w:w="1542" w:type="dxa"/>
-            <w:tcBorders>
-              <w:top w:val="single" w:sz="4" w:space="0" w:color="C9D3DC"/>
-              <w:left w:val="single" w:sz="4" w:space="0" w:color="C9D3DC"/>
-              <w:bottom w:val="single" w:sz="4" w:space="0" w:color="C9D3DC"/>
-              <w:right w:val="single" w:sz="4" w:space="0" w:color="C9D3DC"/>
-            </w:tcBorders>
-            <w:shd w:val="clear" w:color="auto" w:fill="F1F7FA"/>
-            <w:tcMar>
-              <w:top w:w="40" w:type="dxa"/>
-              <w:left w:w="90" w:type="dxa"/>
-              <w:bottom w:w="40" w:type="dxa"/>
-              <w:right w:w="90" w:type="dxa"/>
-            </w:tcMar>
-          </w:tcPr>
-          <w:p>
-            <w:pPr>
-              <w:keepNext/>
-            </w:pPr>
-          </w:p>
-        </w:tc>
-        <w:tc>
-          <w:tcPr>
-            <w:tcW w:w="1252" w:type="dxa"/>
-            <w:tcBorders>
-              <w:top w:val="single" w:sz="4" w:space="0" w:color="C9D3DC"/>
-              <w:left w:val="single" w:sz="4" w:space="0" w:color="C9D3DC"/>
-              <w:bottom w:val="single" w:sz="4" w:space="0" w:color="C9D3DC"/>
-              <w:right w:val="single" w:sz="4" w:space="0" w:color="C9D3DC"/>
-            </w:tcBorders>
-            <w:shd w:val="clear" w:color="auto" w:fill="F1F7FA"/>
-            <w:tcMar>
-              <w:top w:w="40" w:type="dxa"/>
-              <w:left w:w="90" w:type="dxa"/>
-              <w:bottom w:w="40" w:type="dxa"/>
-              <w:right w:w="90" w:type="dxa"/>
-            </w:tcMar>
-          </w:tcPr>
-          <w:p>
-            <w:pPr>
-              <w:keepNext/>
-            </w:pPr>
-          </w:p>
-        </w:tc>
-        <w:tc>
-          <w:tcPr>
-            <w:tcW w:w="1737" w:type="dxa"/>
-            <w:tcBorders>
-              <w:top w:val="single" w:sz="4" w:space="0" w:color="C9D3DC"/>
-              <w:left w:val="single" w:sz="4" w:space="0" w:color="C9D3DC"/>
-              <w:bottom w:val="single" w:sz="4" w:space="0" w:color="C9D3DC"/>
-              <w:right w:val="single" w:sz="4" w:space="0" w:color="C9D3DC"/>
-            </w:tcBorders>
-            <w:shd w:val="clear" w:color="auto" w:fill="F1F7FA"/>
-            <w:tcMar>
-              <w:top w:w="40" w:type="dxa"/>
-              <w:left w:w="90" w:type="dxa"/>
-              <w:bottom w:w="40" w:type="dxa"/>
-              <w:right w:w="90" w:type="dxa"/>
-            </w:tcMar>
-          </w:tcPr>
-          <w:p>
-            <w:pPr>
-              <w:keepNext/>
-            </w:pPr>
-          </w:p>
-        </w:tc>
-      </w:tr>
-      <w:tr>
-        <w:trPr>
-          <w:cantSplit/>
-          <w:trHeight w:val="737"/>
-        </w:trPr>
-        <w:tc>
-          <w:tcPr>
-            <w:tcW w:w="1349" w:type="dxa"/>
-            <w:tcBorders>
-              <w:top w:val="single" w:sz="4" w:space="0" w:color="C9D3DC"/>
-              <w:left w:val="single" w:sz="4" w:space="0" w:color="C9D3DC"/>
-              <w:bottom w:val="single" w:sz="4" w:space="0" w:color="C9D3DC"/>
-              <w:right w:val="single" w:sz="4" w:space="0" w:color="C9D3DC"/>
-            </w:tcBorders>
-            <w:shd w:val="clear" w:color="auto" w:fill="FFFFFF"/>
-            <w:tcMar>
-              <w:top w:w="40" w:type="dxa"/>
-              <w:left w:w="90" w:type="dxa"/>
-              <w:bottom w:w="40" w:type="dxa"/>
-              <w:right w:w="90" w:type="dxa"/>
-            </w:tcMar>
-          </w:tcPr>
-          <w:p/>
-        </w:tc>
-        <w:tc>
-          <w:tcPr>
-            <w:tcW w:w="2313" w:type="dxa"/>
-            <w:tcBorders>
-              <w:top w:val="single" w:sz="4" w:space="0" w:color="C9D3DC"/>
-              <w:left w:val="single" w:sz="4" w:space="0" w:color="C9D3DC"/>
-              <w:bottom w:val="single" w:sz="4" w:space="0" w:color="C9D3DC"/>
-              <w:right w:val="single" w:sz="4" w:space="0" w:color="C9D3DC"/>
-            </w:tcBorders>
-            <w:shd w:val="clear" w:color="auto" w:fill="FFFFFF"/>
-            <w:tcMar>
-              <w:top w:w="40" w:type="dxa"/>
-              <w:left w:w="90" w:type="dxa"/>
-              <w:bottom w:w="40" w:type="dxa"/>
-              <w:right w:w="90" w:type="dxa"/>
-            </w:tcMar>
-          </w:tcPr>
-          <w:p/>
-        </w:tc>
-        <w:tc>
-          <w:tcPr>
-            <w:tcW w:w="1445" w:type="dxa"/>
-            <w:tcBorders>
-              <w:top w:val="single" w:sz="4" w:space="0" w:color="C9D3DC"/>
-              <w:left w:val="single" w:sz="4" w:space="0" w:color="C9D3DC"/>
-              <w:bottom w:val="single" w:sz="4" w:space="0" w:color="C9D3DC"/>
-              <w:right w:val="single" w:sz="4" w:space="0" w:color="C9D3DC"/>
-            </w:tcBorders>
-            <w:shd w:val="clear" w:color="auto" w:fill="FFFFFF"/>
-            <w:tcMar>
-              <w:top w:w="40" w:type="dxa"/>
-              <w:left w:w="90" w:type="dxa"/>
-              <w:bottom w:w="40" w:type="dxa"/>
-              <w:right w:w="90" w:type="dxa"/>
-            </w:tcMar>
-          </w:tcPr>
-          <w:p/>
-        </w:tc>
-        <w:tc>
-          <w:tcPr>
-            <w:tcW w:w="1542" w:type="dxa"/>
-            <w:tcBorders>
-              <w:top w:val="single" w:sz="4" w:space="0" w:color="C9D3DC"/>
-              <w:left w:val="single" w:sz="4" w:space="0" w:color="C9D3DC"/>
-              <w:bottom w:val="single" w:sz="4" w:space="0" w:color="C9D3DC"/>
-              <w:right w:val="single" w:sz="4" w:space="0" w:color="C9D3DC"/>
-            </w:tcBorders>
-            <w:shd w:val="clear" w:color="auto" w:fill="FFFFFF"/>
-            <w:tcMar>
-              <w:top w:w="40" w:type="dxa"/>
-              <w:left w:w="90" w:type="dxa"/>
-              <w:bottom w:w="40" w:type="dxa"/>
-              <w:right w:w="90" w:type="dxa"/>
-            </w:tcMar>
-          </w:tcPr>
-          <w:p/>
-        </w:tc>
-        <w:tc>
-          <w:tcPr>
-            <w:tcW w:w="1252" w:type="dxa"/>
-            <w:tcBorders>
-              <w:top w:val="single" w:sz="4" w:space="0" w:color="C9D3DC"/>
-              <w:left w:val="single" w:sz="4" w:space="0" w:color="C9D3DC"/>
-              <w:bottom w:val="single" w:sz="4" w:space="0" w:color="C9D3DC"/>
-              <w:right w:val="single" w:sz="4" w:space="0" w:color="C9D3DC"/>
-            </w:tcBorders>
-            <w:shd w:val="clear" w:color="auto" w:fill="FFFFFF"/>
-            <w:tcMar>
-              <w:top w:w="40" w:type="dxa"/>
-              <w:left w:w="90" w:type="dxa"/>
-              <w:bottom w:w="40" w:type="dxa"/>
-              <w:right w:w="90" w:type="dxa"/>
-            </w:tcMar>
-          </w:tcPr>
-          <w:p/>
-        </w:tc>
-        <w:tc>
-          <w:tcPr>
-            <w:tcW w:w="1737" w:type="dxa"/>
-            <w:tcBorders>
-              <w:top w:val="single" w:sz="4" w:space="0" w:color="C9D3DC"/>
-              <w:left w:val="single" w:sz="4" w:space="0" w:color="C9D3DC"/>
-              <w:bottom w:val="single" w:sz="4" w:space="0" w:color="C9D3DC"/>
-              <w:right w:val="single" w:sz="4" w:space="0" w:color="C9D3DC"/>
-            </w:tcBorders>
-            <w:shd w:val="clear" w:color="auto" w:fill="FFFFFF"/>
-            <w:tcMar>
-              <w:top w:w="40" w:type="dxa"/>
-              <w:left w:w="90" w:type="dxa"/>
-              <w:bottom w:w="40" w:type="dxa"/>
-              <w:right w:w="90" w:type="dxa"/>
-            </w:tcMar>
-          </w:tcPr>
-          <w:p/>
-        </w:tc>
-      </w:tr>
-    </w:tbl>
-    <w:p>
-      <w:pPr>
-        <w:spacing w:after="120"/>
-      </w:pPr>
-    </w:p>
-    <w:p>
-      <w:pPr>
-        <w:keepNext/>
-        <w:spacing w:before="160" w:after="60"/>
-      </w:pPr>
-      <w:r>
-        <w:rPr>
-          <w:b/>
-          <w:bCs/>
-          <w:color w:val="087E8B"/>
-          <w:sz w:val="30"/>
-          <w:szCs w:val="30"/>
-        </w:rPr>
-        <w:t>4.4 NFR → container</w:t>
-      </w:r>
-    </w:p>
-    <w:tbl>
-      <w:tblPr>
-        <w:tblW w:w="9638" w:type="dxa"/>
-        <w:tblBorders>
-          <w:top w:val="single" w:sz="4" w:space="0" w:color="auto"/>
-          <w:left w:val="single" w:sz="4" w:space="0" w:color="auto"/>
-          <w:bottom w:val="single" w:sz="4" w:space="0" w:color="auto"/>
-          <w:right w:val="single" w:sz="4" w:space="0" w:color="auto"/>
-          <w:insideH w:val="single" w:sz="4" w:space="0" w:color="auto"/>
-          <w:insideV w:val="single" w:sz="4" w:space="0" w:color="auto"/>
-        </w:tblBorders>
-        <w:tblCellMar>
-          <w:left w:w="10" w:type="dxa"/>
-          <w:right w:w="10" w:type="dxa"/>
-        </w:tblCellMar>
-        <w:tblLook w:val="0000" w:firstRow="0" w:lastRow="0" w:firstColumn="0" w:lastColumn="0" w:noHBand="0" w:noVBand="0"/>
-      </w:tblPr>
-      <w:tblGrid>
-        <w:gridCol w:w="1156"/>
-        <w:gridCol w:w="2891"/>
-        <w:gridCol w:w="3469"/>
-        <w:gridCol w:w="2122"/>
-      </w:tblGrid>
-      <w:tr>
-        <w:trPr>
-          <w:cantSplit/>
-          <w:tblHeader/>
-        </w:trPr>
-        <w:tc>
-          <w:tcPr>
-            <w:tcW w:w="1156" w:type="dxa"/>
-            <w:tcBorders>
-              <w:top w:val="single" w:sz="4" w:space="0" w:color="173B65"/>
-              <w:left w:val="single" w:sz="4" w:space="0" w:color="173B65"/>
-              <w:bottom w:val="single" w:sz="4" w:space="0" w:color="173B65"/>
-              <w:right w:val="single" w:sz="4" w:space="0" w:color="173B65"/>
-            </w:tcBorders>
-            <w:shd w:val="clear" w:color="auto" w:fill="173B65"/>
-            <w:tcMar>
-              <w:top w:w="50" w:type="dxa"/>
-              <w:left w:w="90" w:type="dxa"/>
-              <w:bottom w:w="50" w:type="dxa"/>
-              <w:right w:w="90" w:type="dxa"/>
-            </w:tcMar>
-            <w:vAlign w:val="center"/>
-          </w:tcPr>
-          <w:p>
-            <w:pPr>
-              <w:keepNext/>
-            </w:pPr>
-            <w:r>
-              <w:rPr>
-                <w:b/>
-                <w:bCs/>
-                <w:color w:val="FFFFFF"/>
-                <w:sz w:val="28"/>
-                <w:szCs w:val="28"/>
-              </w:rPr>
-              <w:t>NFR</w:t>
-            </w:r>
-          </w:p>
-        </w:tc>
-        <w:tc>
-          <w:tcPr>
-            <w:tcW w:w="2891" w:type="dxa"/>
-            <w:tcBorders>
-              <w:top w:val="single" w:sz="4" w:space="0" w:color="173B65"/>
-              <w:left w:val="single" w:sz="4" w:space="0" w:color="173B65"/>
-              <w:bottom w:val="single" w:sz="4" w:space="0" w:color="173B65"/>
-              <w:right w:val="single" w:sz="4" w:space="0" w:color="173B65"/>
-            </w:tcBorders>
-            <w:shd w:val="clear" w:color="auto" w:fill="173B65"/>
-            <w:tcMar>
-              <w:top w:w="50" w:type="dxa"/>
-              <w:left w:w="90" w:type="dxa"/>
-              <w:bottom w:w="50" w:type="dxa"/>
-              <w:right w:w="90" w:type="dxa"/>
-            </w:tcMar>
-            <w:vAlign w:val="center"/>
-          </w:tcPr>
-          <w:p>
-            <w:pPr>
-              <w:keepNext/>
-            </w:pPr>
-            <w:proofErr w:type="spellStart"/>
-            <w:r>
-              <w:rPr>
-                <w:b/>
-                <w:bCs/>
-                <w:color w:val="FFFFFF"/>
-                <w:sz w:val="28"/>
-                <w:szCs w:val="28"/>
-              </w:rPr>
-              <w:t>ต้องการอะไร</w:t>
-            </w:r>
-            <w:proofErr w:type="spellEnd"/>
-          </w:p>
-        </w:tc>
-        <w:tc>
-          <w:tcPr>
-            <w:tcW w:w="3469" w:type="dxa"/>
-            <w:tcBorders>
-              <w:top w:val="single" w:sz="4" w:space="0" w:color="173B65"/>
-              <w:left w:val="single" w:sz="4" w:space="0" w:color="173B65"/>
-              <w:bottom w:val="single" w:sz="4" w:space="0" w:color="173B65"/>
-              <w:right w:val="single" w:sz="4" w:space="0" w:color="173B65"/>
-            </w:tcBorders>
-            <w:shd w:val="clear" w:color="auto" w:fill="173B65"/>
-            <w:tcMar>
-              <w:top w:w="50" w:type="dxa"/>
-              <w:left w:w="90" w:type="dxa"/>
-              <w:bottom w:w="50" w:type="dxa"/>
-              <w:right w:w="90" w:type="dxa"/>
-            </w:tcMar>
-            <w:vAlign w:val="center"/>
-          </w:tcPr>
-          <w:p>
-            <w:pPr>
-              <w:keepNext/>
-            </w:pPr>
-            <w:proofErr w:type="spellStart"/>
-            <w:r>
-              <w:rPr>
-                <w:b/>
-                <w:bCs/>
-                <w:color w:val="FFFFFF"/>
-                <w:sz w:val="28"/>
-                <w:szCs w:val="28"/>
-              </w:rPr>
-              <w:t>ผลต่อ</w:t>
-            </w:r>
-            <w:proofErr w:type="spellEnd"/>
-            <w:r>
-              <w:rPr>
-                <w:b/>
-                <w:bCs/>
-                <w:color w:val="FFFFFF"/>
-                <w:sz w:val="28"/>
-                <w:szCs w:val="28"/>
-              </w:rPr>
               <w:t xml:space="preserve"> container</w:t>
             </w:r>
           </w:p>
         </w:tc>
         <w:tc>
           <w:tcPr>
-            <w:tcW w:w="2122" w:type="dxa"/>
+            <w:tcW w:w="2256" w:type="dxa"/>
             <w:tcBorders>
               <w:top w:val="single" w:sz="4" w:space="0" w:color="173B65"/>
               <w:left w:val="single" w:sz="4" w:space="0" w:color="173B65"/>
@@ -16718,7 +17435,7 @@
         </w:trPr>
         <w:tc>
           <w:tcPr>
-            <w:tcW w:w="1156" w:type="dxa"/>
+            <w:tcW w:w="1148" w:type="dxa"/>
             <w:tcBorders>
               <w:top w:val="single" w:sz="4" w:space="0" w:color="C9D3DC"/>
               <w:left w:val="single" w:sz="4" w:space="0" w:color="C9D3DC"/>
@@ -16745,11 +17462,14 @@
               </w:rPr>
               <w:t>NFR-</w:t>
             </w:r>
-          </w:p>
-        </w:tc>
-        <w:tc>
-          <w:tcPr>
-            <w:tcW w:w="2891" w:type="dxa"/>
+            <w:r>
+              <w:t>CLMRS-01</w:t>
+            </w:r>
+          </w:p>
+        </w:tc>
+        <w:tc>
+          <w:tcPr>
+            <w:tcW w:w="2838" w:type="dxa"/>
             <w:tcBorders>
               <w:top w:val="single" w:sz="4" w:space="0" w:color="C9D3DC"/>
               <w:left w:val="single" w:sz="4" w:space="0" w:color="C9D3DC"/>
@@ -16768,11 +17488,17 @@
             <w:pPr>
               <w:keepNext/>
             </w:pPr>
-          </w:p>
-        </w:tc>
-        <w:tc>
-          <w:tcPr>
-            <w:tcW w:w="3469" w:type="dxa"/>
+            <w:r>
+              <w:rPr>
+                <w:cs/>
+              </w:rPr>
+              <w:t>ควบคุมการเข้าถึงตามบทบาท รวมถึงการรับแจ้งเตือน</w:t>
+            </w:r>
+          </w:p>
+        </w:tc>
+        <w:tc>
+          <w:tcPr>
+            <w:tcW w:w="3396" w:type="dxa"/>
             <w:tcBorders>
               <w:top w:val="single" w:sz="4" w:space="0" w:color="C9D3DC"/>
               <w:left w:val="single" w:sz="4" w:space="0" w:color="C9D3DC"/>
@@ -16791,11 +17517,38 @@
             <w:pPr>
               <w:keepNext/>
             </w:pPr>
-          </w:p>
-        </w:tc>
-        <w:tc>
-          <w:tcPr>
-            <w:tcW w:w="2122" w:type="dxa"/>
+            <w:r>
+              <w:t xml:space="preserve">CLMRS API </w:t>
+            </w:r>
+            <w:r>
+              <w:rPr>
+                <w:cs/>
+              </w:rPr>
+              <w:t xml:space="preserve">ตรวจบทบาทและสิทธิ์เข้าถึงงานก่อนสร้างหรือแสดงแจ้งเตือน โดยใช้ </w:t>
+            </w:r>
+            <w:r>
+              <w:t xml:space="preserve">BR-05 </w:t>
+            </w:r>
+            <w:r>
+              <w:rPr>
+                <w:cs/>
+              </w:rPr>
+              <w:t>จำกัดผู้แจ้งให้เห็นเฉพาะงานตนเอง</w:t>
+            </w:r>
+            <w:r>
+              <w:t xml:space="preserve">; Database </w:t>
+            </w:r>
+            <w:r>
+              <w:rPr>
+                <w:cs/>
+              </w:rPr>
+              <w:t>เก็บข้อมูลสิทธิ์</w:t>
+            </w:r>
+          </w:p>
+        </w:tc>
+        <w:tc>
+          <w:tcPr>
+            <w:tcW w:w="2256" w:type="dxa"/>
             <w:tcBorders>
               <w:top w:val="single" w:sz="4" w:space="0" w:color="C9D3DC"/>
               <w:left w:val="single" w:sz="4" w:space="0" w:color="C9D3DC"/>
@@ -16814,6 +17567,33 @@
             <w:pPr>
               <w:keepNext/>
             </w:pPr>
+            <w:r>
+              <w:rPr>
+                <w:cs/>
+              </w:rPr>
+              <w:t xml:space="preserve">ออกแบบหน้าที่แล้ว </w:t>
+            </w:r>
+            <w:r>
+              <w:t xml:space="preserve">· </w:t>
+            </w:r>
+            <w:r>
+              <w:rPr>
+                <w:cs/>
+              </w:rPr>
+              <w:t xml:space="preserve">รายละเอียด </w:t>
+            </w:r>
+            <w:r>
+              <w:t xml:space="preserve">Role Matrix/Authentication </w:t>
+            </w:r>
+            <w:r>
+              <w:rPr>
+                <w:cs/>
+              </w:rPr>
+              <w:t xml:space="preserve">รอ </w:t>
+            </w:r>
+            <w:r>
+              <w:t>OQ-08</w:t>
+            </w:r>
           </w:p>
         </w:tc>
       </w:tr>
@@ -16824,7 +17604,7 @@
         </w:trPr>
         <w:tc>
           <w:tcPr>
-            <w:tcW w:w="1156" w:type="dxa"/>
+            <w:tcW w:w="1148" w:type="dxa"/>
             <w:tcBorders>
               <w:top w:val="single" w:sz="4" w:space="0" w:color="C9D3DC"/>
               <w:left w:val="single" w:sz="4" w:space="0" w:color="C9D3DC"/>
@@ -16851,11 +17631,14 @@
               </w:rPr>
               <w:t>NFR-</w:t>
             </w:r>
-          </w:p>
-        </w:tc>
-        <w:tc>
-          <w:tcPr>
-            <w:tcW w:w="2891" w:type="dxa"/>
+            <w:r>
+              <w:t>CLMRS-05</w:t>
+            </w:r>
+          </w:p>
+        </w:tc>
+        <w:tc>
+          <w:tcPr>
+            <w:tcW w:w="2838" w:type="dxa"/>
             <w:tcBorders>
               <w:top w:val="single" w:sz="4" w:space="0" w:color="C9D3DC"/>
               <w:left w:val="single" w:sz="4" w:space="0" w:color="C9D3DC"/>
@@ -16874,11 +17657,17 @@
             <w:pPr>
               <w:keepNext/>
             </w:pPr>
-          </w:p>
-        </w:tc>
-        <w:tc>
-          <w:tcPr>
-            <w:tcW w:w="3469" w:type="dxa"/>
+            <w:r>
+              <w:rPr>
+                <w:cs/>
+              </w:rPr>
+              <w:t>ข้อความแจ้งเตือนไม่มีข้อมูลส่วนบุคคลเกินจำเป็น</w:t>
+            </w:r>
+          </w:p>
+        </w:tc>
+        <w:tc>
+          <w:tcPr>
+            <w:tcW w:w="3396" w:type="dxa"/>
             <w:tcBorders>
               <w:top w:val="single" w:sz="4" w:space="0" w:color="C9D3DC"/>
               <w:left w:val="single" w:sz="4" w:space="0" w:color="C9D3DC"/>
@@ -16897,11 +17686,70 @@
             <w:pPr>
               <w:keepNext/>
             </w:pPr>
-          </w:p>
-        </w:tc>
-        <w:tc>
-          <w:tcPr>
-            <w:tcW w:w="2122" w:type="dxa"/>
+            <w:r>
+              <w:t xml:space="preserve">CLMRS API </w:t>
+            </w:r>
+            <w:r>
+              <w:rPr>
+                <w:cs/>
+              </w:rPr>
+              <w:t>จำกัด</w:t>
+            </w:r>
+            <w:proofErr w:type="spellStart"/>
+            <w:r>
+              <w:rPr>
+                <w:cs/>
+              </w:rPr>
+              <w:t>ฟิ</w:t>
+            </w:r>
+            <w:proofErr w:type="spellEnd"/>
+            <w:r>
+              <w:rPr>
+                <w:cs/>
+              </w:rPr>
+              <w:t xml:space="preserve">ลด์ข้อความตาม </w:t>
+            </w:r>
+            <w:r>
+              <w:t xml:space="preserve">BR-10 </w:t>
+            </w:r>
+            <w:r>
+              <w:rPr>
+                <w:cs/>
+              </w:rPr>
+              <w:t>ก่อนบันทึกหรือส่ง</w:t>
+            </w:r>
+            <w:r>
+              <w:t xml:space="preserve">; Web App </w:t>
+            </w:r>
+            <w:r>
+              <w:rPr>
+                <w:cs/>
+              </w:rPr>
+              <w:t xml:space="preserve">แสดงเฉพาะข้อมูลที่ </w:t>
+            </w:r>
+            <w:r>
+              <w:t xml:space="preserve">API </w:t>
+            </w:r>
+            <w:r>
+              <w:rPr>
+                <w:cs/>
+              </w:rPr>
+              <w:t>อนุญาต</w:t>
+            </w:r>
+            <w:r>
+              <w:t xml:space="preserve">; </w:t>
+            </w:r>
+            <w:r>
+              <w:rPr>
+                <w:cs/>
+              </w:rPr>
+              <w:t>ช่องทางภายนอกยังไม่เปิดใช้</w:t>
+            </w:r>
+          </w:p>
+        </w:tc>
+        <w:tc>
+          <w:tcPr>
+            <w:tcW w:w="2256" w:type="dxa"/>
             <w:tcBorders>
               <w:top w:val="single" w:sz="4" w:space="0" w:color="C9D3DC"/>
               <w:left w:val="single" w:sz="4" w:space="0" w:color="C9D3DC"/>
@@ -16920,104 +17768,48 @@
             <w:pPr>
               <w:keepNext/>
             </w:pPr>
-          </w:p>
-        </w:tc>
-      </w:tr>
-      <w:tr>
-        <w:trPr>
-          <w:cantSplit/>
-          <w:trHeight w:val="680"/>
-        </w:trPr>
-        <w:tc>
-          <w:tcPr>
-            <w:tcW w:w="1156" w:type="dxa"/>
-            <w:tcBorders>
-              <w:top w:val="single" w:sz="4" w:space="0" w:color="C9D3DC"/>
-              <w:left w:val="single" w:sz="4" w:space="0" w:color="C9D3DC"/>
-              <w:bottom w:val="single" w:sz="4" w:space="0" w:color="C9D3DC"/>
-              <w:right w:val="single" w:sz="4" w:space="0" w:color="C9D3DC"/>
-            </w:tcBorders>
-            <w:shd w:val="clear" w:color="auto" w:fill="FFFFFF"/>
-            <w:tcMar>
-              <w:top w:w="40" w:type="dxa"/>
-              <w:left w:w="90" w:type="dxa"/>
-              <w:bottom w:w="40" w:type="dxa"/>
-              <w:right w:w="90" w:type="dxa"/>
-            </w:tcMar>
-          </w:tcPr>
-          <w:p>
-            <w:r>
-              <w:rPr>
-                <w:color w:val="5A6B7C"/>
-                <w:sz w:val="28"/>
-                <w:szCs w:val="28"/>
-              </w:rPr>
-              <w:t>NFR-</w:t>
-            </w:r>
-          </w:p>
-        </w:tc>
-        <w:tc>
-          <w:tcPr>
-            <w:tcW w:w="2891" w:type="dxa"/>
-            <w:tcBorders>
-              <w:top w:val="single" w:sz="4" w:space="0" w:color="C9D3DC"/>
-              <w:left w:val="single" w:sz="4" w:space="0" w:color="C9D3DC"/>
-              <w:bottom w:val="single" w:sz="4" w:space="0" w:color="C9D3DC"/>
-              <w:right w:val="single" w:sz="4" w:space="0" w:color="C9D3DC"/>
-            </w:tcBorders>
-            <w:shd w:val="clear" w:color="auto" w:fill="FFFFFF"/>
-            <w:tcMar>
-              <w:top w:w="40" w:type="dxa"/>
-              <w:left w:w="90" w:type="dxa"/>
-              <w:bottom w:w="40" w:type="dxa"/>
-              <w:right w:w="90" w:type="dxa"/>
-            </w:tcMar>
-          </w:tcPr>
-          <w:p/>
-        </w:tc>
-        <w:tc>
-          <w:tcPr>
-            <w:tcW w:w="3469" w:type="dxa"/>
-            <w:tcBorders>
-              <w:top w:val="single" w:sz="4" w:space="0" w:color="C9D3DC"/>
-              <w:left w:val="single" w:sz="4" w:space="0" w:color="C9D3DC"/>
-              <w:bottom w:val="single" w:sz="4" w:space="0" w:color="C9D3DC"/>
-              <w:right w:val="single" w:sz="4" w:space="0" w:color="C9D3DC"/>
-            </w:tcBorders>
-            <w:shd w:val="clear" w:color="auto" w:fill="FFFFFF"/>
-            <w:tcMar>
-              <w:top w:w="40" w:type="dxa"/>
-              <w:left w:w="90" w:type="dxa"/>
-              <w:bottom w:w="40" w:type="dxa"/>
-              <w:right w:w="90" w:type="dxa"/>
-            </w:tcMar>
-          </w:tcPr>
-          <w:p/>
-        </w:tc>
-        <w:tc>
-          <w:tcPr>
-            <w:tcW w:w="2122" w:type="dxa"/>
-            <w:tcBorders>
-              <w:top w:val="single" w:sz="4" w:space="0" w:color="C9D3DC"/>
-              <w:left w:val="single" w:sz="4" w:space="0" w:color="C9D3DC"/>
-              <w:bottom w:val="single" w:sz="4" w:space="0" w:color="C9D3DC"/>
-              <w:right w:val="single" w:sz="4" w:space="0" w:color="C9D3DC"/>
-            </w:tcBorders>
-            <w:shd w:val="clear" w:color="auto" w:fill="FFFFFF"/>
-            <w:tcMar>
-              <w:top w:w="40" w:type="dxa"/>
-              <w:left w:w="90" w:type="dxa"/>
-              <w:bottom w:w="40" w:type="dxa"/>
-              <w:right w:w="90" w:type="dxa"/>
-            </w:tcMar>
-          </w:tcPr>
-          <w:p/>
+            <w:r>
+              <w:rPr>
+                <w:cs/>
+              </w:rPr>
+              <w:t xml:space="preserve">ออกแบบจุดตรวจแล้ว </w:t>
+            </w:r>
+            <w:r>
+              <w:t xml:space="preserve">· </w:t>
+            </w:r>
+            <w:r>
+              <w:rPr>
+                <w:cs/>
+              </w:rPr>
+              <w:t>รายการ</w:t>
+            </w:r>
+            <w:proofErr w:type="spellStart"/>
+            <w:r>
+              <w:rPr>
+                <w:cs/>
+              </w:rPr>
+              <w:t>ฟิ</w:t>
+            </w:r>
+            <w:proofErr w:type="spellEnd"/>
+            <w:r>
+              <w:rPr>
+                <w:cs/>
+              </w:rPr>
+              <w:t xml:space="preserve">ลด์รอ </w:t>
+            </w:r>
+            <w:r>
+              <w:t>OQ-11</w:t>
+            </w:r>
+          </w:p>
         </w:tc>
       </w:tr>
     </w:tbl>
     <w:p>
       <w:pPr>
         <w:spacing w:after="120"/>
+        <w:rPr>
+          <w:rFonts w:hint="cs"/>
+        </w:rPr>
       </w:pPr>
     </w:p>
     <w:p>
@@ -17158,41 +17950,96 @@
                 <w:sz w:val="28"/>
                 <w:szCs w:val="28"/>
               </w:rPr>
-              <w:t>DEC-</w:t>
-            </w:r>
-            <w:proofErr w:type="gramStart"/>
+              <w:t>DEC</w:t>
+            </w:r>
             <w:r>
               <w:rPr>
                 <w:b/>
                 <w:bCs/>
-                <w:color w:val="FFFFFF"/>
-                <w:sz w:val="28"/>
-                <w:szCs w:val="28"/>
-              </w:rPr>
-              <w:t xml:space="preserve">   [</w:t>
-            </w:r>
-            <w:proofErr w:type="spellStart"/>
-            <w:proofErr w:type="gramEnd"/>
-            <w:r>
-              <w:rPr>
+                <w:color w:val="9FD6DD"/>
+                <w:sz w:val="28"/>
+                <w:szCs w:val="28"/>
+                <w:cs/>
+              </w:rPr>
+              <w:t>-</w:t>
+            </w:r>
+            <w:r>
+              <w:rPr>
+                <w:rFonts w:hint="cs"/>
                 <w:b/>
                 <w:bCs/>
-                <w:color w:val="FFFFFF"/>
-                <w:sz w:val="28"/>
-                <w:szCs w:val="28"/>
-              </w:rPr>
-              <w:t>ตัดสินใจเรื่องอะไร</w:t>
-            </w:r>
-            <w:proofErr w:type="spellEnd"/>
+                <w:color w:val="9FD6DD"/>
+                <w:sz w:val="28"/>
+                <w:szCs w:val="28"/>
+                <w:cs/>
+              </w:rPr>
+              <w:t>0</w:t>
+            </w:r>
             <w:r>
               <w:rPr>
                 <w:b/>
                 <w:bCs/>
-                <w:color w:val="FFFFFF"/>
-                <w:sz w:val="28"/>
-                <w:szCs w:val="28"/>
-              </w:rPr>
-              <w:t>]</w:t>
+                <w:color w:val="9FD6DD"/>
+                <w:sz w:val="28"/>
+                <w:szCs w:val="28"/>
+                <w:cs/>
+              </w:rPr>
+              <w:t>1</w:t>
+            </w:r>
+            <w:r>
+              <w:rPr>
+                <w:rFonts w:hint="cs"/>
+                <w:b/>
+                <w:bCs/>
+                <w:color w:val="9FD6DD"/>
+                <w:sz w:val="28"/>
+                <w:szCs w:val="28"/>
+                <w:cs/>
+              </w:rPr>
+              <w:t xml:space="preserve"> </w:t>
+            </w:r>
+            <w:r>
+              <w:rPr>
+                <w:b/>
+                <w:bCs/>
+                <w:color w:val="9FD6DD"/>
+                <w:sz w:val="28"/>
+                <w:szCs w:val="28"/>
+                <w:cs/>
+              </w:rPr>
+              <w:t xml:space="preserve">เพิ่ม </w:t>
+            </w:r>
+            <w:r>
+              <w:rPr>
+                <w:b/>
+                <w:bCs/>
+                <w:color w:val="9FD6DD"/>
+                <w:sz w:val="28"/>
+                <w:szCs w:val="28"/>
+              </w:rPr>
+              <w:t xml:space="preserve">Reminder Job </w:t>
+            </w:r>
+            <w:r>
+              <w:rPr>
+                <w:b/>
+                <w:bCs/>
+                <w:color w:val="9FD6DD"/>
+                <w:sz w:val="28"/>
+                <w:szCs w:val="28"/>
+                <w:cs/>
+              </w:rPr>
+              <w:t>สำหรับการเตือนงานค้าง</w:t>
+            </w:r>
+            <w:r>
+              <w:rPr>
+                <w:b/>
+                <w:bCs/>
+                <w:color w:val="9FD6DD"/>
+                <w:sz w:val="28"/>
+                <w:szCs w:val="28"/>
+                <w:cs/>
+              </w:rPr>
+              <w:t xml:space="preserve"> </w:t>
             </w:r>
             <w:r>
               <w:rPr>
@@ -17202,7 +18049,7 @@
                 <w:sz w:val="26"/>
                 <w:szCs w:val="26"/>
               </w:rPr>
-              <w:t xml:space="preserve">   [Proposed]</w:t>
+              <w:t>[Proposed]</w:t>
             </w:r>
           </w:p>
         </w:tc>
@@ -17269,6 +18116,48 @@
               <w:keepNext/>
               <w:keepLines/>
             </w:pPr>
+            <w:r>
+              <w:rPr>
+                <w:cs/>
+              </w:rPr>
+              <w:t xml:space="preserve">เสนอเพิ่ม </w:t>
+            </w:r>
+            <w:r>
+              <w:t xml:space="preserve">Reminder Job </w:t>
+            </w:r>
+            <w:r>
+              <w:rPr>
+                <w:cs/>
+              </w:rPr>
+              <w:t xml:space="preserve">เป็น </w:t>
+            </w:r>
+            <w:r>
+              <w:t xml:space="preserve">container </w:t>
+            </w:r>
+            <w:r>
+              <w:rPr>
+                <w:cs/>
+              </w:rPr>
+              <w:t xml:space="preserve">งานตามเวลา ให้เรียก </w:t>
+            </w:r>
+            <w:r>
+              <w:t xml:space="preserve">CLMRS API </w:t>
+            </w:r>
+            <w:r>
+              <w:rPr>
+                <w:cs/>
+              </w:rPr>
+              <w:t xml:space="preserve">เพื่อตรวจงานค้างและสร้างการเตือน โดย </w:t>
+            </w:r>
+            <w:r>
+              <w:t xml:space="preserve">API </w:t>
+            </w:r>
+            <w:r>
+              <w:rPr>
+                <w:cs/>
+              </w:rPr>
+              <w:t>เป็นจุดตรวจสิทธิ์และกติกา</w:t>
+            </w:r>
           </w:p>
         </w:tc>
       </w:tr>
@@ -17344,6 +18233,42 @@
               <w:keepNext/>
               <w:keepLines/>
             </w:pPr>
+            <w:r>
+              <w:t xml:space="preserve">FR-CLMRS-10 </w:t>
+            </w:r>
+            <w:r>
+              <w:rPr>
+                <w:cs/>
+              </w:rPr>
+              <w:t xml:space="preserve">และ </w:t>
+            </w:r>
+            <w:r>
+              <w:t xml:space="preserve">driver D3 </w:t>
+            </w:r>
+            <w:r>
+              <w:rPr>
+                <w:cs/>
+              </w:rPr>
+              <w:t xml:space="preserve">ต้องให้ระบบเริ่มทำงานตามเวลาโดยไม่มีคนกด ส่วน </w:t>
+            </w:r>
+            <w:r>
+              <w:t xml:space="preserve">NFR-CLMRS-01 </w:t>
+            </w:r>
+            <w:r>
+              <w:rPr>
+                <w:cs/>
+              </w:rPr>
+              <w:t xml:space="preserve">และ </w:t>
+            </w:r>
+            <w:r>
+              <w:t xml:space="preserve">BR-05 </w:t>
+            </w:r>
+            <w:r>
+              <w:rPr>
+                <w:cs/>
+              </w:rPr>
+              <w:t>กำหนดให้การแจ้งเตือนต้องไม่เปิดเผยงานแก่ผู้ไม่มีสิทธิ์</w:t>
+            </w:r>
           </w:p>
         </w:tc>
       </w:tr>
@@ -17409,6 +18334,30 @@
               <w:keepNext/>
               <w:keepLines/>
             </w:pPr>
+            <w:r>
+              <w:rPr>
+                <w:cs/>
+              </w:rPr>
+              <w:t xml:space="preserve">ให้ </w:t>
+            </w:r>
+            <w:r>
+              <w:t xml:space="preserve">Web App </w:t>
+            </w:r>
+            <w:r>
+              <w:rPr>
+                <w:cs/>
+              </w:rPr>
+              <w:t>ตรวจงานค้างเมื่อผู้ใช้เปิดหน้าเว็บ เพราะไม่ทำงานเมื่อไม่มีผู้เปิดเว็บ</w:t>
+            </w:r>
+            <w:r>
+              <w:t xml:space="preserve">; </w:t>
+            </w:r>
+            <w:r>
+              <w:rPr>
+                <w:cs/>
+              </w:rPr>
+              <w:t>ให้เจ้าหน้าที่กดส่งเตือนเอง เพราะไม่เป็นการเตือนอัตโนมัติตามข้อกำหนด</w:t>
+            </w:r>
           </w:p>
         </w:tc>
       </w:tr>
@@ -17472,6 +18421,42 @@
             <w:pPr>
               <w:keepLines/>
             </w:pPr>
+            <w:r>
+              <w:rPr>
+                <w:cs/>
+              </w:rPr>
+              <w:t xml:space="preserve">ต้องดูแลการรันและตรวจสอบผลของ </w:t>
+            </w:r>
+            <w:r>
+              <w:t xml:space="preserve">Reminder Job </w:t>
+            </w:r>
+            <w:r>
+              <w:rPr>
+                <w:cs/>
+              </w:rPr>
+              <w:t xml:space="preserve">เพิ่มขึ้น รอบตรวจและระยะเวลายังเป็น </w:t>
+            </w:r>
+            <w:r>
+              <w:t xml:space="preserve">TBD (OQ-09) </w:t>
+            </w:r>
+            <w:r>
+              <w:rPr>
+                <w:cs/>
+              </w:rPr>
+              <w:t xml:space="preserve">ผู้รับรอ </w:t>
+            </w:r>
+            <w:r>
+              <w:t xml:space="preserve">OQ-12 </w:t>
+            </w:r>
+            <w:r>
+              <w:rPr>
+                <w:cs/>
+              </w:rPr>
+              <w:t xml:space="preserve">ระหว่างรอยังไม่เปิดการเตือนจริง และใช้คิวงานเดิมตาม </w:t>
+            </w:r>
+            <w:r>
+              <w:t>DD-03</w:t>
+            </w:r>
           </w:p>
         </w:tc>
       </w:tr>
@@ -17538,41 +18523,48 @@
                 <w:szCs w:val="28"/>
               </w:rPr>
               <w:lastRenderedPageBreak/>
-              <w:t>DEC-</w:t>
-            </w:r>
-            <w:proofErr w:type="gramStart"/>
+              <w:t>DEC</w:t>
+            </w:r>
             <w:r>
               <w:rPr>
                 <w:b/>
                 <w:bCs/>
-                <w:color w:val="FFFFFF"/>
-                <w:sz w:val="28"/>
-                <w:szCs w:val="28"/>
-              </w:rPr>
-              <w:t xml:space="preserve">   [</w:t>
-            </w:r>
-            <w:proofErr w:type="spellStart"/>
-            <w:proofErr w:type="gramEnd"/>
+                <w:color w:val="9FD6DD"/>
+                <w:sz w:val="28"/>
+                <w:szCs w:val="28"/>
+              </w:rPr>
+              <w:t xml:space="preserve">-02 </w:t>
+            </w:r>
             <w:r>
               <w:rPr>
                 <w:b/>
                 <w:bCs/>
-                <w:color w:val="FFFFFF"/>
-                <w:sz w:val="28"/>
-                <w:szCs w:val="28"/>
-              </w:rPr>
-              <w:t>ตัดสินใจเรื่องอะไร</w:t>
-            </w:r>
-            <w:proofErr w:type="spellEnd"/>
+                <w:color w:val="9FD6DD"/>
+                <w:sz w:val="28"/>
+                <w:szCs w:val="28"/>
+                <w:cs/>
+              </w:rPr>
+              <w:t xml:space="preserve">รวมจุดตรวจสิทธิ์และข้อมูลแจ้งเตือนไว้ที่ </w:t>
+            </w:r>
             <w:r>
               <w:rPr>
                 <w:b/>
                 <w:bCs/>
-                <w:color w:val="FFFFFF"/>
-                <w:sz w:val="28"/>
-                <w:szCs w:val="28"/>
-              </w:rPr>
-              <w:t>]</w:t>
+                <w:color w:val="9FD6DD"/>
+                <w:sz w:val="28"/>
+                <w:szCs w:val="28"/>
+              </w:rPr>
+              <w:t>API</w:t>
+            </w:r>
+            <w:r>
+              <w:rPr>
+                <w:b/>
+                <w:bCs/>
+                <w:color w:val="9FD6DD"/>
+                <w:sz w:val="28"/>
+                <w:szCs w:val="28"/>
+              </w:rPr>
+              <w:t xml:space="preserve"> </w:t>
             </w:r>
             <w:r>
               <w:rPr>
@@ -17582,7 +18574,7 @@
                 <w:sz w:val="26"/>
                 <w:szCs w:val="26"/>
               </w:rPr>
-              <w:t xml:space="preserve">   [Proposed]</w:t>
+              <w:t>[Proposed]</w:t>
             </w:r>
           </w:p>
         </w:tc>
@@ -17649,6 +18641,44 @@
               <w:keepNext/>
               <w:keepLines/>
             </w:pPr>
+            <w:r>
+              <w:rPr>
+                <w:cs/>
+              </w:rPr>
+              <w:t xml:space="preserve">ให้ </w:t>
+            </w:r>
+            <w:r>
+              <w:t xml:space="preserve">CLMRS API </w:t>
+            </w:r>
+            <w:r>
+              <w:rPr>
+                <w:cs/>
+              </w:rPr>
+              <w:t xml:space="preserve">ตรวจสิทธิ์ผู้รับและจำกัดข้อมูลทุกครั้งก่อนสร้างแจ้งเตือน โดยสร้างแจ้งเตือนสถานะหลังบันทึก </w:t>
+            </w:r>
+            <w:proofErr w:type="spellStart"/>
+            <w:r>
+              <w:t>TicketStatusLog</w:t>
+            </w:r>
+            <w:proofErr w:type="spellEnd"/>
+            <w:r>
+              <w:t xml:space="preserve"> </w:t>
+            </w:r>
+            <w:r>
+              <w:rPr>
+                <w:cs/>
+              </w:rPr>
+              <w:t xml:space="preserve">สำเร็จ ส่วนการส่งภายนอกต้องตรวจ </w:t>
+            </w:r>
+            <w:r>
+              <w:t xml:space="preserve">opt-in </w:t>
+            </w:r>
+            <w:r>
+              <w:rPr>
+                <w:cs/>
+              </w:rPr>
+              <w:t>เมื่อเปิดใช้ในอนาคต</w:t>
+            </w:r>
           </w:p>
         </w:tc>
       </w:tr>
@@ -17724,6 +18754,39 @@
               <w:keepNext/>
               <w:keepLines/>
             </w:pPr>
+            <w:r>
+              <w:rPr>
+                <w:cs/>
+              </w:rPr>
+              <w:t xml:space="preserve">รองรับ </w:t>
+            </w:r>
+            <w:r>
+              <w:t xml:space="preserve">driver D1 </w:t>
+            </w:r>
+            <w:r>
+              <w:rPr>
+                <w:cs/>
+              </w:rPr>
+              <w:t xml:space="preserve">และ </w:t>
+            </w:r>
+            <w:r>
+              <w:t xml:space="preserve">D2, NFR-CLMRS-01, NFR-CLMRS-05, BR-05, BR-09, BR-10 </w:t>
+            </w:r>
+            <w:r>
+              <w:rPr>
+                <w:cs/>
+              </w:rPr>
+              <w:t xml:space="preserve">และ </w:t>
+            </w:r>
+            <w:r>
+              <w:t xml:space="preserve">DR-03 </w:t>
+            </w:r>
+            <w:r>
+              <w:rPr>
+                <w:cs/>
+              </w:rPr>
+              <w:t>ป้องกันส่งผิดคน ข้อมูลเกินจำเป็น หรือแจ้งสถานะที่ยังบันทึกไม่สำเร็จ</w:t>
+            </w:r>
           </w:p>
         </w:tc>
       </w:tr>
@@ -17789,6 +18852,51 @@
               <w:keepNext/>
               <w:keepLines/>
             </w:pPr>
+            <w:r>
+              <w:rPr>
+                <w:cs/>
+              </w:rPr>
+              <w:t xml:space="preserve">ตรวจเฉพาะใน </w:t>
+            </w:r>
+            <w:r>
+              <w:t xml:space="preserve">Web App </w:t>
+            </w:r>
+            <w:r>
+              <w:rPr>
+                <w:cs/>
+              </w:rPr>
+              <w:t xml:space="preserve">เพราะ </w:t>
+            </w:r>
+            <w:r>
+              <w:t xml:space="preserve">Reminder Job </w:t>
+            </w:r>
+            <w:r>
+              <w:rPr>
+                <w:cs/>
+              </w:rPr>
+              <w:t>ไม่ผ่านหน้าจอ</w:t>
+            </w:r>
+            <w:r>
+              <w:t xml:space="preserve">; </w:t>
+            </w:r>
+            <w:r>
+              <w:rPr>
+                <w:cs/>
+              </w:rPr>
+              <w:t xml:space="preserve">แยกกติกาไปตรวจซ้ำใน </w:t>
+            </w:r>
+            <w:r>
+              <w:t xml:space="preserve">Reminder Job </w:t>
+            </w:r>
+            <w:r>
+              <w:rPr>
+                <w:cs/>
+              </w:rPr>
+              <w:t xml:space="preserve">เพราะเสี่ยงใช้กติกาไม่ตรงกับ </w:t>
+            </w:r>
+            <w:r>
+              <w:t>API</w:t>
+            </w:r>
           </w:p>
         </w:tc>
       </w:tr>
@@ -17852,6 +18960,59 @@
             <w:pPr>
               <w:keepLines/>
             </w:pPr>
+            <w:r>
+              <w:t xml:space="preserve">Web App </w:t>
+            </w:r>
+            <w:r>
+              <w:rPr>
+                <w:cs/>
+              </w:rPr>
+              <w:t xml:space="preserve">และ </w:t>
+            </w:r>
+            <w:r>
+              <w:t xml:space="preserve">Reminder Job </w:t>
+            </w:r>
+            <w:r>
+              <w:rPr>
+                <w:cs/>
+              </w:rPr>
+              <w:t xml:space="preserve">ใช้กติกาจาก </w:t>
+            </w:r>
+            <w:r>
+              <w:t xml:space="preserve">API </w:t>
+            </w:r>
+            <w:r>
+              <w:rPr>
+                <w:cs/>
+              </w:rPr>
+              <w:t>ร่วมกัน ต้องตรวจสอบทั้งเส้นทางเปลี่ยนสถานะและเตือนตามเวลา รายละเอียด</w:t>
+            </w:r>
+            <w:proofErr w:type="spellStart"/>
+            <w:r>
+              <w:rPr>
+                <w:cs/>
+              </w:rPr>
+              <w:t>ฟิ</w:t>
+            </w:r>
+            <w:proofErr w:type="spellEnd"/>
+            <w:r>
+              <w:rPr>
+                <w:cs/>
+              </w:rPr>
+              <w:t xml:space="preserve">ลด์รอ </w:t>
+            </w:r>
+            <w:r>
+              <w:t xml:space="preserve">OQ-11 </w:t>
+            </w:r>
+            <w:r>
+              <w:rPr>
+                <w:cs/>
+              </w:rPr>
+              <w:t xml:space="preserve">และการส่งภายนอกรอ </w:t>
+            </w:r>
+            <w:r>
+              <w:t>OQ-10</w:t>
+            </w:r>
           </w:p>
         </w:tc>
       </w:tr>
@@ -17930,8 +19091,8 @@
       </w:tblPr>
       <w:tblGrid>
         <w:gridCol w:w="2505"/>
-        <w:gridCol w:w="4433"/>
-        <w:gridCol w:w="2700"/>
+        <w:gridCol w:w="3340"/>
+        <w:gridCol w:w="3793"/>
       </w:tblGrid>
       <w:tr>
         <w:trPr>
@@ -17976,7 +19137,7 @@
         </w:tc>
         <w:tc>
           <w:tcPr>
-            <w:tcW w:w="4433" w:type="dxa"/>
+            <w:tcW w:w="3340" w:type="dxa"/>
             <w:tcBorders>
               <w:top w:val="single" w:sz="4" w:space="0" w:color="173B65"/>
               <w:left w:val="single" w:sz="4" w:space="0" w:color="173B65"/>
@@ -18022,7 +19183,7 @@
         </w:tc>
         <w:tc>
           <w:tcPr>
-            <w:tcW w:w="2700" w:type="dxa"/>
+            <w:tcW w:w="3793" w:type="dxa"/>
             <w:tcBorders>
               <w:top w:val="single" w:sz="4" w:space="0" w:color="173B65"/>
               <w:left w:val="single" w:sz="4" w:space="0" w:color="173B65"/>
@@ -18083,11 +19244,23 @@
             <w:pPr>
               <w:keepNext/>
             </w:pPr>
-          </w:p>
-        </w:tc>
-        <w:tc>
-          <w:tcPr>
-            <w:tcW w:w="4433" w:type="dxa"/>
+            <w:r>
+              <w:t xml:space="preserve">S1 </w:t>
+            </w:r>
+            <w:r>
+              <w:rPr>
+                <w:cs/>
+              </w:rPr>
+              <w:t xml:space="preserve">เปลี่ยนสถานะและแจ้งในระบบ — </w:t>
+            </w:r>
+            <w:r>
+              <w:t>Build now</w:t>
+            </w:r>
+          </w:p>
+        </w:tc>
+        <w:tc>
+          <w:tcPr>
+            <w:tcW w:w="3340" w:type="dxa"/>
             <w:tcBorders>
               <w:top w:val="single" w:sz="4" w:space="0" w:color="C9D3DC"/>
               <w:left w:val="single" w:sz="4" w:space="0" w:color="C9D3DC"/>
@@ -18106,11 +19279,42 @@
             <w:pPr>
               <w:keepNext/>
             </w:pPr>
-          </w:p>
-        </w:tc>
-        <w:tc>
-          <w:tcPr>
-            <w:tcW w:w="2700" w:type="dxa"/>
+            <w:r>
+              <w:t xml:space="preserve">CLMRS Web App </w:t>
+            </w:r>
+            <w:r>
+              <w:rPr>
+                <w:rFonts w:ascii="Arial" w:hAnsi="Arial" w:cs="Arial"/>
+              </w:rPr>
+              <w:t>→</w:t>
+            </w:r>
+            <w:r>
+              <w:t xml:space="preserve"> CLMRS API </w:t>
+            </w:r>
+            <w:r>
+              <w:rPr>
+                <w:rFonts w:ascii="Arial" w:hAnsi="Arial" w:cs="Arial"/>
+              </w:rPr>
+              <w:t>→</w:t>
+            </w:r>
+            <w:r>
+              <w:t xml:space="preserve"> CLMRS Database; CLMRS Web App </w:t>
+            </w:r>
+            <w:r>
+              <w:rPr>
+                <w:rFonts w:cs="Angsana New"/>
+                <w:cs/>
+              </w:rPr>
+              <w:t xml:space="preserve">รับข้อมูลแจ้งเตือนผ่าน </w:t>
+            </w:r>
+            <w:r>
+              <w:t>CLMRS API</w:t>
+            </w:r>
+          </w:p>
+        </w:tc>
+        <w:tc>
+          <w:tcPr>
+            <w:tcW w:w="3793" w:type="dxa"/>
             <w:tcBorders>
               <w:top w:val="single" w:sz="4" w:space="0" w:color="C9D3DC"/>
               <w:left w:val="single" w:sz="4" w:space="0" w:color="C9D3DC"/>
@@ -18129,6 +19333,50 @@
             <w:pPr>
               <w:keepNext/>
             </w:pPr>
+            <w:r>
+              <w:t xml:space="preserve">API </w:t>
+            </w:r>
+            <w:r>
+              <w:rPr>
+                <w:cs/>
+              </w:rPr>
+              <w:t xml:space="preserve">ตรวจสิทธิ์และกติกาสถานะ เช่น </w:t>
+            </w:r>
+            <w:r>
+              <w:t xml:space="preserve">BR-07 </w:t>
+            </w:r>
+            <w:r>
+              <w:rPr>
+                <w:cs/>
+              </w:rPr>
+              <w:t xml:space="preserve">กรณีปิดงาน แล้วสร้างแจ้งเตือนหลังบันทึก </w:t>
+            </w:r>
+            <w:proofErr w:type="spellStart"/>
+            <w:r>
+              <w:t>TicketStatusLog</w:t>
+            </w:r>
+            <w:proofErr w:type="spellEnd"/>
+            <w:r>
+              <w:t xml:space="preserve"> </w:t>
+            </w:r>
+            <w:r>
+              <w:rPr>
+                <w:cs/>
+              </w:rPr>
+              <w:t xml:space="preserve">สำเร็จ ตรวจผู้รับตาม </w:t>
+            </w:r>
+            <w:r>
+              <w:t xml:space="preserve">BR-05 </w:t>
+            </w:r>
+            <w:r>
+              <w:rPr>
+                <w:cs/>
+              </w:rPr>
+              <w:t xml:space="preserve">และจำกัดข้อความตาม </w:t>
+            </w:r>
+            <w:r>
+              <w:t>BR-10</w:t>
+            </w:r>
           </w:p>
         </w:tc>
       </w:tr>
@@ -18154,11 +19402,30 @@
               <w:right w:w="90" w:type="dxa"/>
             </w:tcMar>
           </w:tcPr>
-          <w:p/>
-        </w:tc>
-        <w:tc>
-          <w:tcPr>
-            <w:tcW w:w="4433" w:type="dxa"/>
+          <w:p>
+            <w:r>
+              <w:t xml:space="preserve">S2 </w:t>
+            </w:r>
+            <w:r>
+              <w:rPr>
+                <w:cs/>
+              </w:rPr>
+              <w:t xml:space="preserve">เตือนงานค้าง — </w:t>
+            </w:r>
+            <w:r>
+              <w:t xml:space="preserve">Build now </w:t>
+            </w:r>
+            <w:r>
+              <w:rPr>
+                <w:cs/>
+              </w:rPr>
+              <w:t>เฉพาะกลไก</w:t>
+            </w:r>
+          </w:p>
+        </w:tc>
+        <w:tc>
+          <w:tcPr>
+            <w:tcW w:w="3340" w:type="dxa"/>
             <w:tcBorders>
               <w:top w:val="single" w:sz="4" w:space="0" w:color="C9D3DC"/>
               <w:left w:val="single" w:sz="4" w:space="0" w:color="C9D3DC"/>
@@ -18173,11 +19440,43 @@
               <w:right w:w="90" w:type="dxa"/>
             </w:tcMar>
           </w:tcPr>
-          <w:p/>
-        </w:tc>
-        <w:tc>
-          <w:tcPr>
-            <w:tcW w:w="2700" w:type="dxa"/>
+          <w:p>
+            <w:r>
+              <w:t xml:space="preserve">Reminder Job </w:t>
+            </w:r>
+            <w:r>
+              <w:rPr>
+                <w:rFonts w:ascii="Arial" w:hAnsi="Arial" w:cs="Arial"/>
+              </w:rPr>
+              <w:t>→</w:t>
+            </w:r>
+            <w:r>
+              <w:t xml:space="preserve"> CLMRS API </w:t>
+            </w:r>
+            <w:r>
+              <w:rPr>
+                <w:rFonts w:ascii="Arial" w:hAnsi="Arial" w:cs="Arial"/>
+              </w:rPr>
+              <w:t>→</w:t>
+            </w:r>
+            <w:r>
+              <w:t xml:space="preserve"> CLMRS Database; CLMRS Web App </w:t>
+            </w:r>
+            <w:r>
+              <w:rPr>
+                <w:rFonts w:cs="Angsana New"/>
+                <w:cs/>
+              </w:rPr>
+              <w:t xml:space="preserve">รับข้อมูลแจ้งเตือนผ่าน </w:t>
+            </w:r>
+            <w:r>
+              <w:t>CLMRS API</w:t>
+            </w:r>
+          </w:p>
+        </w:tc>
+        <w:tc>
+          <w:tcPr>
+            <w:tcW w:w="3793" w:type="dxa"/>
             <w:tcBorders>
               <w:top w:val="single" w:sz="4" w:space="0" w:color="C9D3DC"/>
               <w:left w:val="single" w:sz="4" w:space="0" w:color="C9D3DC"/>
@@ -18192,7 +19491,293 @@
               <w:right w:w="90" w:type="dxa"/>
             </w:tcMar>
           </w:tcPr>
-          <w:p/>
+          <w:p>
+            <w:r>
+              <w:t xml:space="preserve">API </w:t>
+            </w:r>
+            <w:r>
+              <w:rPr>
+                <w:cs/>
+              </w:rPr>
+              <w:t xml:space="preserve">ตรวจเกณฑ์เวลาและผู้รับก่อนสร้างการเตือน ระยะเวลา/รอบตรวจรอ </w:t>
+            </w:r>
+            <w:r>
+              <w:t xml:space="preserve">OQ-09 </w:t>
+            </w:r>
+            <w:r>
+              <w:rPr>
+                <w:cs/>
+              </w:rPr>
+              <w:t xml:space="preserve">และผู้รับรอ </w:t>
+            </w:r>
+            <w:r>
+              <w:t xml:space="preserve">OQ-12 </w:t>
+            </w:r>
+            <w:r>
+              <w:rPr>
+                <w:cs/>
+              </w:rPr>
+              <w:t xml:space="preserve">ระหว่างรอยังไม่เปิดการเตือนตาม </w:t>
+            </w:r>
+            <w:r>
+              <w:t>DD-03</w:t>
+            </w:r>
+          </w:p>
+        </w:tc>
+      </w:tr>
+      <w:tr>
+        <w:trPr>
+          <w:cantSplit/>
+          <w:trHeight w:val="737"/>
+        </w:trPr>
+        <w:tc>
+          <w:tcPr>
+            <w:tcW w:w="2505" w:type="dxa"/>
+            <w:tcBorders>
+              <w:top w:val="single" w:sz="4" w:space="0" w:color="C9D3DC"/>
+              <w:left w:val="single" w:sz="4" w:space="0" w:color="C9D3DC"/>
+              <w:bottom w:val="single" w:sz="4" w:space="0" w:color="C9D3DC"/>
+              <w:right w:val="single" w:sz="4" w:space="0" w:color="C9D3DC"/>
+            </w:tcBorders>
+            <w:shd w:val="clear" w:color="auto" w:fill="F1F7FA"/>
+            <w:tcMar>
+              <w:top w:w="40" w:type="dxa"/>
+              <w:left w:w="90" w:type="dxa"/>
+              <w:bottom w:w="40" w:type="dxa"/>
+              <w:right w:w="90" w:type="dxa"/>
+            </w:tcMar>
+          </w:tcPr>
+          <w:p>
+            <w:r>
+              <w:t xml:space="preserve">S3 </w:t>
+            </w:r>
+            <w:r>
+              <w:rPr>
+                <w:cs/>
+              </w:rPr>
+              <w:t>ส่งแจ้งเตือนภายนอก — ไม่ทำในวิชานี้ รอคำตอบ</w:t>
+            </w:r>
+          </w:p>
+        </w:tc>
+        <w:tc>
+          <w:tcPr>
+            <w:tcW w:w="3340" w:type="dxa"/>
+            <w:tcBorders>
+              <w:top w:val="single" w:sz="4" w:space="0" w:color="C9D3DC"/>
+              <w:left w:val="single" w:sz="4" w:space="0" w:color="C9D3DC"/>
+              <w:bottom w:val="single" w:sz="4" w:space="0" w:color="C9D3DC"/>
+              <w:right w:val="single" w:sz="4" w:space="0" w:color="C9D3DC"/>
+            </w:tcBorders>
+            <w:shd w:val="clear" w:color="auto" w:fill="F1F7FA"/>
+            <w:tcMar>
+              <w:top w:w="40" w:type="dxa"/>
+              <w:left w:w="90" w:type="dxa"/>
+              <w:bottom w:w="40" w:type="dxa"/>
+              <w:right w:w="90" w:type="dxa"/>
+            </w:tcMar>
+          </w:tcPr>
+          <w:p>
+            <w:r>
+              <w:t xml:space="preserve">CLMRS API </w:t>
+            </w:r>
+            <w:r>
+              <w:rPr>
+                <w:rFonts w:ascii="Arial" w:hAnsi="Arial" w:cs="Arial"/>
+              </w:rPr>
+              <w:t>→</w:t>
+            </w:r>
+            <w:r>
+              <w:t xml:space="preserve"> Notification Gateway (TBD)</w:t>
+            </w:r>
+          </w:p>
+        </w:tc>
+        <w:tc>
+          <w:tcPr>
+            <w:tcW w:w="3793" w:type="dxa"/>
+            <w:tcBorders>
+              <w:top w:val="single" w:sz="4" w:space="0" w:color="C9D3DC"/>
+              <w:left w:val="single" w:sz="4" w:space="0" w:color="C9D3DC"/>
+              <w:bottom w:val="single" w:sz="4" w:space="0" w:color="C9D3DC"/>
+              <w:right w:val="single" w:sz="4" w:space="0" w:color="C9D3DC"/>
+            </w:tcBorders>
+            <w:shd w:val="clear" w:color="auto" w:fill="F1F7FA"/>
+            <w:tcMar>
+              <w:top w:w="40" w:type="dxa"/>
+              <w:left w:w="90" w:type="dxa"/>
+              <w:bottom w:w="40" w:type="dxa"/>
+              <w:right w:w="90" w:type="dxa"/>
+            </w:tcMar>
+          </w:tcPr>
+          <w:p>
+            <w:r>
+              <w:rPr>
+                <w:cs/>
+              </w:rPr>
+              <w:t xml:space="preserve">เมื่อเปิดใช้ </w:t>
+            </w:r>
+            <w:r>
+              <w:t xml:space="preserve">API </w:t>
+            </w:r>
+            <w:r>
+              <w:rPr>
+                <w:cs/>
+              </w:rPr>
+              <w:t xml:space="preserve">ต้องตรวจ </w:t>
+            </w:r>
+            <w:r>
+              <w:t xml:space="preserve">opt-in </w:t>
+            </w:r>
+            <w:r>
+              <w:rPr>
+                <w:cs/>
+              </w:rPr>
+              <w:t xml:space="preserve">ตาม </w:t>
+            </w:r>
+            <w:r>
+              <w:t xml:space="preserve">BR-09 </w:t>
+            </w:r>
+            <w:r>
+              <w:rPr>
+                <w:cs/>
+              </w:rPr>
+              <w:t xml:space="preserve">และจำกัดข้อมูลตาม </w:t>
+            </w:r>
+            <w:r>
+              <w:t xml:space="preserve">BR-10/NFR-CLMRS-05 </w:t>
+            </w:r>
+            <w:r>
+              <w:rPr>
+                <w:cs/>
+              </w:rPr>
+              <w:t xml:space="preserve">ปัจจุบันยังไม่ส่งจริง รอ </w:t>
+            </w:r>
+            <w:r>
+              <w:t>OQ-10</w:t>
+            </w:r>
+          </w:p>
+        </w:tc>
+      </w:tr>
+      <w:tr>
+        <w:trPr>
+          <w:cantSplit/>
+          <w:trHeight w:val="737"/>
+        </w:trPr>
+        <w:tc>
+          <w:tcPr>
+            <w:tcW w:w="2505" w:type="dxa"/>
+            <w:tcBorders>
+              <w:top w:val="single" w:sz="4" w:space="0" w:color="C9D3DC"/>
+              <w:left w:val="single" w:sz="4" w:space="0" w:color="C9D3DC"/>
+              <w:bottom w:val="single" w:sz="4" w:space="0" w:color="C9D3DC"/>
+              <w:right w:val="single" w:sz="4" w:space="0" w:color="C9D3DC"/>
+            </w:tcBorders>
+            <w:shd w:val="clear" w:color="auto" w:fill="F1F7FA"/>
+            <w:tcMar>
+              <w:top w:w="40" w:type="dxa"/>
+              <w:left w:w="90" w:type="dxa"/>
+              <w:bottom w:w="40" w:type="dxa"/>
+              <w:right w:w="90" w:type="dxa"/>
+            </w:tcMar>
+          </w:tcPr>
+          <w:p>
+            <w:r>
+              <w:t xml:space="preserve">S4 </w:t>
+            </w:r>
+            <w:r>
+              <w:rPr>
+                <w:cs/>
+              </w:rPr>
+              <w:t xml:space="preserve">ตั้งค่า </w:t>
+            </w:r>
+            <w:r>
+              <w:t>opt-in — Overview</w:t>
+            </w:r>
+          </w:p>
+        </w:tc>
+        <w:tc>
+          <w:tcPr>
+            <w:tcW w:w="3340" w:type="dxa"/>
+            <w:tcBorders>
+              <w:top w:val="single" w:sz="4" w:space="0" w:color="C9D3DC"/>
+              <w:left w:val="single" w:sz="4" w:space="0" w:color="C9D3DC"/>
+              <w:bottom w:val="single" w:sz="4" w:space="0" w:color="C9D3DC"/>
+              <w:right w:val="single" w:sz="4" w:space="0" w:color="C9D3DC"/>
+            </w:tcBorders>
+            <w:shd w:val="clear" w:color="auto" w:fill="F1F7FA"/>
+            <w:tcMar>
+              <w:top w:w="40" w:type="dxa"/>
+              <w:left w:w="90" w:type="dxa"/>
+              <w:bottom w:w="40" w:type="dxa"/>
+              <w:right w:w="90" w:type="dxa"/>
+            </w:tcMar>
+          </w:tcPr>
+          <w:p>
+            <w:r>
+              <w:t xml:space="preserve">CLMRS Web App </w:t>
+            </w:r>
+            <w:r>
+              <w:rPr>
+                <w:rFonts w:ascii="Arial" w:hAnsi="Arial" w:cs="Arial"/>
+              </w:rPr>
+              <w:t>→</w:t>
+            </w:r>
+            <w:r>
+              <w:t xml:space="preserve"> CLMRS API </w:t>
+            </w:r>
+            <w:r>
+              <w:rPr>
+                <w:rFonts w:ascii="Arial" w:hAnsi="Arial" w:cs="Arial"/>
+              </w:rPr>
+              <w:t>→</w:t>
+            </w:r>
+            <w:r>
+              <w:t xml:space="preserve"> CLMRS Database (DR-09)</w:t>
+            </w:r>
+          </w:p>
+        </w:tc>
+        <w:tc>
+          <w:tcPr>
+            <w:tcW w:w="3793" w:type="dxa"/>
+            <w:tcBorders>
+              <w:top w:val="single" w:sz="4" w:space="0" w:color="C9D3DC"/>
+              <w:left w:val="single" w:sz="4" w:space="0" w:color="C9D3DC"/>
+              <w:bottom w:val="single" w:sz="4" w:space="0" w:color="C9D3DC"/>
+              <w:right w:val="single" w:sz="4" w:space="0" w:color="C9D3DC"/>
+            </w:tcBorders>
+            <w:shd w:val="clear" w:color="auto" w:fill="F1F7FA"/>
+            <w:tcMar>
+              <w:top w:w="40" w:type="dxa"/>
+              <w:left w:w="90" w:type="dxa"/>
+              <w:bottom w:w="40" w:type="dxa"/>
+              <w:right w:w="90" w:type="dxa"/>
+            </w:tcMar>
+          </w:tcPr>
+          <w:p>
+            <w:r>
+              <w:rPr>
+                <w:cs/>
+              </w:rPr>
+              <w:t xml:space="preserve">วางแนวทางให้ </w:t>
+            </w:r>
+            <w:r>
+              <w:t xml:space="preserve">API </w:t>
+            </w:r>
+            <w:r>
+              <w:rPr>
+                <w:cs/>
+              </w:rPr>
+              <w:t xml:space="preserve">ตรวจตัวตนและอนุญาตให้แก้เฉพาะการตั้งค่าของตน ช่องทางและรายละเอียดรอ </w:t>
+            </w:r>
+            <w:r>
+              <w:t xml:space="preserve">OQ-10 </w:t>
+            </w:r>
+            <w:r>
+              <w:rPr>
+                <w:cs/>
+              </w:rPr>
+              <w:t>ยังไม่รวมการทำหน้าตั้งค่าในรุ่นแรก</w:t>
+            </w:r>
+          </w:p>
         </w:tc>
       </w:tr>
     </w:tbl>
@@ -18227,7 +19812,7 @@
         <w:tblLook w:val="0000" w:firstRow="0" w:lastRow="0" w:firstColumn="0" w:lastColumn="0" w:noHBand="0" w:noVBand="0"/>
       </w:tblPr>
       <w:tblGrid>
-        <w:gridCol w:w="15318"/>
+        <w:gridCol w:w="15370"/>
       </w:tblGrid>
       <w:tr>
         <w:trPr>
@@ -18255,107 +19840,53 @@
             <w:pPr>
               <w:jc w:val="center"/>
             </w:pPr>
-            <w:proofErr w:type="spellStart"/>
-            <w:r>
-              <w:rPr>
-                <w:i/>
-                <w:iCs/>
-                <w:color w:val="8A99A8"/>
-                <w:sz w:val="28"/>
-                <w:szCs w:val="28"/>
+            <w:r>
+              <w:rPr>
+                <w:noProof/>
               </w:rPr>
               <w:lastRenderedPageBreak/>
-              <w:t>วางภาพ</w:t>
-            </w:r>
-            <w:proofErr w:type="spellEnd"/>
-            <w:r>
-              <w:rPr>
-                <w:i/>
-                <w:iCs/>
-                <w:color w:val="8A99A8"/>
-                <w:sz w:val="28"/>
-                <w:szCs w:val="28"/>
-              </w:rPr>
-              <w:t xml:space="preserve"> Context diagram </w:t>
-            </w:r>
-            <w:proofErr w:type="spellStart"/>
-            <w:r>
-              <w:rPr>
-                <w:i/>
-                <w:iCs/>
-                <w:color w:val="8A99A8"/>
-                <w:sz w:val="28"/>
-                <w:szCs w:val="28"/>
-              </w:rPr>
-              <w:t>ที่</w:t>
-            </w:r>
-            <w:proofErr w:type="spellEnd"/>
-            <w:r>
-              <w:rPr>
-                <w:i/>
-                <w:iCs/>
-                <w:color w:val="8A99A8"/>
-                <w:sz w:val="28"/>
-                <w:szCs w:val="28"/>
-              </w:rPr>
-              <w:t xml:space="preserve"> export </w:t>
-            </w:r>
-            <w:proofErr w:type="spellStart"/>
-            <w:r>
-              <w:rPr>
-                <w:i/>
-                <w:iCs/>
-                <w:color w:val="8A99A8"/>
-                <w:sz w:val="28"/>
-                <w:szCs w:val="28"/>
-              </w:rPr>
-              <w:t>จาก</w:t>
-            </w:r>
-            <w:proofErr w:type="spellEnd"/>
-            <w:r>
-              <w:rPr>
-                <w:i/>
-                <w:iCs/>
-                <w:color w:val="8A99A8"/>
-                <w:sz w:val="28"/>
-                <w:szCs w:val="28"/>
-              </w:rPr>
-              <w:t xml:space="preserve"> draw.io — </w:t>
-            </w:r>
-            <w:proofErr w:type="spellStart"/>
-            <w:r>
-              <w:rPr>
-                <w:i/>
-                <w:iCs/>
-                <w:color w:val="8A99A8"/>
-                <w:sz w:val="28"/>
-                <w:szCs w:val="28"/>
-              </w:rPr>
-              <w:t>ระบบภายนอกมีป้าย</w:t>
-            </w:r>
-            <w:proofErr w:type="spellEnd"/>
-            <w:r>
-              <w:rPr>
-                <w:i/>
-                <w:iCs/>
-                <w:color w:val="8A99A8"/>
-                <w:sz w:val="28"/>
-                <w:szCs w:val="28"/>
-              </w:rPr>
-              <w:t xml:space="preserve"> Core / Extension / TBD · </w:t>
-            </w:r>
-            <w:proofErr w:type="spellStart"/>
-            <w:r>
-              <w:rPr>
-                <w:i/>
-                <w:iCs/>
-                <w:color w:val="8A99A8"/>
-                <w:sz w:val="28"/>
-                <w:szCs w:val="28"/>
-              </w:rPr>
-              <w:t>ลูกศรมีป้าย</w:t>
-            </w:r>
-            <w:proofErr w:type="spellEnd"/>
+              <w:drawing>
+                <wp:inline distT="0" distB="0" distL="0" distR="0" wp14:anchorId="2E542D94" wp14:editId="3F9CA39E">
+                  <wp:extent cx="9504883" cy="6106602"/>
+                  <wp:effectExtent l="0" t="0" r="1270" b="8890"/>
+                  <wp:docPr id="3" name="รูปภาพ 3"/>
+                  <wp:cNvGraphicFramePr>
+                    <a:graphicFrameLocks xmlns:a="http://schemas.openxmlformats.org/drawingml/2006/main" noChangeAspect="1"/>
+                  </wp:cNvGraphicFramePr>
+                  <a:graphic xmlns:a="http://schemas.openxmlformats.org/drawingml/2006/main">
+                    <a:graphicData uri="http://schemas.openxmlformats.org/drawingml/2006/picture">
+                      <pic:pic xmlns:pic="http://schemas.openxmlformats.org/drawingml/2006/picture">
+                        <pic:nvPicPr>
+                          <pic:cNvPr id="3" name="รูปภาพ 3"/>
+                          <pic:cNvPicPr/>
+                        </pic:nvPicPr>
+                        <pic:blipFill>
+                          <a:blip r:embed="rId9">
+                            <a:extLst>
+                              <a:ext uri="{28A0092B-C50C-407E-A947-70E740481C1C}">
+                                <a14:useLocalDpi xmlns:a14="http://schemas.microsoft.com/office/drawing/2010/main" val="0"/>
+                              </a:ext>
+                            </a:extLst>
+                          </a:blip>
+                          <a:stretch>
+                            <a:fillRect/>
+                          </a:stretch>
+                        </pic:blipFill>
+                        <pic:spPr>
+                          <a:xfrm>
+                            <a:off x="0" y="0"/>
+                            <a:ext cx="9525218" cy="6119667"/>
+                          </a:xfrm>
+                          <a:prstGeom prst="rect">
+                            <a:avLst/>
+                          </a:prstGeom>
+                        </pic:spPr>
+                      </pic:pic>
+                    </a:graphicData>
+                  </a:graphic>
+                </wp:inline>
+              </w:drawing>
+            </w:r>
           </w:p>
         </w:tc>
       </w:tr>
@@ -18364,14 +19895,13 @@
       <w:pPr>
         <w:spacing w:before="40" w:after="160"/>
         <w:jc w:val="center"/>
-        <w:sectPr>
-          <w:headerReference w:type="default" r:id="rId9"/>
-          <w:footerReference w:type="default" r:id="rId10"/>
-          <w:pgSz w:w="16838" w:h="11906" w:orient="landscape"/>
-          <w:pgMar w:top="760" w:right="760" w:bottom="760" w:left="760" w:header="380" w:footer="380" w:gutter="0"/>
-          <w:cols w:space="720"/>
-          <w:docGrid w:linePitch="360"/>
-        </w:sectPr>
+        <w:rPr>
+          <w:i/>
+          <w:iCs/>
+          <w:color w:val="5A6B7C"/>
+          <w:sz w:val="26"/>
+          <w:szCs w:val="26"/>
+        </w:rPr>
       </w:pPr>
       <w:proofErr w:type="spellStart"/>
       <w:r>
@@ -18417,6 +19947,36 @@
         </w:rPr>
         <w:t xml:space="preserve"> (final-exam/diagrams/context-after.png)</w:t>
       </w:r>
+    </w:p>
+    <w:p>
+      <w:pPr>
+        <w:spacing w:before="40" w:after="160"/>
+        <w:jc w:val="center"/>
+        <w:rPr>
+          <w:rFonts w:hint="cs"/>
+          <w:i/>
+          <w:iCs/>
+          <w:color w:val="5A6B7C"/>
+          <w:sz w:val="26"/>
+          <w:szCs w:val="26"/>
+        </w:rPr>
+      </w:pPr>
+    </w:p>
+    <w:p>
+      <w:pPr>
+        <w:spacing w:before="40" w:after="160"/>
+        <w:rPr>
+          <w:rFonts w:hint="cs"/>
+        </w:rPr>
+        <w:sectPr>
+          <w:headerReference w:type="default" r:id="rId10"/>
+          <w:footerReference w:type="default" r:id="rId11"/>
+          <w:pgSz w:w="16838" w:h="11906" w:orient="landscape"/>
+          <w:pgMar w:top="760" w:right="760" w:bottom="760" w:left="760" w:header="380" w:footer="380" w:gutter="0"/>
+          <w:cols w:space="720"/>
+          <w:docGrid w:linePitch="360"/>
+        </w:sectPr>
+      </w:pPr>
     </w:p>
     <w:tbl>
       <w:tblPr>
@@ -18436,7 +19996,7 @@
         <w:tblLook w:val="0000" w:firstRow="0" w:lastRow="0" w:firstColumn="0" w:lastColumn="0" w:noHBand="0" w:noVBand="0"/>
       </w:tblPr>
       <w:tblGrid>
-        <w:gridCol w:w="15318"/>
+        <w:gridCol w:w="15490"/>
       </w:tblGrid>
       <w:tr>
         <w:trPr>
@@ -18464,129 +20024,53 @@
             <w:pPr>
               <w:jc w:val="center"/>
             </w:pPr>
-            <w:proofErr w:type="spellStart"/>
-            <w:r>
-              <w:rPr>
-                <w:i/>
-                <w:iCs/>
-                <w:color w:val="8A99A8"/>
-                <w:sz w:val="28"/>
-                <w:szCs w:val="28"/>
+            <w:r>
+              <w:rPr>
+                <w:noProof/>
               </w:rPr>
               <w:lastRenderedPageBreak/>
-              <w:t>วางภาพ</w:t>
-            </w:r>
-            <w:proofErr w:type="spellEnd"/>
-            <w:r>
-              <w:rPr>
-                <w:i/>
-                <w:iCs/>
-                <w:color w:val="8A99A8"/>
-                <w:sz w:val="28"/>
-                <w:szCs w:val="28"/>
-              </w:rPr>
-              <w:t xml:space="preserve"> Container diagram — </w:t>
-            </w:r>
-            <w:proofErr w:type="spellStart"/>
-            <w:r>
-              <w:rPr>
-                <w:i/>
-                <w:iCs/>
-                <w:color w:val="8A99A8"/>
-                <w:sz w:val="28"/>
-                <w:szCs w:val="28"/>
-              </w:rPr>
-              <w:t>ทุกกล่องมี</w:t>
-            </w:r>
-            <w:proofErr w:type="spellEnd"/>
-            <w:r>
-              <w:rPr>
-                <w:i/>
-                <w:iCs/>
-                <w:color w:val="8A99A8"/>
-                <w:sz w:val="28"/>
-                <w:szCs w:val="28"/>
-              </w:rPr>
-              <w:t xml:space="preserve"> [</w:t>
-            </w:r>
-            <w:proofErr w:type="spellStart"/>
-            <w:r>
-              <w:rPr>
-                <w:i/>
-                <w:iCs/>
-                <w:color w:val="8A99A8"/>
-                <w:sz w:val="28"/>
-                <w:szCs w:val="28"/>
-              </w:rPr>
-              <w:t>ชนิด</w:t>
-            </w:r>
-            <w:proofErr w:type="spellEnd"/>
-            <w:r>
-              <w:rPr>
-                <w:i/>
-                <w:iCs/>
-                <w:color w:val="8A99A8"/>
-                <w:sz w:val="28"/>
-                <w:szCs w:val="28"/>
-              </w:rPr>
-              <w:t xml:space="preserve"> · </w:t>
-            </w:r>
-            <w:proofErr w:type="spellStart"/>
-            <w:r>
-              <w:rPr>
-                <w:i/>
-                <w:iCs/>
-                <w:color w:val="8A99A8"/>
-                <w:sz w:val="28"/>
-                <w:szCs w:val="28"/>
-              </w:rPr>
-              <w:t>เทคโนโลยี</w:t>
-            </w:r>
-            <w:proofErr w:type="spellEnd"/>
-            <w:r>
-              <w:rPr>
-                <w:i/>
-                <w:iCs/>
-                <w:color w:val="8A99A8"/>
-                <w:sz w:val="28"/>
-                <w:szCs w:val="28"/>
-              </w:rPr>
-              <w:t xml:space="preserve">] · </w:t>
-            </w:r>
-            <w:proofErr w:type="spellStart"/>
-            <w:r>
-              <w:rPr>
-                <w:i/>
-                <w:iCs/>
-                <w:color w:val="8A99A8"/>
-                <w:sz w:val="28"/>
-                <w:szCs w:val="28"/>
-              </w:rPr>
-              <w:t>ลูกศรบอกว่าส่งอะไร</w:t>
-            </w:r>
-            <w:proofErr w:type="spellEnd"/>
-            <w:r>
-              <w:rPr>
-                <w:i/>
-                <w:iCs/>
-                <w:color w:val="8A99A8"/>
-                <w:sz w:val="28"/>
-                <w:szCs w:val="28"/>
-              </w:rPr>
-              <w:t xml:space="preserve"> </w:t>
-            </w:r>
-            <w:proofErr w:type="spellStart"/>
-            <w:r>
-              <w:rPr>
-                <w:i/>
-                <w:iCs/>
-                <w:color w:val="8A99A8"/>
-                <w:sz w:val="28"/>
-                <w:szCs w:val="28"/>
-              </w:rPr>
-              <w:t>ผ่านอะไร</w:t>
-            </w:r>
-            <w:proofErr w:type="spellEnd"/>
+              <w:drawing>
+                <wp:inline distT="0" distB="0" distL="0" distR="0" wp14:anchorId="49665079" wp14:editId="512BAF77">
+                  <wp:extent cx="9575053" cy="6193155"/>
+                  <wp:effectExtent l="0" t="0" r="7620" b="0"/>
+                  <wp:docPr id="4" name="รูปภาพ 4"/>
+                  <wp:cNvGraphicFramePr>
+                    <a:graphicFrameLocks xmlns:a="http://schemas.openxmlformats.org/drawingml/2006/main" noChangeAspect="1"/>
+                  </wp:cNvGraphicFramePr>
+                  <a:graphic xmlns:a="http://schemas.openxmlformats.org/drawingml/2006/main">
+                    <a:graphicData uri="http://schemas.openxmlformats.org/drawingml/2006/picture">
+                      <pic:pic xmlns:pic="http://schemas.openxmlformats.org/drawingml/2006/picture">
+                        <pic:nvPicPr>
+                          <pic:cNvPr id="4" name="รูปภาพ 4"/>
+                          <pic:cNvPicPr/>
+                        </pic:nvPicPr>
+                        <pic:blipFill>
+                          <a:blip r:embed="rId12">
+                            <a:extLst>
+                              <a:ext uri="{28A0092B-C50C-407E-A947-70E740481C1C}">
+                                <a14:useLocalDpi xmlns:a14="http://schemas.microsoft.com/office/drawing/2010/main" val="0"/>
+                              </a:ext>
+                            </a:extLst>
+                          </a:blip>
+                          <a:stretch>
+                            <a:fillRect/>
+                          </a:stretch>
+                        </pic:blipFill>
+                        <pic:spPr>
+                          <a:xfrm>
+                            <a:off x="0" y="0"/>
+                            <a:ext cx="9602709" cy="6211043"/>
+                          </a:xfrm>
+                          <a:prstGeom prst="rect">
+                            <a:avLst/>
+                          </a:prstGeom>
+                        </pic:spPr>
+                      </pic:pic>
+                    </a:graphicData>
+                  </a:graphic>
+                </wp:inline>
+              </w:drawing>
+            </w:r>
           </w:p>
         </w:tc>
       </w:tr>
@@ -18596,8 +20080,8 @@
         <w:spacing w:before="40" w:after="160"/>
         <w:jc w:val="center"/>
         <w:sectPr>
-          <w:headerReference w:type="default" r:id="rId11"/>
-          <w:footerReference w:type="default" r:id="rId12"/>
+          <w:headerReference w:type="default" r:id="rId13"/>
+          <w:footerReference w:type="default" r:id="rId14"/>
           <w:pgSz w:w="16838" w:h="11906" w:orient="landscape"/>
           <w:pgMar w:top="760" w:right="760" w:bottom="760" w:left="760" w:header="380" w:footer="380" w:gutter="0"/>
           <w:cols w:space="720"/>
@@ -18651,7 +20135,7 @@
     </w:p>
     <w:p>
       <w:pPr>
-        <w:pStyle w:val="Heading1"/>
+        <w:pStyle w:val="1"/>
         <w:keepNext/>
         <w:pageBreakBefore/>
         <w:pBdr>
@@ -19694,6 +21178,7 @@
           <w:sz w:val="30"/>
           <w:szCs w:val="30"/>
         </w:rPr>
+        <w:lastRenderedPageBreak/>
         <w:t xml:space="preserve">5.3 </w:t>
       </w:r>
       <w:proofErr w:type="spellStart"/>
@@ -20299,7 +21784,7 @@
     </w:p>
     <w:p>
       <w:pPr>
-        <w:pStyle w:val="Heading1"/>
+        <w:pStyle w:val="1"/>
         <w:keepNext/>
         <w:pageBreakBefore/>
         <w:pBdr>
@@ -21550,8 +23035,8 @@
       <w:proofErr w:type="spellEnd"/>
     </w:p>
     <w:sectPr>
-      <w:headerReference w:type="default" r:id="rId13"/>
-      <w:footerReference w:type="default" r:id="rId14"/>
+      <w:headerReference w:type="default" r:id="rId15"/>
+      <w:footerReference w:type="default" r:id="rId16"/>
       <w:pgSz w:w="11906" w:h="16838"/>
       <w:pgMar w:top="1134" w:right="1134" w:bottom="1134" w:left="1134" w:header="560" w:footer="560" w:gutter="0"/>
       <w:cols w:space="720"/>
@@ -22752,11 +24237,11 @@
     <w:lsdException w:name="Unresolved Mention" w:semiHidden="1" w:unhideWhenUsed="1"/>
     <w:lsdException w:name="Smart Link" w:semiHidden="1" w:unhideWhenUsed="1"/>
   </w:latentStyles>
-  <w:style w:type="paragraph" w:default="1" w:styleId="Normal">
+  <w:style w:type="paragraph" w:default="1" w:styleId="a">
     <w:name w:val="Normal"/>
     <w:qFormat/>
   </w:style>
-  <w:style w:type="paragraph" w:styleId="Heading1">
+  <w:style w:type="paragraph" w:styleId="1">
     <w:name w:val="heading 1"/>
     <w:uiPriority w:val="9"/>
     <w:qFormat/>
@@ -22771,7 +24256,7 @@
       <w:szCs w:val="40"/>
     </w:rPr>
   </w:style>
-  <w:style w:type="paragraph" w:styleId="Heading2">
+  <w:style w:type="paragraph" w:styleId="2">
     <w:name w:val="heading 2"/>
     <w:uiPriority w:val="9"/>
     <w:semiHidden/>
@@ -22786,7 +24271,7 @@
       <w:szCs w:val="26"/>
     </w:rPr>
   </w:style>
-  <w:style w:type="paragraph" w:styleId="Heading3">
+  <w:style w:type="paragraph" w:styleId="3">
     <w:name w:val="heading 3"/>
     <w:uiPriority w:val="9"/>
     <w:semiHidden/>
@@ -22801,7 +24286,7 @@
       <w:szCs w:val="24"/>
     </w:rPr>
   </w:style>
-  <w:style w:type="paragraph" w:styleId="Heading4">
+  <w:style w:type="paragraph" w:styleId="4">
     <w:name w:val="heading 4"/>
     <w:uiPriority w:val="9"/>
     <w:semiHidden/>
@@ -22816,7 +24301,7 @@
       <w:color w:val="2E74B5"/>
     </w:rPr>
   </w:style>
-  <w:style w:type="paragraph" w:styleId="Heading5">
+  <w:style w:type="paragraph" w:styleId="5">
     <w:name w:val="heading 5"/>
     <w:uiPriority w:val="9"/>
     <w:semiHidden/>
@@ -22829,7 +24314,7 @@
       <w:color w:val="2E74B5"/>
     </w:rPr>
   </w:style>
-  <w:style w:type="paragraph" w:styleId="Heading6">
+  <w:style w:type="paragraph" w:styleId="6">
     <w:name w:val="heading 6"/>
     <w:uiPriority w:val="9"/>
     <w:semiHidden/>
@@ -22842,13 +24327,12 @@
       <w:color w:val="1F4D78"/>
     </w:rPr>
   </w:style>
-  <w:style w:type="character" w:default="1" w:styleId="DefaultParagraphFont">
+  <w:style w:type="character" w:default="1" w:styleId="a0">
     <w:name w:val="Default Paragraph Font"/>
     <w:uiPriority w:val="1"/>
-    <w:semiHidden/>
     <w:unhideWhenUsed/>
   </w:style>
-  <w:style w:type="table" w:default="1" w:styleId="TableNormal">
+  <w:style w:type="table" w:default="1" w:styleId="a1">
     <w:name w:val="Normal Table"/>
     <w:uiPriority w:val="99"/>
     <w:semiHidden/>
@@ -22863,13 +24347,13 @@
       </w:tblCellMar>
     </w:tblPr>
   </w:style>
-  <w:style w:type="numbering" w:default="1" w:styleId="NoList">
+  <w:style w:type="numbering" w:default="1" w:styleId="a2">
     <w:name w:val="No List"/>
     <w:uiPriority w:val="99"/>
     <w:semiHidden/>
     <w:unhideWhenUsed/>
   </w:style>
-  <w:style w:type="paragraph" w:styleId="Title">
+  <w:style w:type="paragraph" w:styleId="a3">
     <w:name w:val="Title"/>
     <w:uiPriority w:val="10"/>
     <w:qFormat/>
@@ -22886,11 +24370,11 @@
       <w:bCs/>
     </w:rPr>
   </w:style>
-  <w:style w:type="paragraph" w:styleId="ListParagraph">
+  <w:style w:type="paragraph" w:styleId="a4">
     <w:name w:val="List Paragraph"/>
     <w:qFormat/>
   </w:style>
-  <w:style w:type="character" w:styleId="Hyperlink">
+  <w:style w:type="character" w:styleId="a5">
     <w:name w:val="Hyperlink"/>
     <w:uiPriority w:val="99"/>
     <w:unhideWhenUsed/>
@@ -22899,7 +24383,7 @@
       <w:u w:val="single"/>
     </w:rPr>
   </w:style>
-  <w:style w:type="character" w:styleId="FootnoteReference">
+  <w:style w:type="character" w:styleId="a6">
     <w:name w:val="footnote reference"/>
     <w:uiPriority w:val="99"/>
     <w:semiHidden/>
@@ -22908,9 +24392,9 @@
       <w:vertAlign w:val="superscript"/>
     </w:rPr>
   </w:style>
-  <w:style w:type="paragraph" w:styleId="FootnoteText">
+  <w:style w:type="paragraph" w:styleId="a7">
     <w:name w:val="footnote text"/>
-    <w:link w:val="FootnoteTextChar"/>
+    <w:link w:val="a8"/>
     <w:uiPriority w:val="99"/>
     <w:semiHidden/>
     <w:unhideWhenUsed/>
@@ -22919,9 +24403,9 @@
       <w:szCs w:val="20"/>
     </w:rPr>
   </w:style>
-  <w:style w:type="character" w:customStyle="1" w:styleId="FootnoteTextChar">
-    <w:name w:val="Footnote Text Char"/>
-    <w:link w:val="FootnoteText"/>
+  <w:style w:type="character" w:customStyle="1" w:styleId="a8">
+    <w:name w:val="ข้อความเชิงอรรถ อักขระ"/>
+    <w:link w:val="a7"/>
     <w:uiPriority w:val="99"/>
     <w:semiHidden/>
     <w:unhideWhenUsed/>
@@ -22930,7 +24414,7 @@
       <w:szCs w:val="20"/>
     </w:rPr>
   </w:style>
-  <w:style w:type="character" w:styleId="EndnoteReference">
+  <w:style w:type="character" w:styleId="a9">
     <w:name w:val="endnote reference"/>
     <w:uiPriority w:val="99"/>
     <w:semiHidden/>
@@ -22939,9 +24423,9 @@
       <w:vertAlign w:val="superscript"/>
     </w:rPr>
   </w:style>
-  <w:style w:type="paragraph" w:styleId="EndnoteText">
+  <w:style w:type="paragraph" w:styleId="aa">
     <w:name w:val="endnote text"/>
-    <w:link w:val="EndnoteTextChar"/>
+    <w:link w:val="ab"/>
     <w:uiPriority w:val="99"/>
     <w:semiHidden/>
     <w:unhideWhenUsed/>
@@ -22950,9 +24434,9 @@
       <w:szCs w:val="20"/>
     </w:rPr>
   </w:style>
-  <w:style w:type="character" w:customStyle="1" w:styleId="EndnoteTextChar">
-    <w:name w:val="Endnote Text Char"/>
-    <w:link w:val="EndnoteText"/>
+  <w:style w:type="character" w:customStyle="1" w:styleId="ab">
+    <w:name w:val="ข้อความอ้างอิงท้ายเรื่อง อักขระ"/>
+    <w:link w:val="aa"/>
     <w:uiPriority w:val="99"/>
     <w:semiHidden/>
     <w:unhideWhenUsed/>

</xml_diff>

<commit_message>
final(G5): CR-FX-02A, DEC-03 and change table
</commit_message>
<xml_diff>
--- a/final-exam/final-exam-group-answer.docx
+++ b/final-exam/final-exam-group-answer.docx
@@ -20156,7 +20156,7 @@
       </w:r>
       <w:proofErr w:type="gramStart"/>
       <w:r>
-        <w:t>( )</w:t>
+        <w:t>(✓)</w:t>
       </w:r>
       <w:proofErr w:type="gramEnd"/>
       <w:r>
@@ -20197,7 +20197,7 @@
         <w:t>:</w:t>
       </w:r>
       <w:r>
-        <w:t xml:space="preserve"> ............................................</w:t>
+        <w:t xml:space="preserve"> ใกล้กับ case มากกว่า: Case Card ของกลุ่มมีคำถามค้างอยู่แล้วว่าควรระบุตำแหน่งอุปกรณ์ด้วยการสแกน QR Code ที่ติดบนโต๊ะหรือเครื่องคอมพิวเตอร์หรือไม่ และงานซ่อมของ CLMRS เกิดที่หน้างานจริง (ห้องเรียน · ห้องปฏิบัติการ)</w:t>
       </w:r>
     </w:p>
     <w:p>
@@ -20306,7 +20306,7 @@
                 <w:sz w:val="28"/>
                 <w:szCs w:val="28"/>
               </w:rPr>
-              <w:t>CR-FX-02</w:t>
+              <w:t>CR-FX-02A</w:t>
             </w:r>
             <w:proofErr w:type="gramStart"/>
             <w:r>
@@ -20317,7 +20317,7 @@
                 <w:sz w:val="28"/>
                 <w:szCs w:val="28"/>
               </w:rPr>
-              <w:t xml:space="preserve">   [</w:t>
+              <w:t xml:space="preserve">   </w:t>
             </w:r>
             <w:proofErr w:type="gramEnd"/>
             <w:r>
@@ -20328,7 +20328,7 @@
                 <w:sz w:val="28"/>
                 <w:szCs w:val="28"/>
               </w:rPr>
-              <w:t xml:space="preserve">A </w:t>
+              <w:t>ใช้งานหน้างาน: สแกน QR + สัญญาณไม่เสถียร</w:t>
             </w:r>
             <w:proofErr w:type="spellStart"/>
             <w:r>
@@ -20339,7 +20339,6 @@
                 <w:sz w:val="28"/>
                 <w:szCs w:val="28"/>
               </w:rPr>
-              <w:t>หรือ</w:t>
             </w:r>
             <w:proofErr w:type="spellEnd"/>
             <w:r>
@@ -20350,7 +20349,6 @@
                 <w:sz w:val="28"/>
                 <w:szCs w:val="28"/>
               </w:rPr>
-              <w:t xml:space="preserve"> B]</w:t>
             </w:r>
             <w:r>
               <w:rPr>
@@ -20481,6 +20479,24 @@
               <w:keepNext/>
               <w:keepLines/>
             </w:pPr>
+            <w:r>
+              <w:rPr>
+                <w:sz w:val="28"/>
+              </w:rPr>
+              <w:t>เจ้าหน้าที่เทคนิค (ACT-02) ที่หน้างานต้องการสแกน QR Code ที่ติดบนอุปกรณ์หรือห้อง เพื่อเปิดรายการแจ้งซ่อมของอุปกรณ์นั้นและบันทึกการรับงานหรือผลซ่อมได้เร็วขึ้น (UC-05) · ผู้แจ้ง (ACT-01) ใช้สแกนเพื่อเติมอาคารและห้องในฟอร์มอัตโนมัติได้ด้วย (UC-01)</w:t>
+            </w:r>
+          </w:p>
+          <w:p>
+            <w:pPr>
+              <w:keepNext/>
+              <w:keepLines/>
+            </w:pPr>
+            <w:r>
+              <w:rPr>
+                <w:sz w:val="28"/>
+              </w:rPr>
+              <w:t>บางห้องสัญญาณอินเทอร์เน็ตไม่เสถียร — ยังไม่รู้ว่าขาดนานแค่ไหนและบ่อยเพียงใด (TBD — OQ-13)</w:t>
+            </w:r>
           </w:p>
         </w:tc>
       </w:tr>
@@ -20556,6 +20572,36 @@
               <w:keepNext/>
               <w:keepLines/>
             </w:pPr>
+            <w:r>
+              <w:rPr>
+                <w:sz w:val="28"/>
+              </w:rPr>
+              <w:t>แก้: FR-CLMRS-02 · BR-01 (ตำแหน่งมาจาก QR ได้) · UC-01 · UC-05 · AC-03 · AC-08 · DR-01</w:t>
+            </w:r>
+          </w:p>
+          <w:p>
+            <w:pPr>
+              <w:keepNext/>
+              <w:keepLines/>
+            </w:pPr>
+            <w:r>
+              <w:rPr>
+                <w:sz w:val="28"/>
+              </w:rPr>
+              <w:t>เพิ่ม: FR-CLMRS-12 (สแกน QR เปิดรายการ / เติมตำแหน่ง) · DR-11 LocationQRCode (รหัส QR ↔ อาคาร · ห้อง · อุปกรณ์) · OQ-13 · OQ-14</w:t>
+            </w:r>
+          </w:p>
+          <w:p>
+            <w:pPr>
+              <w:keepNext/>
+              <w:keepLines/>
+            </w:pPr>
+            <w:r>
+              <w:rPr>
+                <w:sz w:val="28"/>
+              </w:rPr>
+              <w:t>ข้อจำกัดที่ต้องคงไว้: NFR-CLMRS-01 (สิทธิ์ตาม role) · BR-07 (ปิดงานต้องผ่านผู้ยืนยัน) · NFR-CLMRS-03 (ใช้ได้ 24 ชม. เมื่อเครือข่ายปกติ)</w:t>
+            </w:r>
           </w:p>
         </w:tc>
       </w:tr>
@@ -20631,6 +20677,36 @@
               <w:keepNext/>
               <w:keepLines/>
             </w:pPr>
+            <w:r>
+              <w:rPr>
+                <w:sz w:val="28"/>
+              </w:rPr>
+              <w:t>A — QR เป็นลิงก์เปิดหน้ารายการใน CLMRS Web App · ตอนเน็ตหลุด Web App เก็บร่างที่กรอกไว้ในเครื่องและให้ผู้ใช้กดส่งใหม่เมื่อเน็ตกลับ · กติกาทุกข้อยังตรวจที่ CLMRS API · ไม่เพิ่ม container</w:t>
+            </w:r>
+          </w:p>
+          <w:p>
+            <w:pPr>
+              <w:keepNext/>
+              <w:keepLines/>
+            </w:pPr>
+            <w:r>
+              <w:rPr>
+                <w:sz w:val="28"/>
+              </w:rPr>
+              <w:t>B — ทำ Mobile App แบบ offline-first มีฐานข้อมูลในเครื่องและ sync ภายหลัง · ต้องเพิ่ม container ใหม่ และต้องตัดสินกติกาเมื่อข้อมูลชนกัน · อยู่นอก stack อ้างอิง</w:t>
+            </w:r>
+          </w:p>
+          <w:p>
+            <w:pPr>
+              <w:keepNext/>
+              <w:keepLines/>
+            </w:pPr>
+            <w:r>
+              <w:rPr>
+                <w:sz w:val="28"/>
+              </w:rPr>
+              <w:t>C — ไม่ทำ QR · ใช้ฟอร์มเดิมที่พิมพ์อาคารและห้องเอง</w:t>
+            </w:r>
           </w:p>
         </w:tc>
       </w:tr>
@@ -20726,6 +20802,23 @@
             <w:pPr>
               <w:keepLines/>
             </w:pPr>
+            <w:r>
+              <w:rPr>
+                <w:sz w:val="28"/>
+              </w:rPr>
+              <w:t>กลุ่มเสนอทางเลือก A — ได้ความเร็วหน้างานด้วย container เดิม และไม่ต้องย้ายการตรวจสิทธิ์ออกจาก API</w:t>
+            </w:r>
+          </w:p>
+          <w:p>
+            <w:pPr>
+              <w:keepLines/>
+            </w:pPr>
+            <w:r>
+              <w:rPr>
+                <w:sz w:val="28"/>
+              </w:rPr>
+              <w:t>ผู้ตัดสิน: Building Manager (เจ้าของกระบวนการซ่อม) ร่วมกับ Tech Lead · สถานะ Pending</w:t>
+            </w:r>
           </w:p>
         </w:tc>
       </w:tr>
@@ -20807,7 +20900,7 @@
                 <w:sz w:val="28"/>
                 <w:szCs w:val="28"/>
               </w:rPr>
-              <w:t>DEC-</w:t>
+              <w:t>DEC-03</w:t>
             </w:r>
             <w:proofErr w:type="gramStart"/>
             <w:r>
@@ -20818,7 +20911,7 @@
                 <w:sz w:val="28"/>
                 <w:szCs w:val="28"/>
               </w:rPr>
-              <w:t xml:space="preserve">   [</w:t>
+              <w:t xml:space="preserve">   </w:t>
             </w:r>
             <w:proofErr w:type="spellStart"/>
             <w:proofErr w:type="gramEnd"/>
@@ -20830,7 +20923,7 @@
                 <w:sz w:val="28"/>
                 <w:szCs w:val="28"/>
               </w:rPr>
-              <w:t>ตัดสินใจเรื่องอะไร</w:t>
+              <w:t>ไม่เพิ่ม container สำหรับ QR และสัญญาณไม่เสถียร</w:t>
             </w:r>
             <w:proofErr w:type="spellEnd"/>
             <w:r>
@@ -20841,7 +20934,6 @@
                 <w:sz w:val="28"/>
                 <w:szCs w:val="28"/>
               </w:rPr>
-              <w:t>]</w:t>
             </w:r>
             <w:r>
               <w:rPr>
@@ -20918,6 +21010,12 @@
               <w:keepNext/>
               <w:keepLines/>
             </w:pPr>
+            <w:r>
+              <w:rPr>
+                <w:sz w:val="28"/>
+              </w:rPr>
+              <w:t>QR Code เป็น URL ที่เปิดหน้ารายการใน CLMRS Web App เดิม · ไม่เพิ่ม Mobile App หรือ container สำหรับทำงานออฟไลน์ · การบันทึกทุกครั้งต้องผ่าน CLMRS API</w:t>
+            </w:r>
           </w:p>
         </w:tc>
       </w:tr>
@@ -20993,6 +21091,36 @@
               <w:keepNext/>
               <w:keepLines/>
             </w:pPr>
+            <w:r>
+              <w:rPr>
+                <w:sz w:val="28"/>
+              </w:rPr>
+              <w:t>NFR-CLMRS-01 — สิทธิ์ตาม role ต้องตรวจที่ CLMRS API เสมอ ถ้าบันทึกแบบออฟไลน์บนเครื่องจะตรวจสิทธิ์ไม่ได้ขณะไม่มีเน็ต</w:t>
+            </w:r>
+          </w:p>
+          <w:p>
+            <w:pPr>
+              <w:keepNext/>
+              <w:keepLines/>
+            </w:pPr>
+            <w:r>
+              <w:rPr>
+                <w:sz w:val="28"/>
+              </w:rPr>
+              <w:t>BR-07 — การปิดงานต้องผ่านผู้ยืนยัน จึงห้ามถือว่าบันทึกสำเร็จจนกว่า API ตอบรับ</w:t>
+            </w:r>
+          </w:p>
+          <w:p>
+            <w:pPr>
+              <w:keepNext/>
+              <w:keepLines/>
+            </w:pPr>
+            <w:r>
+              <w:rPr>
+                <w:sz w:val="28"/>
+              </w:rPr>
+              <w:t>ยังไม่มีหลักฐานว่าสัญญาณขาดนานหรือบ่อยแค่ไหน (OQ-13) · อยู่ใน stack อ้างอิง (React)</w:t>
+            </w:r>
           </w:p>
         </w:tc>
       </w:tr>
@@ -21058,6 +21186,24 @@
               <w:keepNext/>
               <w:keepLines/>
             </w:pPr>
+            <w:r>
+              <w:rPr>
+                <w:sz w:val="28"/>
+              </w:rPr>
+              <w:t>B — Mobile App offline-first + sync (เพิ่ม container · ต้องมีกติกาแก้ข้อมูลชน · นอก stack)</w:t>
+            </w:r>
+          </w:p>
+          <w:p>
+            <w:pPr>
+              <w:keepNext/>
+              <w:keepLines/>
+            </w:pPr>
+            <w:r>
+              <w:rPr>
+                <w:sz w:val="28"/>
+              </w:rPr>
+              <w:t>C — ไม่ทำ QR (ไม่ตอบปัญหาความเร็วหน้างาน)</w:t>
+            </w:r>
           </w:p>
         </w:tc>
       </w:tr>
@@ -21121,6 +21267,23 @@
             <w:pPr>
               <w:keepLines/>
             </w:pPr>
+            <w:r>
+              <w:rPr>
+                <w:sz w:val="28"/>
+              </w:rPr>
+              <w:t>ระหว่างเน็ตหลุดบันทึกไม่ได้ทันที — Web App เก็บร่างไว้และแสดงสถานะ "ยังไม่ส่ง" ให้ผู้ใช้กดส่งเองเมื่อเน็ตกลับ</w:t>
+            </w:r>
+          </w:p>
+          <w:p>
+            <w:pPr>
+              <w:keepLines/>
+            </w:pPr>
+            <w:r>
+              <w:rPr>
+                <w:sz w:val="28"/>
+              </w:rPr>
+              <w:t>ถ้าคำตอบ OQ-13 พบว่าขาดนานหรือบ่อย ให้พิจารณาทางเลือก B ใหม่ด้วย decision card ใบใหม่</w:t>
+            </w:r>
           </w:p>
         </w:tc>
       </w:tr>
@@ -21389,6 +21552,12 @@
             <w:pPr>
               <w:keepNext/>
             </w:pPr>
+            <w:r>
+              <w:rPr>
+                <w:sz w:val="28"/>
+              </w:rPr>
+              <w:t>ระบุตำแหน่งด้วยการพิมพ์อาคาร/ห้อง (FR-CLMRS-02 · BR-01) · QR เป็นแค่คำถามใน Case Card</w:t>
+            </w:r>
           </w:p>
         </w:tc>
         <w:tc>
@@ -21412,6 +21581,12 @@
             <w:pPr>
               <w:keepNext/>
             </w:pPr>
+            <w:r>
+              <w:rPr>
+                <w:sz w:val="28"/>
+              </w:rPr>
+              <w:t>สแกน QR เปิดรายการ / เติมตำแหน่ง = Build now · ทำงานออฟไลน์เต็มรูปแบบ = Later (รอ OQ-13)</w:t>
+            </w:r>
           </w:p>
         </w:tc>
         <w:tc>
@@ -21435,6 +21610,12 @@
             <w:pPr>
               <w:keepNext/>
             </w:pPr>
+            <w:r>
+              <w:rPr>
+                <w:sz w:val="28"/>
+              </w:rPr>
+              <w:t>QR ลดเวลาหน้างานได้ด้วย container เดิม แต่ยังไม่มีหลักฐานว่าต้องออฟไลน์</w:t>
+            </w:r>
           </w:p>
         </w:tc>
       </w:tr>
@@ -21495,6 +21676,12 @@
             <w:pPr>
               <w:keepNext/>
             </w:pPr>
+            <w:r>
+              <w:rPr>
+                <w:sz w:val="28"/>
+              </w:rPr>
+              <w:t>ช่างเปิดคิวงาน → เลือกรายการ → บันทึกผล (UC-05)</w:t>
+            </w:r>
           </w:p>
         </w:tc>
         <w:tc>
@@ -21518,6 +21705,12 @@
             <w:pPr>
               <w:keepNext/>
             </w:pPr>
+            <w:r>
+              <w:rPr>
+                <w:sz w:val="28"/>
+              </w:rPr>
+              <w:t>ช่างสแกน QR → CLMRS Web App เปิดรายการของห้อง/อุปกรณ์นั้น → CLMRS API ตรวจสิทธิ์ → บันทึกผล · ถ้าเน็ตหลุด → เก็บร่างรอส่งใหม่</w:t>
+            </w:r>
           </w:p>
         </w:tc>
         <w:tc>
@@ -21541,6 +21734,12 @@
             <w:pPr>
               <w:keepNext/>
             </w:pPr>
+            <w:r>
+              <w:rPr>
+                <w:sz w:val="28"/>
+              </w:rPr>
+              <w:t>กติกาสำคัญ (NFR-CLMRS-01 · BR-07) ยังตรวจที่ CLMRS API ขั้นเดียวกับเดิม</w:t>
+            </w:r>
           </w:p>
         </w:tc>
       </w:tr>
@@ -21601,6 +21800,12 @@
             <w:pPr>
               <w:keepNext/>
             </w:pPr>
+            <w:r>
+              <w:rPr>
+                <w:sz w:val="28"/>
+              </w:rPr>
+              <w:t>CLMRS Web App · CLMRS API · CLMRS Database · Reminder Job (DEC-01 จาก CR-FX-01)</w:t>
+            </w:r>
           </w:p>
         </w:tc>
         <w:tc>
@@ -21624,6 +21829,12 @@
             <w:pPr>
               <w:keepNext/>
             </w:pPr>
+            <w:r>
+              <w:rPr>
+                <w:sz w:val="28"/>
+              </w:rPr>
+              <w:t>เท่าเดิม ไม่เพิ่ม · CLMRS Web App เพิ่มหน้าสแกนและเก็บร่าง · CLMRS Database เพิ่ม DR-11</w:t>
+            </w:r>
           </w:p>
         </w:tc>
         <w:tc>
@@ -21647,6 +21858,12 @@
             <w:pPr>
               <w:keepNext/>
             </w:pPr>
+            <w:r>
+              <w:rPr>
+                <w:sz w:val="28"/>
+              </w:rPr>
+              <w:t>DEC-03</w:t>
+            </w:r>
           </w:p>
         </w:tc>
       </w:tr>
@@ -21700,7 +21917,14 @@
               <w:right w:w="90" w:type="dxa"/>
             </w:tcMar>
           </w:tcPr>
-          <w:p/>
+          <w:p>
+            <w:r>
+              <w:rPr>
+                <w:sz w:val="28"/>
+              </w:rPr>
+              <w:t>คำถามใน Case Card เรื่องวิธีระบุตำแหน่งอุปกรณ์</w:t>
+            </w:r>
+          </w:p>
         </w:tc>
         <w:tc>
           <w:tcPr>
@@ -21719,7 +21943,14 @@
               <w:right w:w="90" w:type="dxa"/>
             </w:tcMar>
           </w:tcPr>
-          <w:p/>
+          <w:p>
+            <w:r>
+              <w:rPr>
+                <w:sz w:val="28"/>
+              </w:rPr>
+              <w:t>OQ-13 สัญญาณขาดนาน/บ่อยแค่ไหน · OQ-14 QR ผูกกับห้องหรือรายอุปกรณ์ และใครติด/ดูแล QR</w:t>
+            </w:r>
+          </w:p>
         </w:tc>
         <w:tc>
           <w:tcPr>
@@ -21738,7 +21969,14 @@
               <w:right w:w="90" w:type="dxa"/>
             </w:tcMar>
           </w:tcPr>
-          <w:p/>
+          <w:p>
+            <w:r>
+              <w:rPr>
+                <w:sz w:val="28"/>
+              </w:rPr>
+              <w:t>ห้ามเดา — ระหว่างรอใช้ทางเลือก A</w:t>
+            </w:r>
+          </w:p>
         </w:tc>
       </w:tr>
     </w:tbl>

</xml_diff>

<commit_message>
final(G6): integrity checklist, AI use and contribution tables
</commit_message>
<xml_diff>
--- a/final-exam/final-exam-group-answer.docx
+++ b/final-exam/final-exam-group-answer.docx
@@ -119,266 +119,6 @@
         <w:t>CLMRS) (Case 02)</w:t>
       </w:r>
     </w:p>
-    <w:tbl>
-      <w:tblPr>
-        <w:tblW w:w="9638" w:type="dxa"/>
-        <w:tblBorders>
-          <w:top w:val="single" w:sz="4" w:space="0" w:color="auto"/>
-          <w:left w:val="single" w:sz="4" w:space="0" w:color="auto"/>
-          <w:bottom w:val="single" w:sz="4" w:space="0" w:color="auto"/>
-          <w:right w:val="single" w:sz="4" w:space="0" w:color="auto"/>
-          <w:insideH w:val="single" w:sz="4" w:space="0" w:color="auto"/>
-          <w:insideV w:val="single" w:sz="4" w:space="0" w:color="auto"/>
-        </w:tblBorders>
-        <w:tblCellMar>
-          <w:left w:w="10" w:type="dxa"/>
-          <w:right w:w="10" w:type="dxa"/>
-        </w:tblCellMar>
-        <w:tblLook w:val="0000" w:firstRow="0" w:lastRow="0" w:firstColumn="0" w:lastColumn="0" w:noHBand="0" w:noVBand="0"/>
-      </w:tblPr>
-      <w:tblGrid>
-        <w:gridCol w:w="9638"/>
-      </w:tblGrid>
-      <w:tr>
-        <w:trPr>
-          <w:cantSplit/>
-        </w:trPr>
-        <w:tc>
-          <w:tcPr>
-            <w:tcW w:w="9638" w:type="dxa"/>
-            <w:tcBorders>
-              <w:top w:val="single" w:sz="8" w:space="0" w:color="173B65"/>
-              <w:left w:val="single" w:sz="8" w:space="0" w:color="173B65"/>
-              <w:bottom w:val="single" w:sz="8" w:space="0" w:color="173B65"/>
-              <w:right w:val="single" w:sz="8" w:space="0" w:color="173B65"/>
-            </w:tcBorders>
-            <w:shd w:val="clear" w:color="auto" w:fill="F4F8FB"/>
-            <w:tcMar>
-              <w:top w:w="100" w:type="dxa"/>
-              <w:left w:w="180" w:type="dxa"/>
-              <w:bottom w:w="100" w:type="dxa"/>
-              <w:right w:w="160" w:type="dxa"/>
-            </w:tcMar>
-          </w:tcPr>
-          <w:p>
-            <w:pPr>
-              <w:spacing w:after="40"/>
-            </w:pPr>
-            <w:proofErr w:type="spellStart"/>
-            <w:r>
-              <w:rPr>
-                <w:b/>
-                <w:bCs/>
-                <w:color w:val="173B65"/>
-                <w:sz w:val="30"/>
-                <w:szCs w:val="30"/>
-              </w:rPr>
-              <w:t>คำแนะนำ</w:t>
-            </w:r>
-            <w:proofErr w:type="spellEnd"/>
-          </w:p>
-          <w:p>
-            <w:pPr>
-              <w:pStyle w:val="a4"/>
-              <w:numPr>
-                <w:ilvl w:val="0"/>
-                <w:numId w:val="2"/>
-              </w:numPr>
-              <w:spacing w:after="20"/>
-            </w:pPr>
-            <w:proofErr w:type="spellStart"/>
-            <w:r>
-              <w:rPr>
-                <w:sz w:val="28"/>
-                <w:szCs w:val="28"/>
-              </w:rPr>
-              <w:t>บันทึกไฟล์นี้เป็น</w:t>
-            </w:r>
-            <w:proofErr w:type="spellEnd"/>
-            <w:r>
-              <w:rPr>
-                <w:sz w:val="28"/>
-                <w:szCs w:val="28"/>
-              </w:rPr>
-              <w:t xml:space="preserve"> final-exam/final-exam-group-answer.docx </w:t>
-            </w:r>
-            <w:proofErr w:type="spellStart"/>
-            <w:r>
-              <w:rPr>
-                <w:sz w:val="28"/>
-                <w:szCs w:val="28"/>
-              </w:rPr>
-              <w:t>ใน</w:t>
-            </w:r>
-            <w:proofErr w:type="spellEnd"/>
-            <w:r>
-              <w:rPr>
-                <w:sz w:val="28"/>
-                <w:szCs w:val="28"/>
-              </w:rPr>
-              <w:t xml:space="preserve"> branch final-exam</w:t>
-            </w:r>
-          </w:p>
-          <w:p>
-            <w:pPr>
-              <w:pStyle w:val="a4"/>
-              <w:numPr>
-                <w:ilvl w:val="0"/>
-                <w:numId w:val="2"/>
-              </w:numPr>
-              <w:spacing w:after="20"/>
-            </w:pPr>
-            <w:proofErr w:type="spellStart"/>
-            <w:r>
-              <w:rPr>
-                <w:sz w:val="28"/>
-                <w:szCs w:val="28"/>
-              </w:rPr>
-              <w:t>ข้อความสีเทาในวงเล็บเป็นคำแนะนำ</w:t>
-            </w:r>
-            <w:proofErr w:type="spellEnd"/>
-            <w:r>
-              <w:rPr>
-                <w:sz w:val="28"/>
-                <w:szCs w:val="28"/>
-              </w:rPr>
-              <w:t xml:space="preserve"> </w:t>
-            </w:r>
-            <w:proofErr w:type="spellStart"/>
-            <w:r>
-              <w:rPr>
-                <w:sz w:val="28"/>
-                <w:szCs w:val="28"/>
-              </w:rPr>
-              <w:t>ลบออกก่อนส่ง</w:t>
-            </w:r>
-            <w:proofErr w:type="spellEnd"/>
-            <w:r>
-              <w:rPr>
-                <w:sz w:val="28"/>
-                <w:szCs w:val="28"/>
-              </w:rPr>
-              <w:t xml:space="preserve"> · </w:t>
-            </w:r>
-            <w:proofErr w:type="spellStart"/>
-            <w:r>
-              <w:rPr>
-                <w:sz w:val="28"/>
-                <w:szCs w:val="28"/>
-              </w:rPr>
-              <w:t>เพิ่มแถวในตารางได้</w:t>
-            </w:r>
-            <w:proofErr w:type="spellEnd"/>
-          </w:p>
-          <w:p>
-            <w:pPr>
-              <w:pStyle w:val="a4"/>
-              <w:numPr>
-                <w:ilvl w:val="0"/>
-                <w:numId w:val="2"/>
-              </w:numPr>
-              <w:spacing w:after="20"/>
-            </w:pPr>
-            <w:proofErr w:type="spellStart"/>
-            <w:r>
-              <w:rPr>
-                <w:sz w:val="28"/>
-                <w:szCs w:val="28"/>
-              </w:rPr>
-              <w:t>ทุกช่องอ้าง</w:t>
-            </w:r>
-            <w:proofErr w:type="spellEnd"/>
-            <w:r>
-              <w:rPr>
-                <w:sz w:val="28"/>
-                <w:szCs w:val="28"/>
-              </w:rPr>
-              <w:t xml:space="preserve"> ID </w:t>
-            </w:r>
-            <w:proofErr w:type="spellStart"/>
-            <w:r>
-              <w:rPr>
-                <w:sz w:val="28"/>
-                <w:szCs w:val="28"/>
-              </w:rPr>
-              <w:t>ของ</w:t>
-            </w:r>
-            <w:proofErr w:type="spellEnd"/>
-            <w:r>
-              <w:rPr>
-                <w:sz w:val="28"/>
-                <w:szCs w:val="28"/>
-              </w:rPr>
-              <w:t xml:space="preserve"> case </w:t>
-            </w:r>
-            <w:proofErr w:type="spellStart"/>
-            <w:r>
-              <w:rPr>
-                <w:sz w:val="28"/>
-                <w:szCs w:val="28"/>
-              </w:rPr>
-              <w:t>กลุ่ม</w:t>
-            </w:r>
-            <w:proofErr w:type="spellEnd"/>
-            <w:r>
-              <w:rPr>
-                <w:sz w:val="28"/>
-                <w:szCs w:val="28"/>
-              </w:rPr>
-              <w:t xml:space="preserve"> · </w:t>
-            </w:r>
-            <w:proofErr w:type="spellStart"/>
-            <w:r>
-              <w:rPr>
-                <w:sz w:val="28"/>
-                <w:szCs w:val="28"/>
-              </w:rPr>
-              <w:t>ค่าที่ไม่รู้เขียน</w:t>
-            </w:r>
-            <w:proofErr w:type="spellEnd"/>
-            <w:r>
-              <w:rPr>
-                <w:sz w:val="28"/>
-                <w:szCs w:val="28"/>
-              </w:rPr>
-              <w:t xml:space="preserve"> TBD </w:t>
-            </w:r>
-            <w:proofErr w:type="spellStart"/>
-            <w:r>
-              <w:rPr>
-                <w:sz w:val="28"/>
-                <w:szCs w:val="28"/>
-              </w:rPr>
-              <w:t>แล้วบันทึกเป็น</w:t>
-            </w:r>
-            <w:proofErr w:type="spellEnd"/>
-            <w:r>
-              <w:rPr>
-                <w:sz w:val="28"/>
-                <w:szCs w:val="28"/>
-              </w:rPr>
-              <w:t xml:space="preserve"> OI </w:t>
-            </w:r>
-            <w:proofErr w:type="spellStart"/>
-            <w:r>
-              <w:rPr>
-                <w:sz w:val="28"/>
-                <w:szCs w:val="28"/>
-              </w:rPr>
-              <w:t>หรือ</w:t>
-            </w:r>
-            <w:proofErr w:type="spellEnd"/>
-            <w:r>
-              <w:rPr>
-                <w:sz w:val="28"/>
-                <w:szCs w:val="28"/>
-              </w:rPr>
-              <w:t xml:space="preserve"> DD</w:t>
-            </w:r>
-          </w:p>
-        </w:tc>
-      </w:tr>
-    </w:tbl>
     <w:p>
       <w:pPr>
         <w:spacing w:after="120"/>
@@ -1039,7 +779,7 @@
     </w:tbl>
     <w:p>
       <w:pPr>
-        <w:pStyle w:val="1"/>
+        <w:pStyle w:val="Heading1"/>
         <w:keepNext/>
         <w:pBdr>
           <w:bottom w:val="single" w:sz="8" w:space="2" w:color="008699"/>
@@ -3218,6 +2958,7 @@
                 <w:sz w:val="28"/>
                 <w:szCs w:val="28"/>
               </w:rPr>
+              <w:lastRenderedPageBreak/>
               <w:t xml:space="preserve">Decision </w:t>
             </w:r>
             <w:proofErr w:type="spellStart"/>
@@ -3459,7 +3200,6 @@
                 <w:sz w:val="28"/>
                 <w:szCs w:val="28"/>
               </w:rPr>
-              <w:lastRenderedPageBreak/>
               <w:t>Next action</w:t>
             </w:r>
           </w:p>
@@ -3653,6 +3393,7 @@
           <w:sz w:val="30"/>
           <w:szCs w:val="30"/>
         </w:rPr>
+        <w:lastRenderedPageBreak/>
         <w:t xml:space="preserve">1.2 </w:t>
       </w:r>
       <w:proofErr w:type="spellStart"/>
@@ -3698,175 +3439,6 @@
           <w:szCs w:val="30"/>
         </w:rPr>
         <w:t>)</w:t>
-      </w:r>
-    </w:p>
-    <w:p>
-      <w:pPr>
-        <w:spacing w:after="100"/>
-      </w:pPr>
-      <w:r>
-        <w:rPr>
-          <w:i/>
-          <w:iCs/>
-          <w:color w:val="7F8C99"/>
-          <w:sz w:val="28"/>
-          <w:szCs w:val="28"/>
-        </w:rPr>
-        <w:t>(</w:t>
-      </w:r>
-      <w:proofErr w:type="spellStart"/>
-      <w:r>
-        <w:rPr>
-          <w:i/>
-          <w:iCs/>
-          <w:color w:val="7F8C99"/>
-          <w:sz w:val="28"/>
-          <w:szCs w:val="28"/>
-        </w:rPr>
-        <w:t>คำแนะนำ</w:t>
-      </w:r>
-      <w:proofErr w:type="spellEnd"/>
-      <w:r>
-        <w:rPr>
-          <w:i/>
-          <w:iCs/>
-          <w:color w:val="7F8C99"/>
-          <w:sz w:val="28"/>
-          <w:szCs w:val="28"/>
-        </w:rPr>
-        <w:t xml:space="preserve">: </w:t>
-      </w:r>
-      <w:proofErr w:type="spellStart"/>
-      <w:r>
-        <w:rPr>
-          <w:i/>
-          <w:iCs/>
-          <w:color w:val="7F8C99"/>
-          <w:sz w:val="28"/>
-          <w:szCs w:val="28"/>
-        </w:rPr>
-        <w:t>เดินจาก</w:t>
-      </w:r>
-      <w:proofErr w:type="spellEnd"/>
-      <w:r>
-        <w:rPr>
-          <w:i/>
-          <w:iCs/>
-          <w:color w:val="7F8C99"/>
-          <w:sz w:val="28"/>
-          <w:szCs w:val="28"/>
-        </w:rPr>
-        <w:t xml:space="preserve"> source → requirement → model → SRS → design </w:t>
-      </w:r>
-      <w:proofErr w:type="spellStart"/>
-      <w:r>
-        <w:rPr>
-          <w:i/>
-          <w:iCs/>
-          <w:color w:val="7F8C99"/>
-          <w:sz w:val="28"/>
-          <w:szCs w:val="28"/>
-        </w:rPr>
-        <w:t>ในแถวเดียว</w:t>
-      </w:r>
-      <w:proofErr w:type="spellEnd"/>
-      <w:r>
-        <w:rPr>
-          <w:i/>
-          <w:iCs/>
-          <w:color w:val="7F8C99"/>
-          <w:sz w:val="28"/>
-          <w:szCs w:val="28"/>
-        </w:rPr>
-        <w:t xml:space="preserve"> · </w:t>
-      </w:r>
-      <w:proofErr w:type="spellStart"/>
-      <w:r>
-        <w:rPr>
-          <w:i/>
-          <w:iCs/>
-          <w:color w:val="7F8C99"/>
-          <w:sz w:val="28"/>
-          <w:szCs w:val="28"/>
-        </w:rPr>
-        <w:t>ช่องสุดท้ายเขียน</w:t>
-      </w:r>
-      <w:proofErr w:type="spellEnd"/>
-      <w:r>
-        <w:rPr>
-          <w:i/>
-          <w:iCs/>
-          <w:color w:val="7F8C99"/>
-          <w:sz w:val="28"/>
-          <w:szCs w:val="28"/>
-        </w:rPr>
-        <w:t xml:space="preserve"> </w:t>
-      </w:r>
-      <w:proofErr w:type="spellStart"/>
-      <w:r>
-        <w:rPr>
-          <w:i/>
-          <w:iCs/>
-          <w:color w:val="7F8C99"/>
-          <w:sz w:val="28"/>
-          <w:szCs w:val="28"/>
-        </w:rPr>
-        <w:t>เพิ่ม</w:t>
-      </w:r>
-      <w:proofErr w:type="spellEnd"/>
-      <w:r>
-        <w:rPr>
-          <w:i/>
-          <w:iCs/>
-          <w:color w:val="7F8C99"/>
-          <w:sz w:val="28"/>
-          <w:szCs w:val="28"/>
-        </w:rPr>
-        <w:t xml:space="preserve"> / </w:t>
-      </w:r>
-      <w:proofErr w:type="spellStart"/>
-      <w:r>
-        <w:rPr>
-          <w:i/>
-          <w:iCs/>
-          <w:color w:val="7F8C99"/>
-          <w:sz w:val="28"/>
-          <w:szCs w:val="28"/>
-        </w:rPr>
-        <w:t>แก้</w:t>
-      </w:r>
-      <w:proofErr w:type="spellEnd"/>
-      <w:r>
-        <w:rPr>
-          <w:i/>
-          <w:iCs/>
-          <w:color w:val="7F8C99"/>
-          <w:sz w:val="28"/>
-          <w:szCs w:val="28"/>
-        </w:rPr>
-        <w:t xml:space="preserve"> / </w:t>
-      </w:r>
-      <w:proofErr w:type="spellStart"/>
-      <w:r>
-        <w:rPr>
-          <w:i/>
-          <w:iCs/>
-          <w:color w:val="7F8C99"/>
-          <w:sz w:val="28"/>
-          <w:szCs w:val="28"/>
-        </w:rPr>
-        <w:t>ไม่กระทบ</w:t>
-      </w:r>
-      <w:proofErr w:type="spellEnd"/>
-      <w:r>
-        <w:rPr>
-          <w:i/>
-          <w:iCs/>
-          <w:color w:val="7F8C99"/>
-          <w:sz w:val="28"/>
-          <w:szCs w:val="28"/>
-        </w:rPr>
-        <w:t xml:space="preserve"> / TBD / Cannot Verify)</w:t>
       </w:r>
     </w:p>
     <w:tbl>
@@ -5999,7 +5571,6 @@
                 <w:szCs w:val="28"/>
                 <w:cs/>
               </w:rPr>
-              <w:lastRenderedPageBreak/>
               <w:t>7</w:t>
             </w:r>
           </w:p>
@@ -6282,6 +5853,7 @@
                 <w:szCs w:val="28"/>
                 <w:cs/>
               </w:rPr>
+              <w:lastRenderedPageBreak/>
               <w:t>8</w:t>
             </w:r>
           </w:p>
@@ -6594,7 +6166,7 @@
     </w:p>
     <w:p>
       <w:pPr>
-        <w:pStyle w:val="1"/>
+        <w:pStyle w:val="Heading1"/>
         <w:keepNext/>
         <w:pageBreakBefore/>
         <w:pBdr>
@@ -8178,155 +7750,7 @@
           <w:sz w:val="30"/>
           <w:szCs w:val="30"/>
         </w:rPr>
-        <w:lastRenderedPageBreak/>
         <w:t>2.3 Acceptance Criteria (≥ 3)</w:t>
-      </w:r>
-    </w:p>
-    <w:p>
-      <w:pPr>
-        <w:spacing w:after="100"/>
-      </w:pPr>
-      <w:r>
-        <w:rPr>
-          <w:i/>
-          <w:iCs/>
-          <w:color w:val="7F8C99"/>
-          <w:sz w:val="28"/>
-          <w:szCs w:val="28"/>
-        </w:rPr>
-        <w:t>(</w:t>
-      </w:r>
-      <w:proofErr w:type="spellStart"/>
-      <w:r>
-        <w:rPr>
-          <w:i/>
-          <w:iCs/>
-          <w:color w:val="7F8C99"/>
-          <w:sz w:val="28"/>
-          <w:szCs w:val="28"/>
-        </w:rPr>
-        <w:t>คำแนะนำ</w:t>
-      </w:r>
-      <w:proofErr w:type="spellEnd"/>
-      <w:r>
-        <w:rPr>
-          <w:i/>
-          <w:iCs/>
-          <w:color w:val="7F8C99"/>
-          <w:sz w:val="28"/>
-          <w:szCs w:val="28"/>
-        </w:rPr>
-        <w:t xml:space="preserve">: </w:t>
-      </w:r>
-      <w:proofErr w:type="spellStart"/>
-      <w:r>
-        <w:rPr>
-          <w:i/>
-          <w:iCs/>
-          <w:color w:val="7F8C99"/>
-          <w:sz w:val="28"/>
-          <w:szCs w:val="28"/>
-        </w:rPr>
-        <w:t>ต้องมี</w:t>
-      </w:r>
-      <w:proofErr w:type="spellEnd"/>
-      <w:r>
-        <w:rPr>
-          <w:i/>
-          <w:iCs/>
-          <w:color w:val="7F8C99"/>
-          <w:sz w:val="28"/>
-          <w:szCs w:val="28"/>
-        </w:rPr>
-        <w:t xml:space="preserve"> 1 </w:t>
-      </w:r>
-      <w:proofErr w:type="spellStart"/>
-      <w:r>
-        <w:rPr>
-          <w:i/>
-          <w:iCs/>
-          <w:color w:val="7F8C99"/>
-          <w:sz w:val="28"/>
-          <w:szCs w:val="28"/>
-        </w:rPr>
-        <w:t>ข้อเรื่อง</w:t>
-      </w:r>
-      <w:proofErr w:type="spellEnd"/>
-      <w:r>
-        <w:rPr>
-          <w:i/>
-          <w:iCs/>
-          <w:color w:val="7F8C99"/>
-          <w:sz w:val="28"/>
-          <w:szCs w:val="28"/>
-        </w:rPr>
-        <w:t xml:space="preserve"> opt-in </w:t>
-      </w:r>
-      <w:proofErr w:type="spellStart"/>
-      <w:r>
-        <w:rPr>
-          <w:i/>
-          <w:iCs/>
-          <w:color w:val="7F8C99"/>
-          <w:sz w:val="28"/>
-          <w:szCs w:val="28"/>
-        </w:rPr>
-        <w:t>หรือข้อมูลส่วนบุคคล</w:t>
-      </w:r>
-      <w:proofErr w:type="spellEnd"/>
-      <w:r>
-        <w:rPr>
-          <w:i/>
-          <w:iCs/>
-          <w:color w:val="7F8C99"/>
-          <w:sz w:val="28"/>
-          <w:szCs w:val="28"/>
-        </w:rPr>
-        <w:t xml:space="preserve"> </w:t>
-      </w:r>
-      <w:proofErr w:type="spellStart"/>
-      <w:r>
-        <w:rPr>
-          <w:i/>
-          <w:iCs/>
-          <w:color w:val="7F8C99"/>
-          <w:sz w:val="28"/>
-          <w:szCs w:val="28"/>
-        </w:rPr>
-        <w:t>และ</w:t>
-      </w:r>
-      <w:proofErr w:type="spellEnd"/>
-      <w:r>
-        <w:rPr>
-          <w:i/>
-          <w:iCs/>
-          <w:color w:val="7F8C99"/>
-          <w:sz w:val="28"/>
-          <w:szCs w:val="28"/>
-        </w:rPr>
-        <w:t xml:space="preserve"> 1 </w:t>
-      </w:r>
-      <w:proofErr w:type="spellStart"/>
-      <w:r>
-        <w:rPr>
-          <w:i/>
-          <w:iCs/>
-          <w:color w:val="7F8C99"/>
-          <w:sz w:val="28"/>
-          <w:szCs w:val="28"/>
-        </w:rPr>
-        <w:t>ข้อเรื่องเตือนตามเวลา</w:t>
-      </w:r>
-      <w:proofErr w:type="spellEnd"/>
-      <w:r>
-        <w:rPr>
-          <w:i/>
-          <w:iCs/>
-          <w:color w:val="7F8C99"/>
-          <w:sz w:val="28"/>
-          <w:szCs w:val="28"/>
-        </w:rPr>
-        <w:t>)</w:t>
       </w:r>
     </w:p>
     <w:tbl>
@@ -11936,7 +11360,7 @@
     </w:p>
     <w:p>
       <w:pPr>
-        <w:pStyle w:val="1"/>
+        <w:pStyle w:val="Heading1"/>
         <w:keepNext/>
         <w:pageBreakBefore/>
         <w:pBdr>
@@ -12003,7 +11427,7 @@
           <w:sz w:val="28"/>
           <w:szCs w:val="28"/>
         </w:rPr>
-        <w:t>ทำไมไม่ใช่ทุกข้อเป็น Build now: "ทุกอย่างต้องเป็น Build now" เป็นความเห็นของผู้เสนอ — ช่องทางภายนอกยังไม่รู้ว่าคืออะไร (OQ-10) ขัดกับ Out of Scope §1.3 และถ้าสร้างตอนนี้ต้องเดาผู้ให้บริการ ซึ่งขัด CON-04 · ส่วนที่ทำได้ทันทีโดยไม่ต้องเดา (แจ้งในระบบ · เตือนงานค้าง · ข้อความไม่</w:t>
+        <w:t>ทำไมไม่ใช่ทุกข้อเป็น Build now: "ทุกอย่างต้องเป็น Build now" เป็นความเห็นของผู้เสนอ — ช่องทางภายนอกยังไม่รู้ว่าคืออะไร (OQ-10) ขัดกับ Out of Scope §1.3 และถ้าสร้างตอนนี้ต้องเดาผู้ให้บริการ ซึ่งขัด CON-04 · ส่วนที่ทำได้ทันทีโดยไม่ต้องเดา (แจ้งใน</w:t>
       </w:r>
       <w:proofErr w:type="spellStart"/>
       <w:r>
@@ -12012,7 +11436,43 @@
           <w:sz w:val="28"/>
           <w:szCs w:val="28"/>
         </w:rPr>
-        <w:t>เกินจำเป็น</w:t>
+        <w:t>ระบบ</w:t>
+      </w:r>
+      <w:proofErr w:type="spellEnd"/>
+      <w:r>
+        <w:rPr>
+          <w:iCs/>
+          <w:sz w:val="28"/>
+          <w:szCs w:val="28"/>
+        </w:rPr>
+        <w:t xml:space="preserve"> · </w:t>
+      </w:r>
+      <w:proofErr w:type="spellStart"/>
+      <w:r>
+        <w:rPr>
+          <w:iCs/>
+          <w:sz w:val="28"/>
+          <w:szCs w:val="28"/>
+        </w:rPr>
+        <w:t>เตือนงานค้าง</w:t>
+      </w:r>
+      <w:proofErr w:type="spellEnd"/>
+      <w:r>
+        <w:rPr>
+          <w:iCs/>
+          <w:sz w:val="28"/>
+          <w:szCs w:val="28"/>
+        </w:rPr>
+        <w:t xml:space="preserve"> · </w:t>
+      </w:r>
+      <w:proofErr w:type="spellStart"/>
+      <w:r>
+        <w:rPr>
+          <w:iCs/>
+          <w:sz w:val="28"/>
+          <w:szCs w:val="28"/>
+        </w:rPr>
+        <w:t>ข้อความไม่เกินจำเป็น</w:t>
       </w:r>
       <w:proofErr w:type="spellEnd"/>
       <w:r>
@@ -12778,6 +12238,7 @@
           <w:sz w:val="30"/>
           <w:szCs w:val="30"/>
         </w:rPr>
+        <w:lastRenderedPageBreak/>
         <w:t>3.2 Driver check</w:t>
       </w:r>
     </w:p>
@@ -14587,7 +14048,6 @@
           <w:sz w:val="30"/>
           <w:szCs w:val="30"/>
         </w:rPr>
-        <w:lastRenderedPageBreak/>
         <w:t>3.4 Open decisions</w:t>
       </w:r>
     </w:p>
@@ -15492,7 +14952,7 @@
     </w:p>
     <w:p>
       <w:pPr>
-        <w:pStyle w:val="1"/>
+        <w:pStyle w:val="Heading1"/>
         <w:keepNext/>
         <w:pBdr>
           <w:bottom w:val="single" w:sz="8" w:space="2" w:color="008699"/>
@@ -15516,131 +14976,6 @@
       </w:r>
       <w:proofErr w:type="spellEnd"/>
       <w:r>
-        <w:t>)</w:t>
-      </w:r>
-    </w:p>
-    <w:p>
-      <w:pPr>
-        <w:spacing w:after="100"/>
-      </w:pPr>
-      <w:r>
-        <w:rPr>
-          <w:i/>
-          <w:iCs/>
-          <w:color w:val="7F8C99"/>
-          <w:sz w:val="28"/>
-          <w:szCs w:val="28"/>
-        </w:rPr>
-        <w:t>(</w:t>
-      </w:r>
-      <w:proofErr w:type="spellStart"/>
-      <w:r>
-        <w:rPr>
-          <w:i/>
-          <w:iCs/>
-          <w:color w:val="7F8C99"/>
-          <w:sz w:val="28"/>
-          <w:szCs w:val="28"/>
-        </w:rPr>
-        <w:t>คำแนะนำ</w:t>
-      </w:r>
-      <w:proofErr w:type="spellEnd"/>
-      <w:r>
-        <w:rPr>
-          <w:i/>
-          <w:iCs/>
-          <w:color w:val="7F8C99"/>
-          <w:sz w:val="28"/>
-          <w:szCs w:val="28"/>
-        </w:rPr>
-        <w:t xml:space="preserve">: </w:t>
-      </w:r>
-      <w:proofErr w:type="spellStart"/>
-      <w:r>
-        <w:rPr>
-          <w:i/>
-          <w:iCs/>
-          <w:color w:val="7F8C99"/>
-          <w:sz w:val="28"/>
-          <w:szCs w:val="28"/>
-        </w:rPr>
-        <w:t>ภาพที่</w:t>
-      </w:r>
-      <w:proofErr w:type="spellEnd"/>
-      <w:r>
-        <w:rPr>
-          <w:i/>
-          <w:iCs/>
-          <w:color w:val="7F8C99"/>
-          <w:sz w:val="28"/>
-          <w:szCs w:val="28"/>
-        </w:rPr>
-        <w:t xml:space="preserve"> 1 (Context) </w:t>
-      </w:r>
-      <w:proofErr w:type="spellStart"/>
-      <w:r>
-        <w:rPr>
-          <w:i/>
-          <w:iCs/>
-          <w:color w:val="7F8C99"/>
-          <w:sz w:val="28"/>
-          <w:szCs w:val="28"/>
-        </w:rPr>
-        <w:t>และภาพที่</w:t>
-      </w:r>
-      <w:proofErr w:type="spellEnd"/>
-      <w:r>
-        <w:rPr>
-          <w:i/>
-          <w:iCs/>
-          <w:color w:val="7F8C99"/>
-          <w:sz w:val="28"/>
-          <w:szCs w:val="28"/>
-        </w:rPr>
-        <w:t xml:space="preserve"> 2 (Container) </w:t>
-      </w:r>
-      <w:proofErr w:type="spellStart"/>
-      <w:r>
-        <w:rPr>
-          <w:i/>
-          <w:iCs/>
-          <w:color w:val="7F8C99"/>
-          <w:sz w:val="28"/>
-          <w:szCs w:val="28"/>
-        </w:rPr>
-        <w:t>อยู่ท้ายหัวข้อ</w:t>
-      </w:r>
-      <w:proofErr w:type="spellEnd"/>
-      <w:r>
-        <w:rPr>
-          <w:i/>
-          <w:iCs/>
-          <w:color w:val="7F8C99"/>
-          <w:sz w:val="28"/>
-          <w:szCs w:val="28"/>
-        </w:rPr>
-        <w:t xml:space="preserve"> G4 — </w:t>
-      </w:r>
-      <w:proofErr w:type="spellStart"/>
-      <w:r>
-        <w:rPr>
-          <w:i/>
-          <w:iCs/>
-          <w:color w:val="7F8C99"/>
-          <w:sz w:val="28"/>
-          <w:szCs w:val="28"/>
-        </w:rPr>
-        <w:t>เขียนสรุปสิ่งที่เปลี่ยนไว้ตรงนี้</w:t>
-      </w:r>
-      <w:proofErr w:type="spellEnd"/>
-      <w:r>
-        <w:rPr>
-          <w:i/>
-          <w:iCs/>
-          <w:color w:val="7F8C99"/>
-          <w:sz w:val="28"/>
-          <w:szCs w:val="28"/>
-        </w:rPr>
         <w:t>)</w:t>
       </w:r>
     </w:p>
@@ -15942,7 +15277,6 @@
           <w:sz w:val="30"/>
           <w:szCs w:val="30"/>
         </w:rPr>
-        <w:lastRenderedPageBreak/>
         <w:t xml:space="preserve">4.3 </w:t>
       </w:r>
       <w:proofErr w:type="spellStart"/>
@@ -19663,6 +18997,7 @@
           </w:tcPr>
           <w:p>
             <w:r>
+              <w:lastRenderedPageBreak/>
               <w:t xml:space="preserve">S4 </w:t>
             </w:r>
             <w:r>
@@ -20100,7 +19435,7 @@
     </w:p>
     <w:p>
       <w:pPr>
-        <w:pStyle w:val="1"/>
+        <w:pStyle w:val="Heading1"/>
         <w:keepNext/>
         <w:pageBreakBefore/>
         <w:pBdr>
@@ -20152,23 +19487,20 @@
         <w:t>:</w:t>
       </w:r>
       <w:r>
-        <w:t xml:space="preserve"> </w:t>
-      </w:r>
+        <w:t xml:space="preserve"> (✓) CR-FX-02A </w:t>
+      </w:r>
+      <w:proofErr w:type="spellStart"/>
+      <w:r>
+        <w:t>ใช้งานหน้างาน</w:t>
+      </w:r>
+      <w:proofErr w:type="spellEnd"/>
       <w:proofErr w:type="gramStart"/>
       <w:r>
-        <w:t>(✓)</w:t>
+        <w:t xml:space="preserve">   (</w:t>
       </w:r>
       <w:proofErr w:type="gramEnd"/>
       <w:r>
-        <w:t xml:space="preserve"> CR-FX-02A </w:t>
-      </w:r>
-      <w:proofErr w:type="spellStart"/>
-      <w:r>
-        <w:t>ใช้งานหน้างาน</w:t>
-      </w:r>
-      <w:proofErr w:type="spellEnd"/>
-      <w:r>
-        <w:t xml:space="preserve">   ( ) CR-FX-02B </w:t>
+        <w:t xml:space="preserve"> ) CR-FX-02B </w:t>
       </w:r>
       <w:proofErr w:type="spellStart"/>
       <w:r>
@@ -20197,7 +19529,15 @@
         <w:t>:</w:t>
       </w:r>
       <w:r>
-        <w:t xml:space="preserve"> ใกล้กับ case มากกว่า: Case Card ของกลุ่มมีคำถามค้างอยู่แล้วว่าควรระบุตำแหน่งอุปกรณ์ด้วยการสแกน QR Code ที่ติดบนโต๊ะหรือเครื่องคอมพิวเตอร์หรือไม่ และงานซ่อมของ CLMRS เกิดที่หน้างานจริง (ห้องเรียน · ห้องปฏิบัติการ)</w:t>
+        <w:t xml:space="preserve"> </w:t>
+      </w:r>
+      <w:proofErr w:type="spellStart"/>
+      <w:r>
+        <w:t>ใกล้กับ</w:t>
+      </w:r>
+      <w:proofErr w:type="spellEnd"/>
+      <w:r>
+        <w:t xml:space="preserve"> case มากกว่า: Case Card ของกลุ่มมีคำถามค้างอยู่แล้วว่าควรระบุตำแหน่งอุปกรณ์ด้วยการสแกน QR Code ที่ติดบนโต๊ะหรือเครื่องคอมพิวเตอร์หรือไม่ และงานซ่อมของ CLMRS เกิดที่หน้างานจริง (ห้องเรียน · ห้องปฏิบัติการ)</w:t>
       </w:r>
     </w:p>
     <w:p>
@@ -20308,7 +19648,6 @@
               </w:rPr>
               <w:t>CR-FX-02A</w:t>
             </w:r>
-            <w:proofErr w:type="gramStart"/>
             <w:r>
               <w:rPr>
                 <w:b/>
@@ -20317,39 +19656,9 @@
                 <w:sz w:val="28"/>
                 <w:szCs w:val="28"/>
               </w:rPr>
-              <w:t xml:space="preserve">   </w:t>
-            </w:r>
-            <w:proofErr w:type="gramEnd"/>
-            <w:r>
-              <w:rPr>
-                <w:b/>
-                <w:bCs/>
-                <w:color w:val="FFFFFF"/>
-                <w:sz w:val="28"/>
-                <w:szCs w:val="28"/>
-              </w:rPr>
-              <w:t>ใช้งานหน้างาน: สแกน QR + สัญญาณไม่เสถียร</w:t>
-            </w:r>
-            <w:proofErr w:type="spellStart"/>
-            <w:r>
-              <w:rPr>
-                <w:b/>
-                <w:bCs/>
-                <w:color w:val="FFFFFF"/>
-                <w:sz w:val="28"/>
-                <w:szCs w:val="28"/>
-              </w:rPr>
-            </w:r>
-            <w:proofErr w:type="spellEnd"/>
-            <w:r>
-              <w:rPr>
-                <w:b/>
-                <w:bCs/>
-                <w:color w:val="FFFFFF"/>
-                <w:sz w:val="28"/>
-                <w:szCs w:val="28"/>
-              </w:rPr>
-            </w:r>
+              <w:t xml:space="preserve">   ใช้งานหน้างาน: สแกน QR + สัญญาณไม่เสถียร</w:t>
+            </w:r>
+            <w:proofErr w:type="gramStart"/>
             <w:r>
               <w:rPr>
                 <w:b/>
@@ -20358,7 +19667,18 @@
                 <w:sz w:val="26"/>
                 <w:szCs w:val="26"/>
               </w:rPr>
-              <w:t xml:space="preserve">   [Pending]</w:t>
+              <w:t xml:space="preserve">   [</w:t>
+            </w:r>
+            <w:proofErr w:type="gramEnd"/>
+            <w:r>
+              <w:rPr>
+                <w:b/>
+                <w:bCs/>
+                <w:color w:val="F2C46D"/>
+                <w:sz w:val="26"/>
+                <w:szCs w:val="26"/>
+              </w:rPr>
+              <w:t>Pending]</w:t>
             </w:r>
           </w:p>
         </w:tc>
@@ -20841,6 +20161,7 @@
           <w:sz w:val="30"/>
           <w:szCs w:val="30"/>
         </w:rPr>
+        <w:lastRenderedPageBreak/>
         <w:t>5.2 Decision card</w:t>
       </w:r>
     </w:p>
@@ -20902,7 +20223,6 @@
               </w:rPr>
               <w:t>DEC-03</w:t>
             </w:r>
-            <w:proofErr w:type="gramStart"/>
             <w:r>
               <w:rPr>
                 <w:b/>
@@ -20914,7 +20234,6 @@
               <w:t xml:space="preserve">   </w:t>
             </w:r>
             <w:proofErr w:type="spellStart"/>
-            <w:proofErr w:type="gramEnd"/>
             <w:r>
               <w:rPr>
                 <w:b/>
@@ -20923,7 +20242,7 @@
                 <w:sz w:val="28"/>
                 <w:szCs w:val="28"/>
               </w:rPr>
-              <w:t>ไม่เพิ่ม container สำหรับ QR และสัญญาณไม่เสถียร</w:t>
+              <w:t>ไม่เพิ่ม</w:t>
             </w:r>
             <w:proofErr w:type="spellEnd"/>
             <w:r>
@@ -20934,7 +20253,43 @@
                 <w:sz w:val="28"/>
                 <w:szCs w:val="28"/>
               </w:rPr>
-            </w:r>
+              <w:t xml:space="preserve"> container </w:t>
+            </w:r>
+            <w:proofErr w:type="spellStart"/>
+            <w:r>
+              <w:rPr>
+                <w:b/>
+                <w:bCs/>
+                <w:color w:val="FFFFFF"/>
+                <w:sz w:val="28"/>
+                <w:szCs w:val="28"/>
+              </w:rPr>
+              <w:t>สำหรับ</w:t>
+            </w:r>
+            <w:proofErr w:type="spellEnd"/>
+            <w:r>
+              <w:rPr>
+                <w:b/>
+                <w:bCs/>
+                <w:color w:val="FFFFFF"/>
+                <w:sz w:val="28"/>
+                <w:szCs w:val="28"/>
+              </w:rPr>
+              <w:t xml:space="preserve"> QR </w:t>
+            </w:r>
+            <w:proofErr w:type="spellStart"/>
+            <w:r>
+              <w:rPr>
+                <w:b/>
+                <w:bCs/>
+                <w:color w:val="FFFFFF"/>
+                <w:sz w:val="28"/>
+                <w:szCs w:val="28"/>
+              </w:rPr>
+              <w:t>และสัญญาณไม่เสถียร</w:t>
+            </w:r>
+            <w:proofErr w:type="spellEnd"/>
+            <w:proofErr w:type="gramStart"/>
             <w:r>
               <w:rPr>
                 <w:b/>
@@ -20943,7 +20298,18 @@
                 <w:sz w:val="26"/>
                 <w:szCs w:val="26"/>
               </w:rPr>
-              <w:t xml:space="preserve">   [Proposed]</w:t>
+              <w:t xml:space="preserve">   [</w:t>
+            </w:r>
+            <w:proofErr w:type="gramEnd"/>
+            <w:r>
+              <w:rPr>
+                <w:b/>
+                <w:bCs/>
+                <w:color w:val="F2C46D"/>
+                <w:sz w:val="26"/>
+                <w:szCs w:val="26"/>
+              </w:rPr>
+              <w:t>Proposed]</w:t>
             </w:r>
           </w:p>
         </w:tc>
@@ -21340,10 +20706,10 @@
         <w:tblLook w:val="0000" w:firstRow="0" w:lastRow="0" w:firstColumn="0" w:lastColumn="0" w:noHBand="0" w:noVBand="0"/>
       </w:tblPr>
       <w:tblGrid>
-        <w:gridCol w:w="1542"/>
-        <w:gridCol w:w="2698"/>
-        <w:gridCol w:w="2698"/>
-        <w:gridCol w:w="2700"/>
+        <w:gridCol w:w="1238"/>
+        <w:gridCol w:w="3012"/>
+        <w:gridCol w:w="2635"/>
+        <w:gridCol w:w="2753"/>
       </w:tblGrid>
       <w:tr>
         <w:trPr>
@@ -21987,7 +21353,7 @@
     </w:p>
     <w:p>
       <w:pPr>
-        <w:pStyle w:val="1"/>
+        <w:pStyle w:val="Heading1"/>
         <w:keepNext/>
         <w:pageBreakBefore/>
         <w:pBdr>
@@ -22048,7 +21414,7 @@
           <w:rFonts w:ascii="Segoe UI Symbol" w:eastAsia="Segoe UI Symbol" w:hAnsi="Segoe UI Symbol" w:cs="Segoe UI Symbol"/>
           <w:color w:val="5A6B7C"/>
         </w:rPr>
-        <w:t>☐</w:t>
+        <w:t>☑</w:t>
       </w:r>
       <w:r>
         <w:t xml:space="preserve">  </w:t>
@@ -22096,7 +21462,7 @@
           <w:rFonts w:ascii="Segoe UI Symbol" w:eastAsia="Segoe UI Symbol" w:hAnsi="Segoe UI Symbol" w:cs="Segoe UI Symbol"/>
           <w:color w:val="5A6B7C"/>
         </w:rPr>
-        <w:t>☐</w:t>
+        <w:t>☑</w:t>
       </w:r>
       <w:r>
         <w:t xml:space="preserve">  </w:t>
@@ -22139,7 +21505,7 @@
           <w:rFonts w:ascii="Segoe UI Symbol" w:eastAsia="Segoe UI Symbol" w:hAnsi="Segoe UI Symbol" w:cs="Segoe UI Symbol"/>
           <w:color w:val="5A6B7C"/>
         </w:rPr>
-        <w:t>☐</w:t>
+        <w:t>☑</w:t>
       </w:r>
       <w:r>
         <w:t xml:space="preserve">  </w:t>
@@ -22179,7 +21545,7 @@
           <w:rFonts w:ascii="Segoe UI Symbol" w:eastAsia="Segoe UI Symbol" w:hAnsi="Segoe UI Symbol" w:cs="Segoe UI Symbol"/>
           <w:color w:val="5A6B7C"/>
         </w:rPr>
-        <w:t>☐</w:t>
+        <w:t>☑</w:t>
       </w:r>
       <w:r>
         <w:t xml:space="preserve">  </w:t>
@@ -22227,7 +21593,7 @@
           <w:rFonts w:ascii="Segoe UI Symbol" w:eastAsia="Segoe UI Symbol" w:hAnsi="Segoe UI Symbol" w:cs="Segoe UI Symbol"/>
           <w:color w:val="5A6B7C"/>
         </w:rPr>
-        <w:t>☐</w:t>
+        <w:t>☑</w:t>
       </w:r>
       <w:r>
         <w:t xml:space="preserve">  </w:t>
@@ -22282,7 +21648,7 @@
           <w:rFonts w:ascii="Segoe UI Symbol" w:eastAsia="Segoe UI Symbol" w:hAnsi="Segoe UI Symbol" w:cs="Segoe UI Symbol"/>
           <w:color w:val="5A6B7C"/>
         </w:rPr>
-        <w:t>☐</w:t>
+        <w:t>☑</w:t>
       </w:r>
       <w:r>
         <w:t xml:space="preserve">  </w:t>
@@ -22488,6 +21854,12 @@
             <w:pPr>
               <w:keepNext/>
             </w:pPr>
+            <w:r>
+              <w:rPr>
+                <w:sz w:val="28"/>
+              </w:rPr>
+              <w:t>Claude (Anthropic)</w:t>
+            </w:r>
           </w:p>
         </w:tc>
         <w:tc>
@@ -22511,6 +21883,114 @@
             <w:pPr>
               <w:keepNext/>
             </w:pPr>
+            <w:proofErr w:type="spellStart"/>
+            <w:r>
+              <w:rPr>
+                <w:sz w:val="28"/>
+              </w:rPr>
+              <w:t>ร่าง</w:t>
+            </w:r>
+            <w:r>
+              <w:rPr>
+                <w:sz w:val="28"/>
+                <w:szCs w:val="28"/>
+              </w:rPr>
+              <w:t>ข้อความ</w:t>
+            </w:r>
+            <w:proofErr w:type="spellEnd"/>
+            <w:r>
+              <w:rPr>
+                <w:sz w:val="28"/>
+                <w:szCs w:val="28"/>
+              </w:rPr>
+              <w:t xml:space="preserve"> G1 · </w:t>
+            </w:r>
+            <w:r>
+              <w:rPr>
+                <w:sz w:val="28"/>
+                <w:szCs w:val="28"/>
+                <w:cs/>
+              </w:rPr>
+              <w:t>ตรวจทานและแนะนำ</w:t>
+            </w:r>
+            <w:r>
+              <w:rPr>
+                <w:rFonts w:hint="cs"/>
+                <w:sz w:val="28"/>
+                <w:szCs w:val="28"/>
+                <w:cs/>
+              </w:rPr>
+              <w:t xml:space="preserve"> </w:t>
+            </w:r>
+            <w:r>
+              <w:rPr>
+                <w:sz w:val="28"/>
+                <w:szCs w:val="28"/>
+              </w:rPr>
+              <w:t xml:space="preserve">G2–G3 · G5 · </w:t>
+            </w:r>
+            <w:proofErr w:type="spellStart"/>
+            <w:r>
+              <w:rPr>
+                <w:sz w:val="28"/>
+                <w:szCs w:val="28"/>
+              </w:rPr>
+              <w:t>ช่วยไล่ตรวจชื่อ</w:t>
+            </w:r>
+            <w:proofErr w:type="spellEnd"/>
+            <w:r>
+              <w:rPr>
+                <w:sz w:val="28"/>
+                <w:szCs w:val="28"/>
+              </w:rPr>
+              <w:t xml:space="preserve"> container / actor / ID </w:t>
+            </w:r>
+            <w:proofErr w:type="spellStart"/>
+            <w:r>
+              <w:rPr>
+                <w:sz w:val="28"/>
+                <w:szCs w:val="28"/>
+              </w:rPr>
+              <w:t>ให้ตรงกันใน</w:t>
+            </w:r>
+            <w:proofErr w:type="spellEnd"/>
+            <w:r>
+              <w:rPr>
+                <w:sz w:val="28"/>
+                <w:szCs w:val="28"/>
+              </w:rPr>
+              <w:t xml:space="preserve"> G6 · </w:t>
+            </w:r>
+            <w:proofErr w:type="spellStart"/>
+            <w:r>
+              <w:rPr>
+                <w:sz w:val="28"/>
+                <w:szCs w:val="28"/>
+              </w:rPr>
+              <w:t>ร่างตาราง</w:t>
+            </w:r>
+            <w:proofErr w:type="spellEnd"/>
+            <w:r>
+              <w:rPr>
+                <w:sz w:val="28"/>
+                <w:szCs w:val="28"/>
+              </w:rPr>
+              <w:t xml:space="preserve"> ID</w:t>
+            </w:r>
+            <w:r>
+              <w:rPr>
+                <w:sz w:val="28"/>
+              </w:rPr>
+              <w:t xml:space="preserve"> </w:t>
+            </w:r>
+            <w:proofErr w:type="spellStart"/>
+            <w:r>
+              <w:rPr>
+                <w:sz w:val="28"/>
+              </w:rPr>
+              <w:t>ที่กลุ่มใช้ประสานงาน</w:t>
+            </w:r>
+            <w:proofErr w:type="spellEnd"/>
           </w:p>
         </w:tc>
         <w:tc>
@@ -22534,6 +22014,12 @@
             <w:pPr>
               <w:keepNext/>
             </w:pPr>
+            <w:r>
+              <w:rPr>
+                <w:sz w:val="28"/>
+              </w:rPr>
+              <w:t>ผู้ใช้แต่ละส่วนเปิดตรวจ ID กับ SRS v2.1 · W06 · W08 ของกลุ่มเองก่อนวางลง Word · แก้จุดที่ไม่ตรง (เช่น AC-5 → AC-15 · OI- → OQ-) · รายละเอียดแต่ละครั้งอยู่ใน final-exam/ai-use-log.md</w:t>
+            </w:r>
           </w:p>
         </w:tc>
       </w:tr>
@@ -22914,6 +22400,12 @@
             <w:pPr>
               <w:keepNext/>
             </w:pPr>
+            <w:r>
+              <w:rPr>
+                <w:sz w:val="28"/>
+              </w:rPr>
+              <w:t>นายสันติ ปัญญาหน้อย 68543210077-2</w:t>
+            </w:r>
           </w:p>
         </w:tc>
         <w:tc>
@@ -22937,6 +22429,12 @@
             <w:pPr>
               <w:keepNext/>
             </w:pPr>
+            <w:r>
+              <w:rPr>
+                <w:sz w:val="28"/>
+              </w:rPr>
+              <w:t>G2 (2.1–2.5) · G3 (3.1–3.4)</w:t>
+            </w:r>
           </w:p>
         </w:tc>
         <w:tc>
@@ -22960,6 +22458,12 @@
             <w:pPr>
               <w:keepNext/>
             </w:pPr>
+            <w:r>
+              <w:rPr>
+                <w:sz w:val="28"/>
+              </w:rPr>
+              <w:t>commit 95a6a6d (บัญชี Aonney) · ตาราง 4–12 ในไฟล์นี้</w:t>
+            </w:r>
           </w:p>
         </w:tc>
       </w:tr>
@@ -22989,6 +22493,12 @@
             <w:pPr>
               <w:keepNext/>
             </w:pPr>
+            <w:r>
+              <w:rPr>
+                <w:sz w:val="28"/>
+              </w:rPr>
+              <w:t>นายธีรนัย ไชยกันทะ 68543210066-5</w:t>
+            </w:r>
           </w:p>
         </w:tc>
         <w:tc>
@@ -23012,6 +22522,12 @@
             <w:pPr>
               <w:keepNext/>
             </w:pPr>
+            <w:r>
+              <w:rPr>
+                <w:sz w:val="28"/>
+              </w:rPr>
+              <w:t>G1 · G5 · G6 · รวมไฟล์ Word · แก้ G2–G3 · ใบส่งงาน · PR</w:t>
+            </w:r>
           </w:p>
         </w:tc>
         <w:tc>
@@ -23035,6 +22551,12 @@
             <w:pPr>
               <w:keepNext/>
             </w:pPr>
+            <w:r>
+              <w:rPr>
+                <w:sz w:val="28"/>
+              </w:rPr>
+              <w:t>commit 7341e01 · 1bb0227 · b3bc263 · 4d99719 · a94302e · ตาราง 1–3 · 20–24</w:t>
+            </w:r>
           </w:p>
         </w:tc>
       </w:tr>
@@ -23064,6 +22586,12 @@
             <w:pPr>
               <w:keepNext/>
             </w:pPr>
+            <w:r>
+              <w:rPr>
+                <w:sz w:val="28"/>
+              </w:rPr>
+              <w:t>นายบูรพา ประทีปรัตน์ 68543210032-7</w:t>
+            </w:r>
           </w:p>
         </w:tc>
         <w:tc>
@@ -23087,6 +22615,12 @@
             <w:pPr>
               <w:keepNext/>
             </w:pPr>
+            <w:r>
+              <w:rPr>
+                <w:sz w:val="28"/>
+              </w:rPr>
+              <w:t>G4 (4.1–4.6) · Context / Container diagram</w:t>
+            </w:r>
           </w:p>
         </w:tc>
         <w:tc>
@@ -23110,70 +22644,13 @@
             <w:pPr>
               <w:keepNext/>
             </w:pPr>
-          </w:p>
-        </w:tc>
-      </w:tr>
-      <w:tr>
-        <w:trPr>
-          <w:cantSplit/>
-          <w:trHeight w:val="624"/>
-        </w:trPr>
-        <w:tc>
-          <w:tcPr>
-            <w:tcW w:w="2891" w:type="dxa"/>
-            <w:tcBorders>
-              <w:top w:val="single" w:sz="4" w:space="0" w:color="C9D3DC"/>
-              <w:left w:val="single" w:sz="4" w:space="0" w:color="C9D3DC"/>
-              <w:bottom w:val="single" w:sz="4" w:space="0" w:color="C9D3DC"/>
-              <w:right w:val="single" w:sz="4" w:space="0" w:color="C9D3DC"/>
-            </w:tcBorders>
-            <w:shd w:val="clear" w:color="auto" w:fill="F1F7FA"/>
-            <w:tcMar>
-              <w:top w:w="40" w:type="dxa"/>
-              <w:left w:w="90" w:type="dxa"/>
-              <w:bottom w:w="40" w:type="dxa"/>
-              <w:right w:w="90" w:type="dxa"/>
-            </w:tcMar>
-          </w:tcPr>
-          <w:p/>
-        </w:tc>
-        <w:tc>
-          <w:tcPr>
-            <w:tcW w:w="3373" w:type="dxa"/>
-            <w:tcBorders>
-              <w:top w:val="single" w:sz="4" w:space="0" w:color="C9D3DC"/>
-              <w:left w:val="single" w:sz="4" w:space="0" w:color="C9D3DC"/>
-              <w:bottom w:val="single" w:sz="4" w:space="0" w:color="C9D3DC"/>
-              <w:right w:val="single" w:sz="4" w:space="0" w:color="C9D3DC"/>
-            </w:tcBorders>
-            <w:shd w:val="clear" w:color="auto" w:fill="F1F7FA"/>
-            <w:tcMar>
-              <w:top w:w="40" w:type="dxa"/>
-              <w:left w:w="90" w:type="dxa"/>
-              <w:bottom w:w="40" w:type="dxa"/>
-              <w:right w:w="90" w:type="dxa"/>
-            </w:tcMar>
-          </w:tcPr>
-          <w:p/>
-        </w:tc>
-        <w:tc>
-          <w:tcPr>
-            <w:tcW w:w="3374" w:type="dxa"/>
-            <w:tcBorders>
-              <w:top w:val="single" w:sz="4" w:space="0" w:color="C9D3DC"/>
-              <w:left w:val="single" w:sz="4" w:space="0" w:color="C9D3DC"/>
-              <w:bottom w:val="single" w:sz="4" w:space="0" w:color="C9D3DC"/>
-              <w:right w:val="single" w:sz="4" w:space="0" w:color="C9D3DC"/>
-            </w:tcBorders>
-            <w:shd w:val="clear" w:color="auto" w:fill="F1F7FA"/>
-            <w:tcMar>
-              <w:top w:w="40" w:type="dxa"/>
-              <w:left w:w="90" w:type="dxa"/>
-              <w:bottom w:w="40" w:type="dxa"/>
-              <w:right w:w="90" w:type="dxa"/>
-            </w:tcMar>
-          </w:tcPr>
-          <w:p/>
+            <w:r>
+              <w:rPr>
+                <w:sz w:val="28"/>
+              </w:rPr>
+              <w:t>commit 35022aa · c235400 · final-exam/diagrams/ · ตาราง 13–19</w:t>
+            </w:r>
+          </w:p>
         </w:tc>
       </w:tr>
     </w:tbl>
@@ -24440,11 +23917,11 @@
     <w:lsdException w:name="Unresolved Mention" w:semiHidden="1" w:unhideWhenUsed="1"/>
     <w:lsdException w:name="Smart Link" w:semiHidden="1" w:unhideWhenUsed="1"/>
   </w:latentStyles>
-  <w:style w:type="paragraph" w:default="1" w:styleId="a">
+  <w:style w:type="paragraph" w:default="1" w:styleId="Normal">
     <w:name w:val="Normal"/>
     <w:qFormat/>
   </w:style>
-  <w:style w:type="paragraph" w:styleId="1">
+  <w:style w:type="paragraph" w:styleId="Heading1">
     <w:name w:val="heading 1"/>
     <w:uiPriority w:val="9"/>
     <w:qFormat/>
@@ -24459,7 +23936,7 @@
       <w:szCs w:val="40"/>
     </w:rPr>
   </w:style>
-  <w:style w:type="paragraph" w:styleId="2">
+  <w:style w:type="paragraph" w:styleId="Heading2">
     <w:name w:val="heading 2"/>
     <w:uiPriority w:val="9"/>
     <w:semiHidden/>
@@ -24474,7 +23951,7 @@
       <w:szCs w:val="26"/>
     </w:rPr>
   </w:style>
-  <w:style w:type="paragraph" w:styleId="3">
+  <w:style w:type="paragraph" w:styleId="Heading3">
     <w:name w:val="heading 3"/>
     <w:uiPriority w:val="9"/>
     <w:semiHidden/>
@@ -24489,7 +23966,7 @@
       <w:szCs w:val="24"/>
     </w:rPr>
   </w:style>
-  <w:style w:type="paragraph" w:styleId="4">
+  <w:style w:type="paragraph" w:styleId="Heading4">
     <w:name w:val="heading 4"/>
     <w:uiPriority w:val="9"/>
     <w:semiHidden/>
@@ -24504,7 +23981,7 @@
       <w:color w:val="2E74B5"/>
     </w:rPr>
   </w:style>
-  <w:style w:type="paragraph" w:styleId="5">
+  <w:style w:type="paragraph" w:styleId="Heading5">
     <w:name w:val="heading 5"/>
     <w:uiPriority w:val="9"/>
     <w:semiHidden/>
@@ -24517,7 +23994,7 @@
       <w:color w:val="2E74B5"/>
     </w:rPr>
   </w:style>
-  <w:style w:type="paragraph" w:styleId="6">
+  <w:style w:type="paragraph" w:styleId="Heading6">
     <w:name w:val="heading 6"/>
     <w:uiPriority w:val="9"/>
     <w:semiHidden/>
@@ -24530,13 +24007,13 @@
       <w:color w:val="1F4D78"/>
     </w:rPr>
   </w:style>
-  <w:style w:type="character" w:default="1" w:styleId="a0">
+  <w:style w:type="character" w:default="1" w:styleId="DefaultParagraphFont">
     <w:name w:val="Default Paragraph Font"/>
     <w:uiPriority w:val="1"/>
     <w:semiHidden/>
     <w:unhideWhenUsed/>
   </w:style>
-  <w:style w:type="table" w:default="1" w:styleId="a1">
+  <w:style w:type="table" w:default="1" w:styleId="TableNormal">
     <w:name w:val="Normal Table"/>
     <w:uiPriority w:val="99"/>
     <w:semiHidden/>
@@ -24551,13 +24028,13 @@
       </w:tblCellMar>
     </w:tblPr>
   </w:style>
-  <w:style w:type="numbering" w:default="1" w:styleId="a2">
+  <w:style w:type="numbering" w:default="1" w:styleId="NoList">
     <w:name w:val="No List"/>
     <w:uiPriority w:val="99"/>
     <w:semiHidden/>
     <w:unhideWhenUsed/>
   </w:style>
-  <w:style w:type="paragraph" w:styleId="a3">
+  <w:style w:type="paragraph" w:styleId="Title">
     <w:name w:val="Title"/>
     <w:uiPriority w:val="10"/>
     <w:qFormat/>
@@ -24574,11 +24051,11 @@
       <w:bCs/>
     </w:rPr>
   </w:style>
-  <w:style w:type="paragraph" w:styleId="a4">
+  <w:style w:type="paragraph" w:styleId="ListParagraph">
     <w:name w:val="List Paragraph"/>
     <w:qFormat/>
   </w:style>
-  <w:style w:type="character" w:styleId="a5">
+  <w:style w:type="character" w:styleId="Hyperlink">
     <w:name w:val="Hyperlink"/>
     <w:uiPriority w:val="99"/>
     <w:unhideWhenUsed/>
@@ -24587,7 +24064,7 @@
       <w:u w:val="single"/>
     </w:rPr>
   </w:style>
-  <w:style w:type="character" w:styleId="a6">
+  <w:style w:type="character" w:styleId="FootnoteReference">
     <w:name w:val="footnote reference"/>
     <w:uiPriority w:val="99"/>
     <w:semiHidden/>
@@ -24596,9 +24073,9 @@
       <w:vertAlign w:val="superscript"/>
     </w:rPr>
   </w:style>
-  <w:style w:type="paragraph" w:styleId="a7">
+  <w:style w:type="paragraph" w:styleId="FootnoteText">
     <w:name w:val="footnote text"/>
-    <w:link w:val="a8"/>
+    <w:link w:val="FootnoteTextChar"/>
     <w:uiPriority w:val="99"/>
     <w:semiHidden/>
     <w:unhideWhenUsed/>
@@ -24607,9 +24084,9 @@
       <w:szCs w:val="20"/>
     </w:rPr>
   </w:style>
-  <w:style w:type="character" w:customStyle="1" w:styleId="a8">
-    <w:name w:val="ข้อความเชิงอรรถ อักขระ"/>
-    <w:link w:val="a7"/>
+  <w:style w:type="character" w:customStyle="1" w:styleId="FootnoteTextChar">
+    <w:name w:val="Footnote Text Char"/>
+    <w:link w:val="FootnoteText"/>
     <w:uiPriority w:val="99"/>
     <w:semiHidden/>
     <w:unhideWhenUsed/>
@@ -24618,7 +24095,7 @@
       <w:szCs w:val="20"/>
     </w:rPr>
   </w:style>
-  <w:style w:type="character" w:styleId="a9">
+  <w:style w:type="character" w:styleId="EndnoteReference">
     <w:name w:val="endnote reference"/>
     <w:uiPriority w:val="99"/>
     <w:semiHidden/>
@@ -24627,9 +24104,9 @@
       <w:vertAlign w:val="superscript"/>
     </w:rPr>
   </w:style>
-  <w:style w:type="paragraph" w:styleId="aa">
+  <w:style w:type="paragraph" w:styleId="EndnoteText">
     <w:name w:val="endnote text"/>
-    <w:link w:val="ab"/>
+    <w:link w:val="EndnoteTextChar"/>
     <w:uiPriority w:val="99"/>
     <w:semiHidden/>
     <w:unhideWhenUsed/>
@@ -24638,9 +24115,9 @@
       <w:szCs w:val="20"/>
     </w:rPr>
   </w:style>
-  <w:style w:type="character" w:customStyle="1" w:styleId="ab">
-    <w:name w:val="ข้อความอ้างอิงท้ายเรื่อง อักขระ"/>
-    <w:link w:val="aa"/>
+  <w:style w:type="character" w:customStyle="1" w:styleId="EndnoteTextChar">
+    <w:name w:val="Endnote Text Char"/>
+    <w:link w:val="EndnoteText"/>
     <w:uiPriority w:val="99"/>
     <w:semiHidden/>
     <w:unhideWhenUsed/>

</xml_diff>

<commit_message>
final: add Codex row to 6.2 and own commits
</commit_message>
<xml_diff>
--- a/final-exam/final-exam-group-answer.docx
+++ b/final-exam/final-exam-group-answer.docx
@@ -22031,7 +22031,14 @@
               <w:right w:w="90" w:type="dxa"/>
             </w:tcMar>
           </w:tcPr>
-          <w:p/>
+          <w:p>
+            <w:r>
+              <w:rPr>
+                <w:sz w:val="28"/>
+              </w:rPr>
+              <w:t>Codex</w:t>
+            </w:r>
+          </w:p>
         </w:tc>
         <w:tc>
           <w:tcPr>
@@ -22050,7 +22057,14 @@
               <w:right w:w="90" w:type="dxa"/>
             </w:tcMar>
           </w:tcPr>
-          <w:p/>
+          <w:p>
+            <w:r>
+              <w:rPr>
+                <w:sz w:val="28"/>
+              </w:rPr>
+              <w:t>ช่วยร่างและตรวจทาน G4 ข้อ 4.1–4.6 (แผนภาพ Context / Container และคำอธิบายการออกแบบ)</w:t>
+            </w:r>
+          </w:p>
         </w:tc>
         <w:tc>
           <w:tcPr>
@@ -22069,7 +22083,14 @@
               <w:right w:w="90" w:type="dxa"/>
             </w:tcMar>
           </w:tcPr>
-          <w:p/>
+          <w:p>
+            <w:r>
+              <w:rPr>
+                <w:sz w:val="28"/>
+              </w:rPr>
+              <w:t>บูรพาตรวจเทียบกับ SRS v2.1 และขอบเขต / Design Spine ใน G3 · รายละเอียดใน ai-use-log.md แถว 4</w:t>
+            </w:r>
+          </w:p>
         </w:tc>
       </w:tr>
     </w:tbl>

</xml_diff>